<commit_message>
Add frontend and backend subagents and delegation skill, also.gitignore file
</commit_message>
<xml_diff>
--- a/AI-Assisted-Development-Project.docx
+++ b/AI-Assisted-Development-Project.docx
@@ -4510,17 +4510,12 @@
       <w:r>
         <w:t xml:space="preserve">Repository: </w:t>
       </w:r>
-      <w:hyperlink r:id="rId7" w:history="1">
-        <w:r>
-          <w:rPr>
-            <w:rStyle w:val="Hyperlink"/>
-          </w:rPr>
-          <w:t>[https://github.com/your-username/promptvault]</w:t>
-        </w:r>
-      </w:hyperlink>
+      <w:r>
+        <w:t>https://github.com/mrrusev/PromptVault</w:t>
+      </w:r>
     </w:p>
     <w:sectPr>
-      <w:footerReference w:type="default" r:id="rId8"/>
+      <w:footerReference w:type="default" r:id="rId7"/>
       <w:pgSz w:w="12240" w:h="15840"/>
       <w:pgMar w:top="1440" w:right="1440" w:bottom="1440" w:left="1440" w:header="708" w:footer="708" w:gutter="0"/>
       <w:cols w:space="720"/>

</xml_diff>

<commit_message>
Add authentication and user management features with JWT support
</commit_message>
<xml_diff>
--- a/AI-Assisted-Development-Project.docx
+++ b/AI-Assisted-Development-Project.docx
@@ -948,6 +948,14 @@
     <w:p>
       <w:pPr>
         <w:pStyle w:val="Heading3"/>
+        <w:rPr>
+          <w:lang w:val="bg-BG"/>
+        </w:rPr>
+      </w:pPr>
+    </w:p>
+    <w:p>
+      <w:pPr>
+        <w:pStyle w:val="Heading3"/>
       </w:pPr>
       <w:r>
         <w:t>System requirements</w:t>
@@ -1017,6 +1025,14 @@
       <w:r>
         <w:t>A user can view a dashboard with aggregate counts (collections, prompts, versions, latest prompt).</w:t>
       </w:r>
+    </w:p>
+    <w:p>
+      <w:pPr>
+        <w:pStyle w:val="Heading3"/>
+        <w:rPr>
+          <w:lang w:val="bg-BG"/>
+        </w:rPr>
+      </w:pPr>
     </w:p>
     <w:p>
       <w:pPr>
@@ -1974,6 +1990,9 @@
     <w:p>
       <w:pPr>
         <w:spacing w:after="120"/>
+        <w:rPr>
+          <w:lang w:val="en-US"/>
+        </w:rPr>
       </w:pPr>
       <w:r>
         <w:t>Authentication was built first because every other module depends on an authenticated owner. I chose a stateless JWT scheme rather than server-side sessions, since WebFlux pairs naturally with stateless security and JWT keeps the API horizontally scalable. The plan was: a User entity with a hashed password, a registration endpoint that persists the user, a login endpoint that verifies credentials and issues a signed JWT, and a WebFlux security filter that validates the token on every protected request and exposes the current principal through GET /auth/me.</w:t>
@@ -1982,6 +2001,9 @@
     <w:p>
       <w:pPr>
         <w:pStyle w:val="Heading3"/>
+        <w:rPr>
+          <w:lang w:val="bg-BG"/>
+        </w:rPr>
       </w:pPr>
       <w:r>
         <w:t>Step-by-step workflow</w:t>
@@ -1997,7 +2019,22 @@
         <w:spacing w:after="60"/>
       </w:pPr>
       <w:r>
-        <w:t>Asked Claude Code to scaffold the auth package: User entity (R2DBC), UserRepository, and the DTOs for register/login.</w:t>
+        <w:t>In a new session I a</w:t>
+      </w:r>
+      <w:r>
+        <w:t xml:space="preserve">sked Claude Code </w:t>
+      </w:r>
+      <w:r>
+        <w:rPr>
+          <w:lang w:val="en-US"/>
+        </w:rPr>
+        <w:t>in a plan mode with model Opus (high level effort for better overall result) to plan the authentication layer of the application.</w:t>
+      </w:r>
+      <w:r>
+        <w:rPr>
+          <w:lang w:val="en-US"/>
+        </w:rPr>
+        <w:t xml:space="preserve"> Prompt is located below.</w:t>
       </w:r>
     </w:p>
     <w:p>
@@ -2010,7 +2047,25 @@
         <w:spacing w:after="60"/>
       </w:pPr>
       <w:r>
-        <w:t>Generated a JwtService for signing and validating tokens, with the secret read from configuration rather than hard-coded.</w:t>
+        <w:t>Architectural decisions was aligned</w:t>
+      </w:r>
+      <w:r>
+        <w:t xml:space="preserve"> during the planning</w:t>
+      </w:r>
+      <w:r>
+        <w:t xml:space="preserve"> session</w:t>
+      </w:r>
+      <w:r>
+        <w:t xml:space="preserve"> – 1) </w:t>
+      </w:r>
+      <w:r>
+        <w:t>Register persists the user AND returns a signed JWT immediately</w:t>
+      </w:r>
+      <w:r>
+        <w:t xml:space="preserve"> 2) Encode userId in the token 3)</w:t>
+      </w:r>
+      <w:r>
+        <w:t xml:space="preserve"> Body of auth response should contain token + minimal user</w:t>
       </w:r>
     </w:p>
     <w:p>
@@ -2023,7 +2078,28 @@
         <w:spacing w:after="60"/>
       </w:pPr>
       <w:r>
-        <w:t>Built the reactive security configuration: a SecurityWebFilterChain with a custom JWT authentication filter, BCrypt password encoding, and public access limited to /auth/register and /auth/login.</w:t>
+        <w:t>In another session, a prompt is given to start the implementation and to consider the task done if build and tests passed. Prompt for that as well is located below.</w:t>
+      </w:r>
+      <w:r>
+        <w:t xml:space="preserve"> Used model for the implementation Sonnet 4.6 with medium effort.</w:t>
+      </w:r>
+      <w:r>
+        <w:t xml:space="preserve"> Also </w:t>
+      </w:r>
+      <w:r>
+        <w:t xml:space="preserve">implementation </w:t>
+      </w:r>
+      <w:r>
+        <w:t xml:space="preserve">work was </w:t>
+      </w:r>
+      <w:r>
+        <w:t>automatically</w:t>
+      </w:r>
+      <w:r>
+        <w:t xml:space="preserve"> </w:t>
+      </w:r>
+      <w:r>
+        <w:t>delegeted to the created backend subagent.</w:t>
       </w:r>
     </w:p>
     <w:p>
@@ -2036,8 +2112,31 @@
         <w:spacing w:after="60"/>
       </w:pPr>
       <w:r>
-        <w:t>Wired the three endpoints in an AuthController returning Mono, and confirmed GET /auth/me resolves the principal from the token.</w:t>
-      </w:r>
+        <w:t>Another prompt in the above session to do small refactoring</w:t>
+      </w:r>
+      <w:r>
+        <w:rPr>
+          <w:lang w:val="bg-BG"/>
+        </w:rPr>
+        <w:t xml:space="preserve"> </w:t>
+      </w:r>
+      <w:r>
+        <w:rPr>
+          <w:lang w:val="en-US"/>
+        </w:rPr>
+        <w:t>as no major bugs were found as testing</w:t>
+      </w:r>
+      <w:r>
+        <w:t>. Prompt attached below.</w:t>
+      </w:r>
+    </w:p>
+    <w:p>
+      <w:pPr>
+        <w:pStyle w:val="Heading3"/>
+        <w:rPr>
+          <w:lang w:val="bg-BG"/>
+        </w:rPr>
+      </w:pPr>
     </w:p>
     <w:p>
       <w:pPr>
@@ -2070,7 +2169,10 @@
         <w:spacing w:after="60"/>
       </w:pPr>
       <w:r>
-        <w:t>Verified that passwords are stored only as BCrypt hashes by inspecting the H2 table contents.</w:t>
+        <w:rPr>
+          <w:lang w:val="en-US"/>
+        </w:rPr>
+        <w:t>Unit tests the service layer</w:t>
       </w:r>
     </w:p>
     <w:p>
@@ -2083,12 +2185,46 @@
         <w:spacing w:after="60"/>
       </w:pPr>
       <w:r>
-        <w:t>Manual verification in Postman: a full register → login → authorized request flow (captured as evidence).</w:t>
+        <w:t>Verified that passwords are stored only as BCrypt hashes by inspecting the H2 table contents.</w:t>
+      </w:r>
+    </w:p>
+    <w:p>
+      <w:pPr>
+        <w:pStyle w:val="ListParagraph"/>
+        <w:numPr>
+          <w:ilvl w:val="0"/>
+          <w:numId w:val="2"/>
+        </w:numPr>
+        <w:spacing w:after="60"/>
+      </w:pPr>
+      <w:r>
+        <w:t xml:space="preserve">Manual verification </w:t>
+      </w:r>
+      <w:r>
+        <w:t>using</w:t>
+      </w:r>
+      <w:r>
+        <w:t xml:space="preserve"> </w:t>
+      </w:r>
+      <w:r>
+        <w:t>Swagger UI</w:t>
+      </w:r>
+      <w:r>
+        <w:t>: a full register → login → authorized request flow (captured as evidence)</w:t>
+      </w:r>
+      <w:r>
+        <w:t xml:space="preserve"> also manually running all the automation integration/unit tests</w:t>
+      </w:r>
+      <w:r>
+        <w:t>.</w:t>
       </w:r>
     </w:p>
     <w:p>
       <w:pPr>
         <w:pStyle w:val="Heading3"/>
+        <w:rPr>
+          <w:lang w:val="bg-BG"/>
+        </w:rPr>
       </w:pPr>
       <w:r>
         <w:t>AI tool choice</w:t>
@@ -2099,12 +2235,47 @@
         <w:spacing w:after="120"/>
       </w:pPr>
       <w:r>
-        <w:t>Tool used: Claude Code. Reactive Spring Security is configuration-heavy and easy to get subtly wrong (the filter ordering and the difference between the servlet and reactive APIs in particular), so I wanted a tool that could read the whole package and keep the configuration internally consistent. Claude Code worked directly against the files and could correct the security chain after I described failing behaviour, which was faster than assembling it from scattered snippets.</w:t>
+        <w:t xml:space="preserve">Claude Code tool, used plan mode </w:t>
+      </w:r>
+      <w:r>
+        <w:t>via</w:t>
+      </w:r>
+      <w:r>
+        <w:t xml:space="preserve"> Opus model with high effort, implementation is done </w:t>
+      </w:r>
+      <w:r>
+        <w:t>via</w:t>
+      </w:r>
+      <w:r>
+        <w:t xml:space="preserve"> Sonnet model with high effort</w:t>
+      </w:r>
+      <w:r>
+        <w:t xml:space="preserve">. </w:t>
+      </w:r>
+    </w:p>
+    <w:p>
+      <w:pPr>
+        <w:spacing w:after="120"/>
+        <w:rPr>
+          <w:lang w:val="bg-BG"/>
+        </w:rPr>
+      </w:pPr>
+      <w:r>
+        <w:t>Also</w:t>
+      </w:r>
+      <w:r>
+        <w:t>,</w:t>
+      </w:r>
+      <w:r>
+        <w:t xml:space="preserve"> I am using Claude Code, because I have subscribiton plan for it.</w:t>
       </w:r>
     </w:p>
     <w:p>
       <w:pPr>
         <w:pStyle w:val="Heading3"/>
+        <w:rPr>
+          <w:lang w:val="bg-BG"/>
+        </w:rPr>
       </w:pPr>
       <w:r>
         <w:t>Key prompts / interactions</w:t>
@@ -2162,7 +2333,16 @@
                 <w:sz w:val="18"/>
                 <w:szCs w:val="18"/>
               </w:rPr>
-              <w:t>Prompt 1 — scaffolding the reactive security chain</w:t>
+              <w:t xml:space="preserve">Prompt 1 — </w:t>
+            </w:r>
+            <w:r>
+              <w:rPr>
+                <w:b/>
+                <w:bCs/>
+                <w:sz w:val="18"/>
+                <w:szCs w:val="18"/>
+              </w:rPr>
+              <w:t>plan</w:t>
             </w:r>
           </w:p>
         </w:tc>
@@ -2195,12 +2375,11 @@
               <w:spacing w:after="40"/>
             </w:pPr>
             <w:r>
-              <w:rPr>
-                <w:rFonts w:ascii="Consolas" w:eastAsia="Consolas" w:hAnsi="Consolas" w:cs="Consolas"/>
-                <w:sz w:val="18"/>
-                <w:szCs w:val="18"/>
-              </w:rPr>
-              <w:t>[Paste your actual prompt here. Example of the kind of prompt you used:]</w:t>
+              <w:t xml:space="preserve">Help me to plan the authentication module of this app, please refer in relation to this to the @AI-Assisted-Development-Project.docx (and in general - Module 1 — Authentication). Generally, my idea is to have User entity (R2DBC), UserRepository, and the DTOs for register/login. I expect JWT service for signing and validating tokens (stateless JWT auth), </w:t>
+            </w:r>
+            <w:r>
+              <w:lastRenderedPageBreak/>
+              <w:t xml:space="preserve">also to have reactive security configuration via SecurityWebFilterChain. Also I expect BCrypt password encoding, and public access limited to /auth/register and /auth/login. Wired the three endpoints in an AuthController returning Mono, and confirmed GET  </w:t>
             </w:r>
           </w:p>
           <w:p>
@@ -2208,51 +2387,7 @@
               <w:spacing w:after="40"/>
             </w:pPr>
             <w:r>
-              <w:rPr>
-                <w:rFonts w:ascii="Consolas" w:eastAsia="Consolas" w:hAnsi="Consolas" w:cs="Consolas"/>
-                <w:sz w:val="18"/>
-                <w:szCs w:val="18"/>
-              </w:rPr>
-              <w:t>"Set up Spring Security for WebFlux with stateless JWT auth. I need a</w:t>
-            </w:r>
-          </w:p>
-          <w:p>
-            <w:pPr>
-              <w:spacing w:after="40"/>
-            </w:pPr>
-            <w:r>
-              <w:rPr>
-                <w:rFonts w:ascii="Consolas" w:eastAsia="Consolas" w:hAnsi="Consolas" w:cs="Consolas"/>
-                <w:sz w:val="18"/>
-                <w:szCs w:val="18"/>
-              </w:rPr>
-              <w:t xml:space="preserve"> SecurityWebFilterChain that permits /auth/register and /auth/login and</w:t>
-            </w:r>
-          </w:p>
-          <w:p>
-            <w:pPr>
-              <w:spacing w:after="40"/>
-            </w:pPr>
-            <w:r>
-              <w:rPr>
-                <w:rFonts w:ascii="Consolas" w:eastAsia="Consolas" w:hAnsi="Consolas" w:cs="Consolas"/>
-                <w:sz w:val="18"/>
-                <w:szCs w:val="18"/>
-              </w:rPr>
-              <w:t xml:space="preserve"> requires a valid Bearer token everywhere else. Use BCrypt. Show me the</w:t>
-            </w:r>
-          </w:p>
-          <w:p>
-            <w:pPr>
-              <w:spacing w:after="40"/>
-            </w:pPr>
-            <w:r>
-              <w:rPr>
-                <w:rFonts w:ascii="Consolas" w:eastAsia="Consolas" w:hAnsi="Consolas" w:cs="Consolas"/>
-                <w:sz w:val="18"/>
-                <w:szCs w:val="18"/>
-              </w:rPr>
-              <w:t xml:space="preserve"> JWT filter and the config class."</w:t>
+              <w:t xml:space="preserve">  /auth/me resolves the principal from the token. If something is unclear, lets align with it.</w:t>
             </w:r>
           </w:p>
         </w:tc>
@@ -2282,6 +2417,21 @@
             </w:tcMar>
           </w:tcPr>
           <w:p>
+            <w:pPr>
+              <w:rPr>
+                <w:color w:val="000000" w:themeColor="text1"/>
+                <w14:shadow w14:blurRad="38100" w14:dist="19050" w14:dir="2700000" w14:sx="100000" w14:sy="100000" w14:kx="0" w14:ky="0" w14:algn="tl">
+                  <w14:schemeClr w14:val="dk1">
+                    <w14:alpha w14:val="60000"/>
+                  </w14:schemeClr>
+                </w14:shadow>
+                <w14:textOutline w14:w="0" w14:cap="flat" w14:cmpd="sng" w14:algn="ctr">
+                  <w14:noFill/>
+                  <w14:prstDash w14:val="solid"/>
+                  <w14:round/>
+                </w14:textOutline>
+              </w:rPr>
+            </w:pPr>
             <w:r>
               <w:rPr>
                 <w:b/>
@@ -2289,7 +2439,17 @@
                 <w:sz w:val="18"/>
                 <w:szCs w:val="18"/>
               </w:rPr>
-              <w:t>Prompt 2 — fixing a 401 on a valid token</w:t>
+              <w:lastRenderedPageBreak/>
+              <w:t xml:space="preserve">Prompt 2 — </w:t>
+            </w:r>
+            <w:r>
+              <w:rPr>
+                <w:b/>
+                <w:bCs/>
+                <w:sz w:val="18"/>
+                <w:szCs w:val="18"/>
+              </w:rPr>
+              <w:t>implement</w:t>
             </w:r>
           </w:p>
         </w:tc>
@@ -2322,12 +2482,141 @@
               <w:spacing w:after="40"/>
             </w:pPr>
             <w:r>
-              <w:rPr>
-                <w:rFonts w:ascii="Consolas" w:eastAsia="Consolas" w:hAnsi="Consolas" w:cs="Consolas"/>
+              <w:t>Start the implementation of the authentication module, use the created plan for that - [Pasted text #1 +133 lines] Make sure the mvn build and all the tests passed before considering the task done, fix any issues appear</w:t>
+            </w:r>
+            <w:r>
+              <w:t>.</w:t>
+            </w:r>
+          </w:p>
+        </w:tc>
+      </w:tr>
+      <w:tr>
+        <w:tblPrEx>
+          <w:tblCellMar>
+            <w:top w:w="0" w:type="dxa"/>
+            <w:bottom w:w="0" w:type="dxa"/>
+          </w:tblCellMar>
+        </w:tblPrEx>
+        <w:tc>
+          <w:tcPr>
+            <w:tcW w:w="9360" w:type="dxa"/>
+            <w:tcBorders>
+              <w:top w:val="single" w:sz="1" w:space="0" w:color="CCCCCC"/>
+              <w:left w:val="single" w:sz="1" w:space="0" w:color="CCCCCC"/>
+              <w:bottom w:val="single" w:sz="1" w:space="0" w:color="CCCCCC"/>
+              <w:right w:val="single" w:sz="1" w:space="0" w:color="CCCCCC"/>
+            </w:tcBorders>
+            <w:tcMar>
+              <w:top w:w="80" w:type="dxa"/>
+              <w:left w:w="120" w:type="dxa"/>
+              <w:bottom w:w="80" w:type="dxa"/>
+              <w:right w:w="120" w:type="dxa"/>
+            </w:tcMar>
+          </w:tcPr>
+          <w:p>
+            <w:pPr>
+              <w:spacing w:after="40"/>
+              <w:rPr>
+                <w:color w:val="000000" w:themeColor="text1"/>
+                <w:lang w:val="bg-BG"/>
+              </w:rPr>
+            </w:pPr>
+            <w:r>
+              <w:rPr>
+                <w:b/>
+                <w:bCs/>
+                <w:color w:val="000000" w:themeColor="text1"/>
                 <w:sz w:val="18"/>
                 <w:szCs w:val="18"/>
               </w:rPr>
-              <w:t>[Paste your actual prompt + the error you saw here.]</w:t>
+              <w:t xml:space="preserve">Prompt </w:t>
+            </w:r>
+            <w:r>
+              <w:rPr>
+                <w:b/>
+                <w:bCs/>
+                <w:color w:val="000000" w:themeColor="text1"/>
+                <w:sz w:val="18"/>
+                <w:szCs w:val="18"/>
+              </w:rPr>
+              <w:t>3</w:t>
+            </w:r>
+            <w:r>
+              <w:rPr>
+                <w:b/>
+                <w:bCs/>
+                <w:color w:val="000000" w:themeColor="text1"/>
+                <w:sz w:val="18"/>
+                <w:szCs w:val="18"/>
+              </w:rPr>
+              <w:t xml:space="preserve"> — </w:t>
+            </w:r>
+            <w:r>
+              <w:rPr>
+                <w:b/>
+                <w:bCs/>
+                <w:color w:val="000000" w:themeColor="text1"/>
+                <w:sz w:val="18"/>
+                <w:szCs w:val="18"/>
+              </w:rPr>
+              <w:t>Folder restructuring</w:t>
+            </w:r>
+          </w:p>
+        </w:tc>
+      </w:tr>
+      <w:tr>
+        <w:tblPrEx>
+          <w:tblCellMar>
+            <w:top w:w="0" w:type="dxa"/>
+            <w:bottom w:w="0" w:type="dxa"/>
+          </w:tblCellMar>
+        </w:tblPrEx>
+        <w:tc>
+          <w:tcPr>
+            <w:tcW w:w="9360" w:type="dxa"/>
+            <w:tcBorders>
+              <w:top w:val="single" w:sz="1" w:space="0" w:color="CCCCCC"/>
+              <w:left w:val="single" w:sz="1" w:space="0" w:color="CCCCCC"/>
+              <w:bottom w:val="single" w:sz="1" w:space="0" w:color="CCCCCC"/>
+              <w:right w:val="single" w:sz="1" w:space="0" w:color="CCCCCC"/>
+            </w:tcBorders>
+            <w:tcMar>
+              <w:top w:w="80" w:type="dxa"/>
+              <w:left w:w="120" w:type="dxa"/>
+              <w:bottom w:w="80" w:type="dxa"/>
+              <w:right w:w="120" w:type="dxa"/>
+            </w:tcMar>
+          </w:tcPr>
+          <w:p>
+            <w:pPr>
+              <w:spacing w:after="40"/>
+            </w:pPr>
+            <w:r>
+              <w:t>M</w:t>
+            </w:r>
+            <w:r>
+              <w:t xml:space="preserve">ove the dtos/entities and </w:t>
+            </w:r>
+            <w:r>
+              <w:t>U</w:t>
+            </w:r>
+            <w:r>
+              <w:t>ser</w:t>
+            </w:r>
+            <w:r>
+              <w:t xml:space="preserve"> </w:t>
+            </w:r>
+            <w:r>
+              <w:t>repository to a separate repository folder, all the repository logic will be there, this also for the other entities for the another modules, also all of the exceptions  should be in a different folder as well - exceptions, these folders will be on the same level - repository/auth/exceptions, also consolidate a</w:t>
+            </w:r>
+            <w:r>
+              <w:t>u</w:t>
+            </w:r>
+            <w:r>
+              <w:t>th and security folder into one auth folder</w:t>
+            </w:r>
+            <w:r>
+              <w:t>.</w:t>
             </w:r>
           </w:p>
         </w:tc>
@@ -2337,6 +2626,9 @@
       <w:pPr>
         <w:pStyle w:val="Heading2"/>
         <w:pageBreakBefore/>
+        <w:rPr>
+          <w:lang w:val="bg-BG"/>
+        </w:rPr>
       </w:pPr>
       <w:bookmarkStart w:id="5" w:name="_Toc232434962"/>
       <w:r>
@@ -4288,9 +4580,60 @@
     <w:p>
       <w:pPr>
         <w:spacing w:after="120"/>
+        <w:rPr>
+          <w:lang w:val="bg-BG"/>
+        </w:rPr>
       </w:pPr>
       <w:r>
         <w:t>The following screenshots demonstrate the functioning system. (At least two are required; six are listed here as suggested evidence.)</w:t>
+      </w:r>
+    </w:p>
+    <w:p>
+      <w:pPr>
+        <w:spacing w:after="120"/>
+        <w:rPr>
+          <w:lang w:val="bg-BG"/>
+        </w:rPr>
+      </w:pPr>
+      <w:r>
+        <w:rPr>
+          <w:lang w:val="bg-BG"/>
+        </w:rPr>
+        <w:drawing>
+          <wp:inline distT="0" distB="0" distL="0" distR="0" wp14:anchorId="39BC933C" wp14:editId="74D160B2">
+            <wp:extent cx="5943600" cy="2399071"/>
+            <wp:effectExtent l="0" t="0" r="0" b="1270"/>
+            <wp:docPr id="154887683" name="Picture 1"/>
+            <wp:cNvGraphicFramePr>
+              <a:graphicFrameLocks xmlns:a="http://schemas.openxmlformats.org/drawingml/2006/main" noChangeAspect="1"/>
+            </wp:cNvGraphicFramePr>
+            <a:graphic xmlns:a="http://schemas.openxmlformats.org/drawingml/2006/main">
+              <a:graphicData uri="http://schemas.openxmlformats.org/drawingml/2006/picture">
+                <pic:pic xmlns:pic="http://schemas.openxmlformats.org/drawingml/2006/picture">
+                  <pic:nvPicPr>
+                    <pic:cNvPr id="154887683" name=""/>
+                    <pic:cNvPicPr/>
+                  </pic:nvPicPr>
+                  <pic:blipFill>
+                    <a:blip r:embed="rId7"/>
+                    <a:stretch>
+                      <a:fillRect/>
+                    </a:stretch>
+                  </pic:blipFill>
+                  <pic:spPr>
+                    <a:xfrm>
+                      <a:off x="0" y="0"/>
+                      <a:ext cx="5949940" cy="2401630"/>
+                    </a:xfrm>
+                    <a:prstGeom prst="rect">
+                      <a:avLst/>
+                    </a:prstGeom>
+                  </pic:spPr>
+                </pic:pic>
+              </a:graphicData>
+            </a:graphic>
+          </wp:inline>
+        </w:drawing>
       </w:r>
     </w:p>
     <w:p>
@@ -4515,7 +4858,7 @@
       </w:r>
     </w:p>
     <w:sectPr>
-      <w:footerReference w:type="default" r:id="rId7"/>
+      <w:footerReference w:type="default" r:id="rId8"/>
       <w:pgSz w:w="12240" w:h="15840"/>
       <w:pgMar w:top="1440" w:right="1440" w:bottom="1440" w:left="1440" w:header="708" w:footer="708" w:gutter="0"/>
       <w:cols w:space="720"/>

</xml_diff>

<commit_message>
Add the implementation for the collection module and refactor folder structure
</commit_message>
<xml_diff>
--- a/AI-Assisted-Development-Project.docx
+++ b/AI-Assisted-Development-Project.docx
@@ -2112,7 +2112,19 @@
         <w:spacing w:after="60"/>
       </w:pPr>
       <w:r>
-        <w:t>Another prompt in the above session to do small refactoring</w:t>
+        <w:t>Another prompt in the above session</w:t>
+      </w:r>
+      <w:r>
+        <w:t xml:space="preserve"> was issued</w:t>
+      </w:r>
+      <w:r>
+        <w:t xml:space="preserve"> to do </w:t>
+      </w:r>
+      <w:r>
+        <w:t xml:space="preserve">a </w:t>
+      </w:r>
+      <w:r>
+        <w:t>small refactoring</w:t>
       </w:r>
       <w:r>
         <w:rPr>
@@ -2124,10 +2136,35 @@
         <w:rPr>
           <w:lang w:val="en-US"/>
         </w:rPr>
-        <w:t>as no major bugs were found as testing</w:t>
+        <w:t xml:space="preserve">as no bugs were found </w:t>
+      </w:r>
+      <w:r>
+        <w:rPr>
+          <w:lang w:val="en-US"/>
+        </w:rPr>
+        <w:t>during manual</w:t>
+      </w:r>
+      <w:r>
+        <w:rPr>
+          <w:lang w:val="en-US"/>
+        </w:rPr>
+        <w:t xml:space="preserve"> testing</w:t>
       </w:r>
       <w:r>
         <w:t>. Prompt attached below.</w:t>
+      </w:r>
+    </w:p>
+    <w:p>
+      <w:pPr>
+        <w:pStyle w:val="ListParagraph"/>
+        <w:numPr>
+          <w:ilvl w:val="0"/>
+          <w:numId w:val="2"/>
+        </w:numPr>
+        <w:spacing w:after="60"/>
+      </w:pPr>
+      <w:r>
+        <w:t>Commit everything</w:t>
       </w:r>
     </w:p>
     <w:p>
@@ -2375,11 +2412,11 @@
               <w:spacing w:after="40"/>
             </w:pPr>
             <w:r>
-              <w:t xml:space="preserve">Help me to plan the authentication module of this app, please refer in relation to this to the @AI-Assisted-Development-Project.docx (and in general - Module 1 — Authentication). Generally, my idea is to have User entity (R2DBC), UserRepository, and the DTOs for register/login. I expect JWT service for signing and validating tokens (stateless JWT auth), </w:t>
+              <w:t xml:space="preserve">Help me to plan the authentication module of this app, please refer in relation to this to the @AI-Assisted-Development-Project.docx (and in general - Module 1 — Authentication). Generally, my idea is to have User entity (R2DBC), UserRepository, and the DTOs for </w:t>
             </w:r>
             <w:r>
               <w:lastRenderedPageBreak/>
-              <w:t xml:space="preserve">also to have reactive security configuration via SecurityWebFilterChain. Also I expect BCrypt password encoding, and public access limited to /auth/register and /auth/login. Wired the three endpoints in an AuthController returning Mono, and confirmed GET  </w:t>
+              <w:t xml:space="preserve">register/login. I expect JWT service for signing and validating tokens (stateless JWT auth), also to have reactive security configuration via SecurityWebFilterChain. Also I expect BCrypt password encoding, and public access limited to /auth/register and /auth/login. Wired the three endpoints in an AuthController returning Mono, and confirmed GET  </w:t>
             </w:r>
           </w:p>
           <w:p>
@@ -2436,6 +2473,7 @@
               <w:rPr>
                 <w:b/>
                 <w:bCs/>
+                <w:color w:val="000000" w:themeColor="text1"/>
                 <w:sz w:val="18"/>
                 <w:szCs w:val="18"/>
               </w:rPr>
@@ -2446,6 +2484,7 @@
               <w:rPr>
                 <w:b/>
                 <w:bCs/>
+                <w:color w:val="000000" w:themeColor="text1"/>
                 <w:sz w:val="18"/>
                 <w:szCs w:val="18"/>
               </w:rPr>
@@ -2559,7 +2598,17 @@
                 <w:sz w:val="18"/>
                 <w:szCs w:val="18"/>
               </w:rPr>
-              <w:t>Folder restructuring</w:t>
+              <w:t xml:space="preserve">Folder </w:t>
+            </w:r>
+            <w:r>
+              <w:rPr>
+                <w:b/>
+                <w:bCs/>
+                <w:color w:val="000000" w:themeColor="text1"/>
+                <w:sz w:val="18"/>
+                <w:szCs w:val="18"/>
+              </w:rPr>
+              <w:t>structure</w:t>
             </w:r>
           </w:p>
         </w:tc>
@@ -2671,7 +2720,13 @@
         <w:spacing w:after="60"/>
       </w:pPr>
       <w:r>
-        <w:t>Generated the Collection entity, the R2DBC repository, and a service that always filters by ownerId taken from the security context.</w:t>
+        <w:t xml:space="preserve">In a new session I asked Claude Code </w:t>
+      </w:r>
+      <w:r>
+        <w:rPr>
+          <w:lang w:val="en-US"/>
+        </w:rPr>
+        <w:t>in a plan mode with model Opus (high level effort for better overall result) to plan the authentication layer of the application. Prompt is located below.</w:t>
       </w:r>
     </w:p>
     <w:p>
@@ -2684,7 +2739,16 @@
         <w:spacing w:after="60"/>
       </w:pPr>
       <w:r>
-        <w:t>Implemented GET /collections (list owner's collections), POST /collections (create), and DELETE /collections/{id} (owner-checked delete).</w:t>
+        <w:rPr>
+          <w:lang w:val="en-US"/>
+        </w:rPr>
+        <w:t xml:space="preserve">Decided to </w:t>
+      </w:r>
+      <w:r>
+        <w:rPr>
+          <w:lang w:val="en-US"/>
+        </w:rPr>
+        <w:t>implement cascade delete in relation to the prompts located in the deleted collection</w:t>
       </w:r>
     </w:p>
     <w:p>
@@ -2697,15 +2761,34 @@
         <w:spacing w:after="60"/>
       </w:pPr>
       <w:r>
-        <w:t>Decided and implemented the delete semantics for prompts belonging to a removed collection (cascade vs. block) and documented the choice.</w:t>
-      </w:r>
-    </w:p>
-    <w:p>
-      <w:pPr>
-        <w:pStyle w:val="Heading3"/>
-      </w:pPr>
-      <w:r>
-        <w:t>Testing strategy</w:t>
+        <w:rPr>
+          <w:lang w:val="en-US"/>
+        </w:rPr>
+        <w:t>Plan was changed</w:t>
+      </w:r>
+      <w:r>
+        <w:rPr>
+          <w:lang w:val="en-US"/>
+        </w:rPr>
+        <w:t xml:space="preserve"> from myside</w:t>
+      </w:r>
+      <w:r>
+        <w:rPr>
+          <w:lang w:val="en-US"/>
+        </w:rPr>
+        <w:t xml:space="preserve"> – 1) To use response entity as return type from the controller advice 2) To change the suggested folder structure 3)</w:t>
+      </w:r>
+      <w:r>
+        <w:rPr>
+          <w:lang w:val="en-US"/>
+        </w:rPr>
+        <w:t xml:space="preserve">To use </w:t>
+      </w:r>
+      <w:r>
+        <w:rPr>
+          <w:lang w:val="en-US"/>
+        </w:rPr>
+        <w:t>parameterized queries</w:t>
       </w:r>
     </w:p>
     <w:p>
@@ -2718,7 +2801,53 @@
         <w:spacing w:after="60"/>
       </w:pPr>
       <w:r>
-        <w:t>StepVerifier unit tests on the service to confirm the reactive streams emit the expected collections and complete.</w:t>
+        <w:t>Implementation was handled in a different session with the model Sonnet 4.6, medium effort level</w:t>
+      </w:r>
+      <w:r>
+        <w:t>. D</w:t>
+      </w:r>
+      <w:r>
+        <w:t>uring the implementation</w:t>
+      </w:r>
+      <w:r>
+        <w:t>,</w:t>
+      </w:r>
+      <w:r>
+        <w:t xml:space="preserve"> the delegate skill was s</w:t>
+      </w:r>
+      <w:r>
+        <w:t>uccessfully loaded</w:t>
+      </w:r>
+      <w:r>
+        <w:t xml:space="preserve"> and </w:t>
+      </w:r>
+      <w:r>
+        <w:t xml:space="preserve">two </w:t>
+      </w:r>
+      <w:r>
+        <w:t>backend expert</w:t>
+      </w:r>
+      <w:r>
+        <w:t>s</w:t>
+      </w:r>
+      <w:r>
+        <w:t xml:space="preserve"> was involved in the implementaion</w:t>
+      </w:r>
+      <w:r>
+        <w:t xml:space="preserve">: </w:t>
+      </w:r>
+      <w:r>
+        <w:t>the first restructures packages and writes all tests (red phase), the second implements the production code</w:t>
+      </w:r>
+    </w:p>
+    <w:p>
+      <w:pPr>
+        <w:pStyle w:val="ListParagraph"/>
+        <w:spacing w:after="60"/>
+        <w:ind w:left="720"/>
+      </w:pPr>
+      <w:r>
+        <w:t xml:space="preserve">to make them pass (green phase). </w:t>
       </w:r>
     </w:p>
     <w:p>
@@ -2731,7 +2860,25 @@
         <w:spacing w:after="60"/>
       </w:pPr>
       <w:r>
-        <w:t>WebTestClient tests that create a collection as user A and confirm user B receives 404/empty, proving ownership isolation.</w:t>
+        <w:t>Commit after verifying manually that all the functionality works as expected</w:t>
+      </w:r>
+    </w:p>
+    <w:p>
+      <w:pPr>
+        <w:pStyle w:val="ListParagraph"/>
+        <w:spacing w:after="60"/>
+        <w:ind w:left="720"/>
+      </w:pPr>
+      <w:r>
+        <w:t xml:space="preserve">                                                     </w:t>
+      </w:r>
+    </w:p>
+    <w:p>
+      <w:pPr>
+        <w:pStyle w:val="Heading3"/>
+      </w:pPr>
+      <w:r>
+        <w:t>Testing strategy</w:t>
       </w:r>
     </w:p>
     <w:p>
@@ -2744,7 +2891,59 @@
         <w:spacing w:after="60"/>
       </w:pPr>
       <w:r>
-        <w:t>Verified delete behaviour against the prompts table to confirm the chosen cascade/block rule holds.</w:t>
+        <w:t>Used Test Driven Development methodology</w:t>
+      </w:r>
+    </w:p>
+    <w:p>
+      <w:pPr>
+        <w:pStyle w:val="ListParagraph"/>
+        <w:numPr>
+          <w:ilvl w:val="0"/>
+          <w:numId w:val="2"/>
+        </w:numPr>
+        <w:spacing w:after="60"/>
+      </w:pPr>
+      <w:r>
+        <w:t>StepVerifier unit tests on the service to confirm the reactive streams emit the expected collections and complete.</w:t>
+      </w:r>
+    </w:p>
+    <w:p>
+      <w:pPr>
+        <w:pStyle w:val="ListParagraph"/>
+        <w:numPr>
+          <w:ilvl w:val="0"/>
+          <w:numId w:val="2"/>
+        </w:numPr>
+        <w:spacing w:after="60"/>
+      </w:pPr>
+      <w:r>
+        <w:t>WebTestClient tests that create a collection as user A and confirm user B receives 404/empty, proving ownership isolation.</w:t>
+      </w:r>
+    </w:p>
+    <w:p>
+      <w:pPr>
+        <w:pStyle w:val="ListParagraph"/>
+        <w:numPr>
+          <w:ilvl w:val="0"/>
+          <w:numId w:val="2"/>
+        </w:numPr>
+        <w:spacing w:after="60"/>
+      </w:pPr>
+      <w:r>
+        <w:t>Manual testing using SwaggerAPI – this includes creating collections, deleting a collection and also getting the collections of a specified user</w:t>
+      </w:r>
+    </w:p>
+    <w:p>
+      <w:pPr>
+        <w:pStyle w:val="ListParagraph"/>
+        <w:numPr>
+          <w:ilvl w:val="0"/>
+          <w:numId w:val="2"/>
+        </w:numPr>
+        <w:spacing w:after="60"/>
+      </w:pPr>
+      <w:r>
+        <w:t>Building the whole application manually (this includes running the all test suite)</w:t>
       </w:r>
     </w:p>
     <w:p>
@@ -2760,7 +2959,13 @@
         <w:spacing w:after="120"/>
       </w:pPr>
       <w:r>
-        <w:t>Tool used: Claude Code. This module is mostly repetitive CRUD, so the value of the tool was speed and consistency with the patterns already established in the auth module. Because Claude Code had the existing code in context, the generated repository and service matched the conventions from Module 1 without my having to restate them.</w:t>
+        <w:t xml:space="preserve">Claude Code tool, used plan mode via Opus model with high effort, implementation is done via Sonnet model with </w:t>
+      </w:r>
+      <w:r>
+        <w:t>medium</w:t>
+      </w:r>
+      <w:r>
+        <w:t xml:space="preserve"> effort. </w:t>
       </w:r>
     </w:p>
     <w:p>
@@ -2823,7 +3028,16 @@
                 <w:sz w:val="18"/>
                 <w:szCs w:val="18"/>
               </w:rPr>
-              <w:t>Prompt 1 — owner-scoped CRUD</w:t>
+              <w:t xml:space="preserve">Prompt 1 — </w:t>
+            </w:r>
+            <w:r>
+              <w:rPr>
+                <w:b/>
+                <w:bCs/>
+                <w:sz w:val="18"/>
+                <w:szCs w:val="18"/>
+              </w:rPr>
+              <w:t>Plan</w:t>
             </w:r>
           </w:p>
         </w:tc>
@@ -2854,14 +3068,47 @@
           <w:p>
             <w:pPr>
               <w:spacing w:after="40"/>
+              <w:rPr>
+                <w:sz w:val="20"/>
+                <w:szCs w:val="20"/>
+              </w:rPr>
             </w:pPr>
             <w:r>
               <w:rPr>
-                <w:rFonts w:ascii="Consolas" w:eastAsia="Consolas" w:hAnsi="Consolas" w:cs="Consolas"/>
-                <w:sz w:val="18"/>
-                <w:szCs w:val="18"/>
-              </w:rPr>
-              <w:t>[Paste your actual prompt here. Example:]</w:t>
+                <w:sz w:val="20"/>
+                <w:szCs w:val="20"/>
+              </w:rPr>
+              <w:t>Help me to plan the collection module, please refer to @AI-Assisted-Development-Project.docx for details.</w:t>
+            </w:r>
+            <w:r>
+              <w:rPr>
+                <w:sz w:val="20"/>
+                <w:szCs w:val="20"/>
+              </w:rPr>
+              <w:t xml:space="preserve"> </w:t>
+            </w:r>
+            <w:r>
+              <w:rPr>
+                <w:sz w:val="20"/>
+                <w:szCs w:val="20"/>
+              </w:rPr>
+              <w:t xml:space="preserve">Implementation should have collection entity, collection repostiory r2dbc and service which         </w:t>
+            </w:r>
+          </w:p>
+          <w:p>
+            <w:pPr>
+              <w:spacing w:after="40"/>
+              <w:rPr>
+                <w:sz w:val="20"/>
+                <w:szCs w:val="20"/>
+              </w:rPr>
+            </w:pPr>
+            <w:r>
+              <w:rPr>
+                <w:sz w:val="20"/>
+                <w:szCs w:val="20"/>
+              </w:rPr>
+              <w:t xml:space="preserve"> filters by ownerId. I intent to have 3 endpoints - GET /collections (list owner's collections), POST /collections (create), and DELETE /collections/{id} (owner-checked delete). It should have ownership    </w:t>
             </w:r>
           </w:p>
           <w:p>
@@ -2870,38 +3117,209 @@
             </w:pPr>
             <w:r>
               <w:rPr>
-                <w:rFonts w:ascii="Consolas" w:eastAsia="Consolas" w:hAnsi="Consolas" w:cs="Consolas"/>
+                <w:sz w:val="20"/>
+                <w:szCs w:val="20"/>
+              </w:rPr>
+              <w:t>isolation - one user can never see or delete another user's collection, also  if something is not clear ask question for me to clarify the overall concept.</w:t>
+            </w:r>
+          </w:p>
+        </w:tc>
+      </w:tr>
+    </w:tbl>
+    <w:p>
+      <w:pPr>
+        <w:pStyle w:val="Heading3"/>
+      </w:pPr>
+    </w:p>
+    <w:p>
+      <w:pPr>
+        <w:pStyle w:val="Heading3"/>
+      </w:pPr>
+    </w:p>
+    <w:p>
+      <w:pPr>
+        <w:pStyle w:val="Heading3"/>
+      </w:pPr>
+    </w:p>
+    <w:tbl>
+      <w:tblPr>
+        <w:tblW w:w="9483" w:type="dxa"/>
+        <w:tblBorders>
+          <w:top w:val="single" w:sz="4" w:space="0" w:color="auto"/>
+          <w:left w:val="single" w:sz="4" w:space="0" w:color="auto"/>
+          <w:bottom w:val="single" w:sz="4" w:space="0" w:color="auto"/>
+          <w:right w:val="single" w:sz="4" w:space="0" w:color="auto"/>
+          <w:insideH w:val="single" w:sz="4" w:space="0" w:color="auto"/>
+          <w:insideV w:val="single" w:sz="4" w:space="0" w:color="auto"/>
+        </w:tblBorders>
+        <w:tblCellMar>
+          <w:left w:w="10" w:type="dxa"/>
+          <w:right w:w="10" w:type="dxa"/>
+        </w:tblCellMar>
+        <w:tblLook w:val="04A0" w:firstRow="1" w:lastRow="0" w:firstColumn="1" w:lastColumn="0" w:noHBand="0" w:noVBand="1"/>
+      </w:tblPr>
+      <w:tblGrid>
+        <w:gridCol w:w="9483"/>
+      </w:tblGrid>
+      <w:tr>
+        <w:tblPrEx>
+          <w:tblCellMar>
+            <w:top w:w="0" w:type="dxa"/>
+            <w:bottom w:w="0" w:type="dxa"/>
+          </w:tblCellMar>
+        </w:tblPrEx>
+        <w:trPr>
+          <w:trHeight w:val="230"/>
+        </w:trPr>
+        <w:tc>
+          <w:tcPr>
+            <w:tcW w:w="9483" w:type="dxa"/>
+            <w:tcBorders>
+              <w:top w:val="single" w:sz="1" w:space="0" w:color="CCCCCC"/>
+              <w:left w:val="single" w:sz="1" w:space="0" w:color="CCCCCC"/>
+              <w:bottom w:val="single" w:sz="1" w:space="0" w:color="CCCCCC"/>
+              <w:right w:val="single" w:sz="1" w:space="0" w:color="CCCCCC"/>
+            </w:tcBorders>
+            <w:shd w:val="clear" w:color="auto" w:fill="D7E0F2"/>
+            <w:tcMar>
+              <w:top w:w="80" w:type="dxa"/>
+              <w:left w:w="120" w:type="dxa"/>
+              <w:bottom w:w="80" w:type="dxa"/>
+              <w:right w:w="120" w:type="dxa"/>
+            </w:tcMar>
+          </w:tcPr>
+          <w:p>
+            <w:r>
+              <w:rPr>
+                <w:b/>
+                <w:bCs/>
                 <w:sz w:val="18"/>
                 <w:szCs w:val="18"/>
               </w:rPr>
-              <w:t>"Create the Collection feature: R2DBC entity (id, name, ownerId),</w:t>
+              <w:t xml:space="preserve">Prompt </w:t>
+            </w:r>
+            <w:r>
+              <w:rPr>
+                <w:b/>
+                <w:bCs/>
+                <w:sz w:val="18"/>
+                <w:szCs w:val="18"/>
+              </w:rPr>
+              <w:t>2</w:t>
+            </w:r>
+            <w:r>
+              <w:rPr>
+                <w:b/>
+                <w:bCs/>
+                <w:sz w:val="18"/>
+                <w:szCs w:val="18"/>
+              </w:rPr>
+              <w:t xml:space="preserve"> — </w:t>
+            </w:r>
+            <w:r>
+              <w:rPr>
+                <w:b/>
+                <w:bCs/>
+                <w:sz w:val="18"/>
+                <w:szCs w:val="18"/>
+              </w:rPr>
+              <w:t>Implement</w:t>
+            </w:r>
+          </w:p>
+        </w:tc>
+      </w:tr>
+      <w:tr>
+        <w:tblPrEx>
+          <w:tblCellMar>
+            <w:top w:w="0" w:type="dxa"/>
+            <w:bottom w:w="0" w:type="dxa"/>
+          </w:tblCellMar>
+        </w:tblPrEx>
+        <w:trPr>
+          <w:trHeight w:val="1067"/>
+        </w:trPr>
+        <w:tc>
+          <w:tcPr>
+            <w:tcW w:w="9483" w:type="dxa"/>
+            <w:tcBorders>
+              <w:top w:val="single" w:sz="1" w:space="0" w:color="CCCCCC"/>
+              <w:left w:val="single" w:sz="1" w:space="0" w:color="CCCCCC"/>
+              <w:bottom w:val="single" w:sz="1" w:space="0" w:color="CCCCCC"/>
+              <w:right w:val="single" w:sz="1" w:space="0" w:color="CCCCCC"/>
+            </w:tcBorders>
+            <w:tcMar>
+              <w:top w:w="80" w:type="dxa"/>
+              <w:left w:w="120" w:type="dxa"/>
+              <w:bottom w:w="80" w:type="dxa"/>
+              <w:right w:w="120" w:type="dxa"/>
+            </w:tcMar>
+          </w:tcPr>
+          <w:p>
+            <w:pPr>
+              <w:spacing w:after="40"/>
+              <w:jc w:val="both"/>
+              <w:rPr>
+                <w:rFonts w:eastAsia="Consolas"/>
+                <w:sz w:val="20"/>
+                <w:szCs w:val="20"/>
+              </w:rPr>
+            </w:pPr>
+            <w:r>
+              <w:rPr>
+                <w:rFonts w:eastAsia="Consolas"/>
+                <w:sz w:val="20"/>
+                <w:szCs w:val="20"/>
+              </w:rPr>
+              <w:t xml:space="preserve">Start the implementation of the collections module, use for that the following plan [Pasted text #1 +290 lines], this time implement the tests first using strict Test-Driven Development (TDD) approach.    </w:t>
             </w:r>
           </w:p>
           <w:p>
             <w:pPr>
               <w:spacing w:after="40"/>
+              <w:jc w:val="both"/>
+              <w:rPr>
+                <w:rFonts w:eastAsia="Consolas"/>
+                <w:sz w:val="20"/>
+                <w:szCs w:val="20"/>
+              </w:rPr>
             </w:pPr>
             <w:r>
               <w:rPr>
-                <w:rFonts w:ascii="Consolas" w:eastAsia="Consolas" w:hAnsi="Consolas" w:cs="Consolas"/>
-                <w:sz w:val="18"/>
-                <w:szCs w:val="18"/>
-              </w:rPr>
-              <w:t xml:space="preserve"> repository, service and a reactive controller. Every operation must be</w:t>
+                <w:rFonts w:eastAsia="Consolas"/>
+                <w:sz w:val="20"/>
+                <w:szCs w:val="20"/>
+              </w:rPr>
+              <w:t xml:space="preserve">Include unit and integration tests. For the controller tests use test slices (spring boot). </w:t>
             </w:r>
           </w:p>
           <w:p>
             <w:pPr>
               <w:spacing w:after="40"/>
+              <w:jc w:val="both"/>
+              <w:rPr>
+                <w:rFonts w:eastAsia="Consolas"/>
+                <w:sz w:val="20"/>
+                <w:szCs w:val="20"/>
+              </w:rPr>
             </w:pPr>
             <w:r>
+              <w:rPr>
+                <w:rFonts w:eastAsia="Consolas"/>
+                <w:sz w:val="20"/>
+                <w:szCs w:val="20"/>
+              </w:rPr>
+              <w:t>Keep the implementation simple, consize and maintainable. Also document properly the public APIs and use a proper logging.</w:t>
+            </w:r>
+          </w:p>
+          <w:p>
+            <w:pPr>
+              <w:spacing w:after="40"/>
               <w:rPr>
                 <w:rFonts w:ascii="Consolas" w:eastAsia="Consolas" w:hAnsi="Consolas" w:cs="Consolas"/>
                 <w:sz w:val="18"/>
                 <w:szCs w:val="18"/>
               </w:rPr>
-              <w:t xml:space="preserve"> scoped to the current authenticated user from the security context."</w:t>
-            </w:r>
+            </w:pPr>
           </w:p>
         </w:tc>
       </w:tr>
@@ -4592,7 +5010,7 @@
       <w:pPr>
         <w:spacing w:after="120"/>
         <w:rPr>
-          <w:lang w:val="bg-BG"/>
+          <w:lang w:val="en-US"/>
         </w:rPr>
       </w:pPr>
       <w:r>
@@ -4639,6 +5057,62 @@
     <w:p>
       <w:pPr>
         <w:spacing w:after="120"/>
+        <w:rPr>
+          <w:lang w:val="en-US"/>
+        </w:rPr>
+      </w:pPr>
+    </w:p>
+    <w:p>
+      <w:pPr>
+        <w:spacing w:after="120"/>
+        <w:rPr>
+          <w:lang w:val="en-US"/>
+        </w:rPr>
+      </w:pPr>
+      <w:r>
+        <w:rPr>
+          <w:lang w:val="en-US"/>
+        </w:rPr>
+        <w:drawing>
+          <wp:inline distT="0" distB="0" distL="0" distR="0" wp14:anchorId="2DD0E66B" wp14:editId="4CAD0EE9">
+            <wp:extent cx="5943600" cy="2654710"/>
+            <wp:effectExtent l="0" t="0" r="0" b="0"/>
+            <wp:docPr id="1680369246" name="Picture 1"/>
+            <wp:cNvGraphicFramePr>
+              <a:graphicFrameLocks xmlns:a="http://schemas.openxmlformats.org/drawingml/2006/main" noChangeAspect="1"/>
+            </wp:cNvGraphicFramePr>
+            <a:graphic xmlns:a="http://schemas.openxmlformats.org/drawingml/2006/main">
+              <a:graphicData uri="http://schemas.openxmlformats.org/drawingml/2006/picture">
+                <pic:pic xmlns:pic="http://schemas.openxmlformats.org/drawingml/2006/picture">
+                  <pic:nvPicPr>
+                    <pic:cNvPr id="1680369246" name=""/>
+                    <pic:cNvPicPr/>
+                  </pic:nvPicPr>
+                  <pic:blipFill>
+                    <a:blip r:embed="rId8"/>
+                    <a:stretch>
+                      <a:fillRect/>
+                    </a:stretch>
+                  </pic:blipFill>
+                  <pic:spPr>
+                    <a:xfrm>
+                      <a:off x="0" y="0"/>
+                      <a:ext cx="5948195" cy="2656762"/>
+                    </a:xfrm>
+                    <a:prstGeom prst="rect">
+                      <a:avLst/>
+                    </a:prstGeom>
+                  </pic:spPr>
+                </pic:pic>
+              </a:graphicData>
+            </a:graphic>
+          </wp:inline>
+        </w:drawing>
+      </w:r>
+    </w:p>
+    <w:p>
+      <w:pPr>
+        <w:spacing w:after="120"/>
       </w:pPr>
       <w:r>
         <w:rPr>
@@ -4726,6 +5200,7 @@
           <w:iCs/>
           <w:color w:val="999999"/>
         </w:rPr>
+        <w:lastRenderedPageBreak/>
         <w:t>[ Paste screenshot here ]</w:t>
       </w:r>
     </w:p>
@@ -4858,7 +5333,7 @@
       </w:r>
     </w:p>
     <w:sectPr>
-      <w:footerReference w:type="default" r:id="rId8"/>
+      <w:footerReference w:type="default" r:id="rId9"/>
       <w:pgSz w:w="12240" w:h="15840"/>
       <w:pgMar w:top="1440" w:right="1440" w:bottom="1440" w:left="1440" w:header="708" w:footer="708" w:gutter="0"/>
       <w:cols w:space="720"/>

</xml_diff>

<commit_message>
Add prompt management features with CRUD operations and error handling (module 3)
</commit_message>
<xml_diff>
--- a/AI-Assisted-Development-Project.docx
+++ b/AI-Assisted-Development-Project.docx
@@ -2849,6 +2849,15 @@
       <w:r>
         <w:t xml:space="preserve">to make them pass (green phase). </w:t>
       </w:r>
+      <w:r>
+        <w:t>Straitforward implementation</w:t>
+      </w:r>
+      <w:r>
+        <w:t>,</w:t>
+      </w:r>
+      <w:r>
+        <w:t xml:space="preserve"> everything seems fine, not needed intervantion from myside.</w:t>
+      </w:r>
     </w:p>
     <w:p>
       <w:pPr>
@@ -3120,22 +3129,13 @@
                 <w:sz w:val="20"/>
                 <w:szCs w:val="20"/>
               </w:rPr>
+              <w:lastRenderedPageBreak/>
               <w:t>isolation - one user can never see or delete another user's collection, also  if something is not clear ask question for me to clarify the overall concept.</w:t>
             </w:r>
           </w:p>
         </w:tc>
       </w:tr>
     </w:tbl>
-    <w:p>
-      <w:pPr>
-        <w:pStyle w:val="Heading3"/>
-      </w:pPr>
-    </w:p>
-    <w:p>
-      <w:pPr>
-        <w:pStyle w:val="Heading3"/>
-      </w:pPr>
-    </w:p>
     <w:p>
       <w:pPr>
         <w:pStyle w:val="Heading3"/>
@@ -3368,9 +3368,34 @@
           <w:numId w:val="2"/>
         </w:numPr>
         <w:spacing w:after="60"/>
-      </w:pPr>
-      <w:r>
-        <w:t>Generated the Prompt entity, repository, service, and a reactive controller exposing GET/POST/PATCH/DELETE.</w:t>
+        <w:jc w:val="both"/>
+      </w:pPr>
+      <w:r>
+        <w:t xml:space="preserve">After opening a new session I have used </w:t>
+      </w:r>
+      <w:r>
+        <w:t>plan mode for planning the implementation of the module</w:t>
+      </w:r>
+      <w:r>
+        <w:t>. It was decided in this plan mode that we will implemement not only get list of prompts but also fetch of a sinlge prompt, because the frontend will neeed the last functionality.</w:t>
+      </w:r>
+      <w:r>
+        <w:t xml:space="preserve"> Also emitting 404 error code </w:t>
+      </w:r>
+      <w:r>
+        <w:t>(instead of 403)</w:t>
+      </w:r>
+      <w:r>
+        <w:t xml:space="preserve"> w</w:t>
+      </w:r>
+      <w:r>
+        <w:t>hen a user POSTs a prompt into (or PATCHes/reads) a collection/prompt they do NOT own</w:t>
+      </w:r>
+      <w:r>
+        <w:t xml:space="preserve">. </w:t>
+      </w:r>
+      <w:r>
+        <w:t>Prompt is attached below.</w:t>
       </w:r>
     </w:p>
     <w:p>
@@ -3381,9 +3406,25 @@
           <w:numId w:val="2"/>
         </w:numPr>
         <w:spacing w:after="60"/>
-      </w:pPr>
-      <w:r>
-        <w:t>Implemented PATCH semantics so that only provided fields are updated.</w:t>
+        <w:jc w:val="both"/>
+      </w:pPr>
+      <w:r>
+        <w:t>Finished p</w:t>
+      </w:r>
+      <w:r>
+        <w:t>lan looks fine</w:t>
+      </w:r>
+      <w:r>
+        <w:t>,</w:t>
+      </w:r>
+      <w:r>
+        <w:t xml:space="preserve"> proceeding</w:t>
+      </w:r>
+      <w:r>
+        <w:t xml:space="preserve"> with implementation</w:t>
+      </w:r>
+      <w:r>
+        <w:t>.</w:t>
       </w:r>
     </w:p>
     <w:p>
@@ -3394,17 +3435,22 @@
           <w:numId w:val="2"/>
         </w:numPr>
         <w:spacing w:after="60"/>
-      </w:pPr>
-      <w:r>
-        <w:t>Enforced that a prompt can only be created in, and read from, a collection the current user owns.</w:t>
-      </w:r>
-    </w:p>
-    <w:p>
-      <w:pPr>
-        <w:pStyle w:val="Heading3"/>
-      </w:pPr>
-      <w:r>
-        <w:t>Testing strategy</w:t>
+        <w:jc w:val="both"/>
+      </w:pPr>
+      <w:r>
+        <w:t xml:space="preserve">Starting implementation in another session using the weaker </w:t>
+      </w:r>
+      <w:r>
+        <w:t>Cursors’ Composer 2.5</w:t>
+      </w:r>
+      <w:r>
+        <w:t xml:space="preserve">. </w:t>
+      </w:r>
+      <w:r>
+        <w:t>The skill and backend expert agent were not invoked at all, so I used a new prompt in the same session for the diff to be reviewed by the backend expert agent</w:t>
+      </w:r>
+      <w:r>
+        <w:t>. After that, just a small refactoring was proposed and done by the agent.</w:t>
       </w:r>
     </w:p>
     <w:p>
@@ -3415,9 +3461,31 @@
           <w:numId w:val="2"/>
         </w:numPr>
         <w:spacing w:after="60"/>
-      </w:pPr>
-      <w:r>
-        <w:t>WebTestClient tests covering each verb: create returns 201 with a body, PATCH updates a single field, DELETE returns 204 and the prompt is then absent.</w:t>
+        <w:jc w:val="both"/>
+      </w:pPr>
+      <w:r>
+        <w:rPr>
+          <w:lang w:val="en-US"/>
+        </w:rPr>
+        <w:t>The result is again a straightforward implementation done in accordance with the good practices, not complains here as well</w:t>
+      </w:r>
+      <w:r>
+        <w:rPr>
+          <w:lang w:val="en-US"/>
+        </w:rPr>
+        <w:t>, done manual testing via Swagger API and build</w:t>
+      </w:r>
+      <w:r>
+        <w:rPr>
+          <w:lang w:val="en-US"/>
+        </w:rPr>
+        <w:t xml:space="preserve"> of the service</w:t>
+      </w:r>
+      <w:r>
+        <w:rPr>
+          <w:lang w:val="en-US"/>
+        </w:rPr>
+        <w:t>.</w:t>
       </w:r>
     </w:p>
     <w:p>
@@ -3428,9 +3496,27 @@
           <w:numId w:val="2"/>
         </w:numPr>
         <w:spacing w:after="60"/>
-      </w:pPr>
-      <w:r>
-        <w:t>StepVerifier tests on the service layer for the update logic (partial update leaves other fields unchanged).</w:t>
+        <w:jc w:val="both"/>
+      </w:pPr>
+      <w:r>
+        <w:rPr>
+          <w:lang w:val="en-US"/>
+        </w:rPr>
+        <w:t>Commit</w:t>
+      </w:r>
+      <w:r>
+        <w:rPr>
+          <w:lang w:val="en-US"/>
+        </w:rPr>
+        <w:t xml:space="preserve"> the changes</w:t>
+      </w:r>
+    </w:p>
+    <w:p>
+      <w:pPr>
+        <w:pStyle w:val="Heading3"/>
+      </w:pPr>
+      <w:r>
+        <w:t>Testing strategy</w:t>
       </w:r>
     </w:p>
     <w:p>
@@ -3441,9 +3527,74 @@
           <w:numId w:val="2"/>
         </w:numPr>
         <w:spacing w:after="60"/>
-      </w:pPr>
-      <w:r>
-        <w:t>Edge cases: PATCH on a non-existent id returns 404; creating a prompt in another user's collection is rejected.</w:t>
+        <w:jc w:val="both"/>
+      </w:pPr>
+      <w:r>
+        <w:t xml:space="preserve">Unit </w:t>
+      </w:r>
+      <w:r>
+        <w:t xml:space="preserve">tests - </w:t>
+      </w:r>
+      <w:r>
+        <w:t>service-laye</w:t>
+      </w:r>
+      <w:r>
+        <w:t>r-</w:t>
+      </w:r>
+      <w:r>
+        <w:t xml:space="preserve">— create stamps ownerId / rejects unowned collection, PATCH applies only non-null fields, missing-or-unowned id emits PromptNotFoundException, and findAll routes to the right repo method by collectionId.                                                                                                                                                                                                                                                                                                           </w:t>
+      </w:r>
+    </w:p>
+    <w:p>
+      <w:pPr>
+        <w:pStyle w:val="ListParagraph"/>
+        <w:numPr>
+          <w:ilvl w:val="0"/>
+          <w:numId w:val="2"/>
+        </w:numPr>
+        <w:spacing w:after="60"/>
+        <w:jc w:val="both"/>
+      </w:pPr>
+      <w:r>
+        <w:t xml:space="preserve"> Integration tests full HTTP CRUD with real JWT auth, 401 unauthenticated on all verbs, 404/400 error</w:t>
+      </w:r>
+      <w:r>
+        <w:t xml:space="preserve"> </w:t>
+      </w:r>
+      <w:r>
+        <w:t>paths, and ownership isolation (user B gets 404 on user A's prompt for GET/PATCH/DELETE, lists exclude others, POST into another's collection → 404).</w:t>
+      </w:r>
+    </w:p>
+    <w:p>
+      <w:pPr>
+        <w:pStyle w:val="ListParagraph"/>
+        <w:numPr>
+          <w:ilvl w:val="0"/>
+          <w:numId w:val="2"/>
+        </w:numPr>
+        <w:spacing w:after="60"/>
+        <w:jc w:val="both"/>
+      </w:pPr>
+      <w:r>
+        <w:t>Manual (Swagger UI register → login →</w:t>
+      </w:r>
+      <w:r>
+        <w:t xml:space="preserve"> </w:t>
+      </w:r>
+      <w:r>
+        <w:t>create a collection → POST a prompt into it → GET list (with and without `?collectionId`) →GET /{id} → PATCH title only (confirm content unchanged) → DELETE → confirm 404. Tr</w:t>
+      </w:r>
+      <w:r>
+        <w:t>ied</w:t>
+      </w:r>
+      <w:r>
+        <w:t xml:space="preserve"> a second</w:t>
+      </w:r>
+      <w:r>
+        <w:t xml:space="preserve"> </w:t>
+      </w:r>
+      <w:r>
+        <w:t>user to confirm 404 isolation on the first user's prompt.</w:t>
       </w:r>
     </w:p>
     <w:p>
@@ -3459,7 +3610,403 @@
         <w:spacing w:after="120"/>
       </w:pPr>
       <w:r>
-        <w:t>Tool used: Claude Code. Because this module touches the most files (entity, repo, service, controller, and the editor UI) I relied on Claude Code's ability to make a coherent change across the whole feature at once and to keep the React page in sync with the endpoint shapes.</w:t>
+        <w:t xml:space="preserve">Claude Code tool, used plan mode via Opus model with high effort, implementation is done </w:t>
+      </w:r>
+      <w:r>
+        <w:t>this time with Cursors’ Composer 2.5</w:t>
+      </w:r>
+      <w:r>
+        <w:t xml:space="preserve"> just to trying out its </w:t>
+      </w:r>
+      <w:r>
+        <w:t>effectiveness</w:t>
+      </w:r>
+      <w:r>
+        <w:t>.</w:t>
+      </w:r>
+    </w:p>
+    <w:p>
+      <w:pPr>
+        <w:pStyle w:val="Heading3"/>
+      </w:pPr>
+      <w:r>
+        <w:t>Key prompts / interactions</w:t>
+      </w:r>
+    </w:p>
+    <w:tbl>
+      <w:tblPr>
+        <w:tblW w:w="9298" w:type="dxa"/>
+        <w:tblBorders>
+          <w:top w:val="single" w:sz="4" w:space="0" w:color="auto"/>
+          <w:left w:val="single" w:sz="4" w:space="0" w:color="auto"/>
+          <w:bottom w:val="single" w:sz="4" w:space="0" w:color="auto"/>
+          <w:right w:val="single" w:sz="4" w:space="0" w:color="auto"/>
+          <w:insideH w:val="single" w:sz="4" w:space="0" w:color="auto"/>
+          <w:insideV w:val="single" w:sz="4" w:space="0" w:color="auto"/>
+        </w:tblBorders>
+        <w:tblCellMar>
+          <w:left w:w="10" w:type="dxa"/>
+          <w:right w:w="10" w:type="dxa"/>
+        </w:tblCellMar>
+        <w:tblLook w:val="04A0" w:firstRow="1" w:lastRow="0" w:firstColumn="1" w:lastColumn="0" w:noHBand="0" w:noVBand="1"/>
+      </w:tblPr>
+      <w:tblGrid>
+        <w:gridCol w:w="9298"/>
+      </w:tblGrid>
+      <w:tr>
+        <w:tblPrEx>
+          <w:tblCellMar>
+            <w:top w:w="0" w:type="dxa"/>
+            <w:bottom w:w="0" w:type="dxa"/>
+          </w:tblCellMar>
+        </w:tblPrEx>
+        <w:trPr>
+          <w:trHeight w:val="200"/>
+        </w:trPr>
+        <w:tc>
+          <w:tcPr>
+            <w:tcW w:w="9298" w:type="dxa"/>
+            <w:tcBorders>
+              <w:top w:val="single" w:sz="1" w:space="0" w:color="CCCCCC"/>
+              <w:left w:val="single" w:sz="1" w:space="0" w:color="CCCCCC"/>
+              <w:bottom w:val="single" w:sz="1" w:space="0" w:color="CCCCCC"/>
+              <w:right w:val="single" w:sz="1" w:space="0" w:color="CCCCCC"/>
+            </w:tcBorders>
+            <w:shd w:val="clear" w:color="auto" w:fill="D7E0F2"/>
+            <w:tcMar>
+              <w:top w:w="80" w:type="dxa"/>
+              <w:left w:w="120" w:type="dxa"/>
+              <w:bottom w:w="80" w:type="dxa"/>
+              <w:right w:w="120" w:type="dxa"/>
+            </w:tcMar>
+          </w:tcPr>
+          <w:p>
+            <w:r>
+              <w:rPr>
+                <w:b/>
+                <w:bCs/>
+                <w:sz w:val="18"/>
+                <w:szCs w:val="18"/>
+              </w:rPr>
+              <w:t xml:space="preserve">Prompt 1 — </w:t>
+            </w:r>
+            <w:r>
+              <w:rPr>
+                <w:b/>
+                <w:bCs/>
+                <w:sz w:val="18"/>
+                <w:szCs w:val="18"/>
+              </w:rPr>
+              <w:t>Plan</w:t>
+            </w:r>
+            <w:r>
+              <w:rPr>
+                <w:b/>
+                <w:bCs/>
+                <w:sz w:val="18"/>
+                <w:szCs w:val="18"/>
+              </w:rPr>
+              <w:t xml:space="preserve"> </w:t>
+            </w:r>
+          </w:p>
+        </w:tc>
+      </w:tr>
+      <w:tr>
+        <w:tblPrEx>
+          <w:tblCellMar>
+            <w:top w:w="0" w:type="dxa"/>
+            <w:bottom w:w="0" w:type="dxa"/>
+          </w:tblCellMar>
+        </w:tblPrEx>
+        <w:trPr>
+          <w:trHeight w:val="1530"/>
+        </w:trPr>
+        <w:tc>
+          <w:tcPr>
+            <w:tcW w:w="9298" w:type="dxa"/>
+            <w:tcBorders>
+              <w:top w:val="single" w:sz="1" w:space="0" w:color="CCCCCC"/>
+              <w:left w:val="single" w:sz="1" w:space="0" w:color="CCCCCC"/>
+              <w:bottom w:val="single" w:sz="1" w:space="0" w:color="CCCCCC"/>
+              <w:right w:val="single" w:sz="1" w:space="0" w:color="CCCCCC"/>
+            </w:tcBorders>
+            <w:tcMar>
+              <w:top w:w="80" w:type="dxa"/>
+              <w:left w:w="120" w:type="dxa"/>
+              <w:bottom w:w="80" w:type="dxa"/>
+              <w:right w:w="120" w:type="dxa"/>
+            </w:tcMar>
+          </w:tcPr>
+          <w:p>
+            <w:pPr>
+              <w:spacing w:after="40"/>
+              <w:rPr>
+                <w:sz w:val="20"/>
+                <w:szCs w:val="20"/>
+              </w:rPr>
+            </w:pPr>
+            <w:r>
+              <w:rPr>
+                <w:sz w:val="20"/>
+                <w:szCs w:val="20"/>
+              </w:rPr>
+              <w:t xml:space="preserve">Lets plan the implementation of the module 3 - prompt management. For that use as a reference @AI-Assisted-Development-Project.docx (module 3). The prompt entity should support full CRUD operations (this includes PATCH method for updating only title/content). Return 404 if the prompt doesn't exist or isn't owned by the current user. Create repository, service, and a reactive controller exposing  GET/POST/PATCH/DELETE. Enforce that a prompt can only be created in, and read from, </w:t>
+            </w:r>
+            <w:r>
+              <w:rPr>
+                <w:sz w:val="20"/>
+                <w:szCs w:val="20"/>
+              </w:rPr>
+              <w:lastRenderedPageBreak/>
+              <w:t>a collection the current user owns. Align with me everything which is not clear how it needs to be done or if you have a better idea regarding some logic.</w:t>
+            </w:r>
+          </w:p>
+        </w:tc>
+      </w:tr>
+      <w:tr>
+        <w:tblPrEx>
+          <w:tblCellMar>
+            <w:top w:w="0" w:type="dxa"/>
+            <w:bottom w:w="0" w:type="dxa"/>
+          </w:tblCellMar>
+        </w:tblPrEx>
+        <w:trPr>
+          <w:trHeight w:val="200"/>
+        </w:trPr>
+        <w:tc>
+          <w:tcPr>
+            <w:tcW w:w="9298" w:type="dxa"/>
+            <w:tcBorders>
+              <w:top w:val="single" w:sz="1" w:space="0" w:color="CCCCCC"/>
+              <w:left w:val="single" w:sz="1" w:space="0" w:color="CCCCCC"/>
+              <w:bottom w:val="single" w:sz="1" w:space="0" w:color="CCCCCC"/>
+              <w:right w:val="single" w:sz="1" w:space="0" w:color="CCCCCC"/>
+            </w:tcBorders>
+            <w:shd w:val="clear" w:color="auto" w:fill="D7E0F2"/>
+            <w:tcMar>
+              <w:top w:w="80" w:type="dxa"/>
+              <w:left w:w="120" w:type="dxa"/>
+              <w:bottom w:w="80" w:type="dxa"/>
+              <w:right w:w="120" w:type="dxa"/>
+            </w:tcMar>
+          </w:tcPr>
+          <w:p>
+            <w:r>
+              <w:rPr>
+                <w:b/>
+                <w:bCs/>
+                <w:sz w:val="18"/>
+                <w:szCs w:val="18"/>
+              </w:rPr>
+              <w:lastRenderedPageBreak/>
+              <w:t xml:space="preserve">Prompt 2 — </w:t>
+            </w:r>
+            <w:r>
+              <w:rPr>
+                <w:b/>
+                <w:bCs/>
+                <w:sz w:val="18"/>
+                <w:szCs w:val="18"/>
+              </w:rPr>
+              <w:t>Implement</w:t>
+            </w:r>
+          </w:p>
+        </w:tc>
+      </w:tr>
+      <w:tr>
+        <w:tblPrEx>
+          <w:tblCellMar>
+            <w:top w:w="0" w:type="dxa"/>
+            <w:bottom w:w="0" w:type="dxa"/>
+          </w:tblCellMar>
+        </w:tblPrEx>
+        <w:trPr>
+          <w:trHeight w:val="271"/>
+        </w:trPr>
+        <w:tc>
+          <w:tcPr>
+            <w:tcW w:w="9298" w:type="dxa"/>
+            <w:tcBorders>
+              <w:top w:val="single" w:sz="1" w:space="0" w:color="CCCCCC"/>
+              <w:left w:val="single" w:sz="1" w:space="0" w:color="CCCCCC"/>
+              <w:bottom w:val="single" w:sz="1" w:space="0" w:color="CCCCCC"/>
+              <w:right w:val="single" w:sz="1" w:space="0" w:color="CCCCCC"/>
+            </w:tcBorders>
+            <w:tcMar>
+              <w:top w:w="80" w:type="dxa"/>
+              <w:left w:w="120" w:type="dxa"/>
+              <w:bottom w:w="80" w:type="dxa"/>
+              <w:right w:w="120" w:type="dxa"/>
+            </w:tcMar>
+          </w:tcPr>
+          <w:p>
+            <w:pPr>
+              <w:spacing w:after="40"/>
+              <w:rPr>
+                <w:sz w:val="20"/>
+                <w:szCs w:val="20"/>
+              </w:rPr>
+            </w:pPr>
+            <w:r>
+              <w:rPr>
+                <w:sz w:val="20"/>
+                <w:szCs w:val="20"/>
+              </w:rPr>
+              <w:t>Let's implement the following plan [Pasted text #1 +160 lines] for module 3 - Prompt Management. Follow existing project conventions and make sure that the ownership isolation is in place -  user B gets  404 on user A's prompt (GET/{id}, PATCH, DELETE); user A's list excludes user B's prompts; POST into user A's collection by user B → 404. Also, create a database index on the owner_id field. Use  descriptive names for the variables (not like Prompt p = new Prompt()), fix other occurences of this pattern in the code. Delete any unused methods.</w:t>
+            </w:r>
+          </w:p>
+        </w:tc>
+      </w:tr>
+    </w:tbl>
+    <w:p>
+      <w:pPr>
+        <w:pStyle w:val="Heading2"/>
+        <w:pageBreakBefore/>
+      </w:pPr>
+      <w:bookmarkStart w:id="7" w:name="_Toc232434964"/>
+      <w:r>
+        <w:lastRenderedPageBreak/>
+        <w:t>Module 4 — Prompt Version History</w:t>
+      </w:r>
+      <w:bookmarkEnd w:id="7"/>
+    </w:p>
+    <w:p>
+      <w:pPr>
+        <w:pStyle w:val="Heading3"/>
+      </w:pPr>
+      <w:r>
+        <w:t>Approach &amp; reasoning</w:t>
+      </w:r>
+    </w:p>
+    <w:p>
+      <w:pPr>
+        <w:spacing w:after="120"/>
+      </w:pPr>
+      <w:r>
+        <w:t>This is the project's most interesting feature and the best one to discuss at the exam. The goal is to track how a prompt evolves over time. A PromptVersion (id, promptId, content, versionNumber, createdAt) is an immutable snapshot. Saving a version captures the current content and assigns the next sequential versionNumber; restoring a version copies an old snapshot's content back onto the live prompt. The hard part was assigning versionNumber correctly and atomically in a reactive, non-blocking flow without race conditions.</w:t>
+      </w:r>
+    </w:p>
+    <w:p>
+      <w:pPr>
+        <w:pStyle w:val="Heading3"/>
+      </w:pPr>
+      <w:r>
+        <w:t>Step-by-step workflow</w:t>
+      </w:r>
+    </w:p>
+    <w:p>
+      <w:pPr>
+        <w:pStyle w:val="ListParagraph"/>
+        <w:numPr>
+          <w:ilvl w:val="0"/>
+          <w:numId w:val="2"/>
+        </w:numPr>
+        <w:spacing w:after="60"/>
+      </w:pPr>
+      <w:r>
+        <w:t>Generated the PromptVersion entity and repository, including a query for the highest existing versionNumber for a prompt.</w:t>
+      </w:r>
+    </w:p>
+    <w:p>
+      <w:pPr>
+        <w:pStyle w:val="ListParagraph"/>
+        <w:numPr>
+          <w:ilvl w:val="0"/>
+          <w:numId w:val="2"/>
+        </w:numPr>
+        <w:spacing w:after="60"/>
+      </w:pPr>
+      <w:r>
+        <w:t>Implemented POST /prompts/{id}/versions: read the prompt's current content, compute next version number, persist the snapshot.</w:t>
+      </w:r>
+    </w:p>
+    <w:p>
+      <w:pPr>
+        <w:pStyle w:val="ListParagraph"/>
+        <w:numPr>
+          <w:ilvl w:val="0"/>
+          <w:numId w:val="2"/>
+        </w:numPr>
+        <w:spacing w:after="60"/>
+      </w:pPr>
+      <w:r>
+        <w:t>Implemented GET /prompts/{id}/versions returning the ordered history as a Flux.</w:t>
+      </w:r>
+    </w:p>
+    <w:p>
+      <w:pPr>
+        <w:pStyle w:val="ListParagraph"/>
+        <w:numPr>
+          <w:ilvl w:val="0"/>
+          <w:numId w:val="2"/>
+        </w:numPr>
+        <w:spacing w:after="60"/>
+      </w:pPr>
+      <w:r>
+        <w:t>Implemented restore: load a chosen version and write its content back to the live prompt (composed reactively with flatMap).</w:t>
+      </w:r>
+    </w:p>
+    <w:p>
+      <w:pPr>
+        <w:pStyle w:val="Heading3"/>
+      </w:pPr>
+      <w:r>
+        <w:t>Testing strategy</w:t>
+      </w:r>
+    </w:p>
+    <w:p>
+      <w:pPr>
+        <w:pStyle w:val="ListParagraph"/>
+        <w:numPr>
+          <w:ilvl w:val="0"/>
+          <w:numId w:val="2"/>
+        </w:numPr>
+        <w:spacing w:after="60"/>
+      </w:pPr>
+      <w:r>
+        <w:t>StepVerifier tests asserting that consecutive saves produce versionNumber 1, 2, 3 in order.</w:t>
+      </w:r>
+    </w:p>
+    <w:p>
+      <w:pPr>
+        <w:pStyle w:val="ListParagraph"/>
+        <w:numPr>
+          <w:ilvl w:val="0"/>
+          <w:numId w:val="2"/>
+        </w:numPr>
+        <w:spacing w:after="60"/>
+      </w:pPr>
+      <w:r>
+        <w:t>WebTestClient test: create prompt, save two versions, edit the prompt, restore v1, and assert the live content matches v1.</w:t>
+      </w:r>
+    </w:p>
+    <w:p>
+      <w:pPr>
+        <w:pStyle w:val="ListParagraph"/>
+        <w:numPr>
+          <w:ilvl w:val="0"/>
+          <w:numId w:val="2"/>
+        </w:numPr>
+        <w:spacing w:after="60"/>
+      </w:pPr>
+      <w:r>
+        <w:t>Checked ordering of the returned history and that restoring does not itself create gaps in the numbering unless intended.</w:t>
+      </w:r>
+    </w:p>
+    <w:p>
+      <w:pPr>
+        <w:pStyle w:val="Heading3"/>
+      </w:pPr>
+      <w:r>
+        <w:t>AI tool choice</w:t>
+      </w:r>
+    </w:p>
+    <w:p>
+      <w:pPr>
+        <w:spacing w:after="120"/>
+      </w:pPr>
+      <w:r>
+        <w:t>Tool used: Claude Code. The versioning logic is the place where reactive composition is genuinely tricky — chaining 'find latest version → increment → save' without blocking. Claude Code was useful for expressing this as a clean Mono/Flux pipeline and for talking through the concurrency caveat, which directly informs the 'what I'd improve' section.</w:t>
       </w:r>
     </w:p>
     <w:p>
@@ -3522,7 +4069,7 @@
                 <w:sz w:val="18"/>
                 <w:szCs w:val="18"/>
               </w:rPr>
-              <w:t>Prompt 1 — PATCH-based partial update</w:t>
+              <w:t>Prompt 1 — reactive next-version assignment</w:t>
             </w:r>
           </w:p>
         </w:tc>
@@ -3573,7 +4120,7 @@
                 <w:sz w:val="18"/>
                 <w:szCs w:val="18"/>
               </w:rPr>
-              <w:t>"Implement PATCH /prompts/{id} so only the fields present in the request</w:t>
+              <w:t>"Implement 'save version': find the current max versionNumber for a</w:t>
             </w:r>
           </w:p>
           <w:p>
@@ -3586,7 +4133,7 @@
                 <w:sz w:val="18"/>
                 <w:szCs w:val="18"/>
               </w:rPr>
-              <w:t xml:space="preserve"> body are updated; leave the rest unchanged. Return 404 if the prompt</w:t>
+              <w:t xml:space="preserve"> prompt, add one, and persist a PromptVersion snapshot of the current</w:t>
             </w:r>
           </w:p>
           <w:p>
@@ -3599,7 +4146,20 @@
                 <w:sz w:val="18"/>
                 <w:szCs w:val="18"/>
               </w:rPr>
-              <w:t xml:space="preserve"> doesn't exist or isn't owned by the current user."</w:t>
+              <w:t xml:space="preserve"> content. Express it as a non-blocking Mono pipeline and tell me where</w:t>
+            </w:r>
+          </w:p>
+          <w:p>
+            <w:pPr>
+              <w:spacing w:after="40"/>
+            </w:pPr>
+            <w:r>
+              <w:rPr>
+                <w:rFonts w:ascii="Consolas" w:eastAsia="Consolas" w:hAnsi="Consolas" w:cs="Consolas"/>
+                <w:sz w:val="18"/>
+                <w:szCs w:val="18"/>
+              </w:rPr>
+              <w:t xml:space="preserve"> a race condition could occur."</w:t>
             </w:r>
           </w:p>
         </w:tc>
@@ -3636,7 +4196,7 @@
                 <w:sz w:val="18"/>
                 <w:szCs w:val="18"/>
               </w:rPr>
-              <w:t>Prompt 2 — building the editor UI</w:t>
+              <w:t>Prompt 2 — restore logic</w:t>
             </w:r>
           </w:p>
         </w:tc>
@@ -3685,12 +4245,12 @@
         <w:pStyle w:val="Heading2"/>
         <w:pageBreakBefore/>
       </w:pPr>
-      <w:bookmarkStart w:id="7" w:name="_Toc232434964"/>
+      <w:bookmarkStart w:id="8" w:name="_Toc232434965"/>
       <w:r>
         <w:lastRenderedPageBreak/>
-        <w:t>Module 4 — Prompt Version History</w:t>
-      </w:r>
-      <w:bookmarkEnd w:id="7"/>
+        <w:t>Module 5 — Dashboard (simple analytics)</w:t>
+      </w:r>
+      <w:bookmarkEnd w:id="8"/>
     </w:p>
     <w:p>
       <w:pPr>
@@ -3705,7 +4265,7 @@
         <w:spacing w:after="120"/>
       </w:pPr>
       <w:r>
-        <w:t>This is the project's most interesting feature and the best one to discuss at the exam. The goal is to track how a prompt evolves over time. A PromptVersion (id, promptId, content, versionNumber, createdAt) is an immutable snapshot. Saving a version captures the current content and assigns the next sequential versionNumber; restoring a version copies an old snapshot's content back onto the live prompt. The hard part was assigning versionNumber correctly and atomically in a reactive, non-blocking flow without race conditions.</w:t>
+        <w:t>The dashboard exposes a single reactive endpoint, GET /dashboard, that returns aggregate counts for the current user: total collections, total prompts, total versions, and the latest prompt. I deliberately did NOT implement SSE or any real-time streaming — the requirement is just aggregation. The interesting reactive aspect is composing four independent count queries into one response without blocking, which I did with Mono.zip.</w:t>
       </w:r>
     </w:p>
     <w:p>
@@ -3726,7 +4286,7 @@
         <w:spacing w:after="60"/>
       </w:pPr>
       <w:r>
-        <w:t>Generated the PromptVersion entity and repository, including a query for the highest existing versionNumber for a prompt.</w:t>
+        <w:t>Added count queries (scoped by owner) to the existing repositories.</w:t>
       </w:r>
     </w:p>
     <w:p>
@@ -3739,7 +4299,7 @@
         <w:spacing w:after="60"/>
       </w:pPr>
       <w:r>
-        <w:t>Implemented POST /prompts/{id}/versions: read the prompt's current content, compute next version number, persist the snapshot.</w:t>
+        <w:t>Created a DashboardService that runs the four queries concurrently and combines them with Mono.zip into a single DashboardDto.</w:t>
       </w:r>
     </w:p>
     <w:p>
@@ -3752,7 +4312,15 @@
         <w:spacing w:after="60"/>
       </w:pPr>
       <w:r>
-        <w:t>Implemented GET /prompts/{id}/versions returning the ordered history as a Flux.</w:t>
+        <w:t>Exposed GET /dashboard returning that Mono.</w:t>
+      </w:r>
+    </w:p>
+    <w:p>
+      <w:pPr>
+        <w:pStyle w:val="Heading3"/>
+      </w:pPr>
+      <w:r>
+        <w:t>Testing strategy</w:t>
       </w:r>
     </w:p>
     <w:p>
@@ -3765,15 +4333,7 @@
         <w:spacing w:after="60"/>
       </w:pPr>
       <w:r>
-        <w:t>Implemented restore: load a chosen version and write its content back to the live prompt (composed reactively with flatMap).</w:t>
-      </w:r>
-    </w:p>
-    <w:p>
-      <w:pPr>
-        <w:pStyle w:val="Heading3"/>
-      </w:pPr>
-      <w:r>
-        <w:t>Testing strategy</w:t>
+        <w:t>WebTestClient test seeding a known workspace (e.g. 2 collections, 3 prompts, 5 versions) and asserting each count in the response body.</w:t>
       </w:r>
     </w:p>
     <w:p>
@@ -3786,33 +4346,7 @@
         <w:spacing w:after="60"/>
       </w:pPr>
       <w:r>
-        <w:t>StepVerifier tests asserting that consecutive saves produce versionNumber 1, 2, 3 in order.</w:t>
-      </w:r>
-    </w:p>
-    <w:p>
-      <w:pPr>
-        <w:pStyle w:val="ListParagraph"/>
-        <w:numPr>
-          <w:ilvl w:val="0"/>
-          <w:numId w:val="2"/>
-        </w:numPr>
-        <w:spacing w:after="60"/>
-      </w:pPr>
-      <w:r>
-        <w:t>WebTestClient test: create prompt, save two versions, edit the prompt, restore v1, and assert the live content matches v1.</w:t>
-      </w:r>
-    </w:p>
-    <w:p>
-      <w:pPr>
-        <w:pStyle w:val="ListParagraph"/>
-        <w:numPr>
-          <w:ilvl w:val="0"/>
-          <w:numId w:val="2"/>
-        </w:numPr>
-        <w:spacing w:after="60"/>
-      </w:pPr>
-      <w:r>
-        <w:t>Checked ordering of the returned history and that restoring does not itself create gaps in the numbering unless intended.</w:t>
+        <w:t>StepVerifier test confirming the combined Mono emits exactly one aggregated value and completes.</w:t>
       </w:r>
     </w:p>
     <w:p>
@@ -3828,7 +4362,7 @@
         <w:spacing w:after="120"/>
       </w:pPr>
       <w:r>
-        <w:t>Tool used: Claude Code. The versioning logic is the place where reactive composition is genuinely tricky — chaining 'find latest version → increment → save' without blocking. Claude Code was useful for expressing this as a clean Mono/Flux pipeline and for talking through the concurrency caveat, which directly informs the 'what I'd improve' section.</w:t>
+        <w:t>Tool used: Claude Code. The aggregation is small, so the tool's main contribution was suggesting Mono.zip as the idiomatic way to combine the independent queries concurrently rather than awaiting them one after another.</w:t>
       </w:r>
     </w:p>
     <w:p>
@@ -3891,7 +4425,7 @@
                 <w:sz w:val="18"/>
                 <w:szCs w:val="18"/>
               </w:rPr>
-              <w:t>Prompt 1 — reactive next-version assignment</w:t>
+              <w:t>Prompt 1 — concurrent aggregation</w:t>
             </w:r>
           </w:p>
         </w:tc>
@@ -3942,7 +4476,7 @@
                 <w:sz w:val="18"/>
                 <w:szCs w:val="18"/>
               </w:rPr>
-              <w:t>"Implement 'save version': find the current max versionNumber for a</w:t>
+              <w:t>"Create GET /dashboard returning total collections, prompts, versions and</w:t>
             </w:r>
           </w:p>
           <w:p>
@@ -3955,7 +4489,7 @@
                 <w:sz w:val="18"/>
                 <w:szCs w:val="18"/>
               </w:rPr>
-              <w:t xml:space="preserve"> prompt, add one, and persist a PromptVersion snapshot of the current</w:t>
+              <w:t xml:space="preserve"> the latest prompt for the current user. Run the count queries</w:t>
             </w:r>
           </w:p>
           <w:p>
@@ -3968,95 +4502,7 @@
                 <w:sz w:val="18"/>
                 <w:szCs w:val="18"/>
               </w:rPr>
-              <w:t xml:space="preserve"> content. Express it as a non-blocking Mono pipeline and tell me where</w:t>
-            </w:r>
-          </w:p>
-          <w:p>
-            <w:pPr>
-              <w:spacing w:after="40"/>
-            </w:pPr>
-            <w:r>
-              <w:rPr>
-                <w:rFonts w:ascii="Consolas" w:eastAsia="Consolas" w:hAnsi="Consolas" w:cs="Consolas"/>
-                <w:sz w:val="18"/>
-                <w:szCs w:val="18"/>
-              </w:rPr>
-              <w:t xml:space="preserve"> a race condition could occur."</w:t>
-            </w:r>
-          </w:p>
-        </w:tc>
-      </w:tr>
-      <w:tr>
-        <w:tblPrEx>
-          <w:tblCellMar>
-            <w:top w:w="0" w:type="dxa"/>
-            <w:bottom w:w="0" w:type="dxa"/>
-          </w:tblCellMar>
-        </w:tblPrEx>
-        <w:tc>
-          <w:tcPr>
-            <w:tcW w:w="9360" w:type="dxa"/>
-            <w:tcBorders>
-              <w:top w:val="single" w:sz="1" w:space="0" w:color="CCCCCC"/>
-              <w:left w:val="single" w:sz="1" w:space="0" w:color="CCCCCC"/>
-              <w:bottom w:val="single" w:sz="1" w:space="0" w:color="CCCCCC"/>
-              <w:right w:val="single" w:sz="1" w:space="0" w:color="CCCCCC"/>
-            </w:tcBorders>
-            <w:shd w:val="clear" w:color="auto" w:fill="D7E0F2"/>
-            <w:tcMar>
-              <w:top w:w="80" w:type="dxa"/>
-              <w:left w:w="120" w:type="dxa"/>
-              <w:bottom w:w="80" w:type="dxa"/>
-              <w:right w:w="120" w:type="dxa"/>
-            </w:tcMar>
-          </w:tcPr>
-          <w:p>
-            <w:r>
-              <w:rPr>
-                <w:b/>
-                <w:bCs/>
-                <w:sz w:val="18"/>
-                <w:szCs w:val="18"/>
-              </w:rPr>
-              <w:t>Prompt 2 — restore logic</w:t>
-            </w:r>
-          </w:p>
-        </w:tc>
-      </w:tr>
-      <w:tr>
-        <w:tblPrEx>
-          <w:tblCellMar>
-            <w:top w:w="0" w:type="dxa"/>
-            <w:bottom w:w="0" w:type="dxa"/>
-          </w:tblCellMar>
-        </w:tblPrEx>
-        <w:tc>
-          <w:tcPr>
-            <w:tcW w:w="9360" w:type="dxa"/>
-            <w:tcBorders>
-              <w:top w:val="single" w:sz="1" w:space="0" w:color="CCCCCC"/>
-              <w:left w:val="single" w:sz="1" w:space="0" w:color="CCCCCC"/>
-              <w:bottom w:val="single" w:sz="1" w:space="0" w:color="CCCCCC"/>
-              <w:right w:val="single" w:sz="1" w:space="0" w:color="CCCCCC"/>
-            </w:tcBorders>
-            <w:tcMar>
-              <w:top w:w="80" w:type="dxa"/>
-              <w:left w:w="120" w:type="dxa"/>
-              <w:bottom w:w="80" w:type="dxa"/>
-              <w:right w:w="120" w:type="dxa"/>
-            </w:tcMar>
-          </w:tcPr>
-          <w:p>
-            <w:pPr>
-              <w:spacing w:after="40"/>
-            </w:pPr>
-            <w:r>
-              <w:rPr>
-                <w:rFonts w:ascii="Consolas" w:eastAsia="Consolas" w:hAnsi="Consolas" w:cs="Consolas"/>
-                <w:sz w:val="18"/>
-                <w:szCs w:val="18"/>
-              </w:rPr>
-              <w:t>[Paste your actual prompt here.]</w:t>
+              <w:t xml:space="preserve"> concurrently with Mono.zip and return a single DTO. No SSE."</w:t>
             </w:r>
           </w:p>
         </w:tc>
@@ -4067,12 +4513,12 @@
         <w:pStyle w:val="Heading2"/>
         <w:pageBreakBefore/>
       </w:pPr>
-      <w:bookmarkStart w:id="8" w:name="_Toc232434965"/>
+      <w:bookmarkStart w:id="9" w:name="_Toc232434966"/>
       <w:r>
         <w:lastRenderedPageBreak/>
-        <w:t>Module 5 — Dashboard (simple analytics)</w:t>
-      </w:r>
-      <w:bookmarkEnd w:id="8"/>
+        <w:t>Module 6 — Frontend (React + Tailwind)</w:t>
+      </w:r>
+      <w:bookmarkEnd w:id="9"/>
     </w:p>
     <w:p>
       <w:pPr>
@@ -4087,7 +4533,13 @@
         <w:spacing w:after="120"/>
       </w:pPr>
       <w:r>
-        <w:t>The dashboard exposes a single reactive endpoint, GET /dashboard, that returns aggregate counts for the current user: total collections, total prompts, total versions, and the latest prompt. I deliberately did NOT implement SSE or any real-time streaming — the requirement is just aggregation. The interesting reactive aspect is composing four independent count queries into one response without blocking, which I did with Mono.zip.</w:t>
+        <w:t>The frontend was built as a separate phase after all five backend modules were complete and tested, so the UI could be developed against a finished, stable API. It is a single-page React application styled with Tailwind, covering four pages: Login, Dashboard, Collections, and the Prompt Editor (which also hosts the version-history panel). The central design decision was how to carry the JWT on the client: I kept the token in memory only (React state/context) rather than persisting it, which keeps the implementation simple and side-steps the security questions around localStorage. The accepted trade-off is that a page refresh or a new tab logs the user out and returns them to the login screen.</w:t>
+      </w:r>
+      <w:r>
+        <w:t xml:space="preserve"> </w:t>
+      </w:r>
+      <w:r>
+        <w:t>Rather than build a separate public landing page — which would add UI with no backend behind it — the Dashboard doubles as the home screen: after login the user lands directly on their workspace statistics, with the collections sidebar available from every protected page.</w:t>
       </w:r>
     </w:p>
     <w:p>
@@ -4108,7 +4560,90 @@
         <w:spacing w:after="60"/>
       </w:pPr>
       <w:r>
-        <w:t>Added count queries (scoped by owner) to the existing repositories.</w:t>
+        <w:t xml:space="preserve">Set up the React app with Tailwind and the routes: </w:t>
+      </w:r>
+      <w:r>
+        <w:rPr>
+          <w:rStyle w:val="HTMLCode"/>
+          <w:rFonts w:eastAsia="Arial"/>
+        </w:rPr>
+        <w:t>/</w:t>
+      </w:r>
+      <w:r>
+        <w:t xml:space="preserve"> (redirects to </w:t>
+      </w:r>
+      <w:r>
+        <w:rPr>
+          <w:rStyle w:val="HTMLCode"/>
+          <w:rFonts w:eastAsia="Arial"/>
+        </w:rPr>
+        <w:t>/dashboard</w:t>
+      </w:r>
+      <w:r>
+        <w:t xml:space="preserve"> when authenticated, else </w:t>
+      </w:r>
+      <w:r>
+        <w:rPr>
+          <w:rStyle w:val="HTMLCode"/>
+          <w:rFonts w:eastAsia="Arial"/>
+        </w:rPr>
+        <w:t>/login</w:t>
+      </w:r>
+      <w:r>
+        <w:t xml:space="preserve">), </w:t>
+      </w:r>
+      <w:r>
+        <w:rPr>
+          <w:rStyle w:val="HTMLCode"/>
+          <w:rFonts w:eastAsia="Arial"/>
+        </w:rPr>
+        <w:t>/login</w:t>
+      </w:r>
+      <w:r>
+        <w:t xml:space="preserve"> (public), </w:t>
+      </w:r>
+      <w:r>
+        <w:rPr>
+          <w:rStyle w:val="HTMLCode"/>
+          <w:rFonts w:eastAsia="Arial"/>
+        </w:rPr>
+        <w:t>/dashboard</w:t>
+      </w:r>
+      <w:r>
+        <w:t xml:space="preserve"> (the post-login home screen), </w:t>
+      </w:r>
+      <w:r>
+        <w:rPr>
+          <w:rStyle w:val="HTMLCode"/>
+          <w:rFonts w:eastAsia="Arial"/>
+        </w:rPr>
+        <w:t>/collections</w:t>
+      </w:r>
+      <w:r>
+        <w:t xml:space="preserve">, and </w:t>
+      </w:r>
+      <w:r>
+        <w:rPr>
+          <w:rStyle w:val="HTMLCode"/>
+          <w:rFonts w:eastAsia="Arial"/>
+        </w:rPr>
+        <w:t>/prompts/{id}</w:t>
+      </w:r>
+      <w:r>
+        <w:t xml:space="preserve"> — all except </w:t>
+      </w:r>
+      <w:r>
+        <w:rPr>
+          <w:rStyle w:val="HTMLCode"/>
+          <w:rFonts w:eastAsia="Arial"/>
+        </w:rPr>
+        <w:t>/login</w:t>
+      </w:r>
+      <w:r>
+        <w:t xml:space="preserve"> protected.</w:t>
+      </w:r>
+      <w:r>
+        <w:t>Implemented an auth context holding the in-memory token and a guard that redirects to /login when no valid token is present.</w:t>
       </w:r>
     </w:p>
     <w:p>
@@ -4121,7 +4656,7 @@
         <w:spacing w:after="60"/>
       </w:pPr>
       <w:r>
-        <w:t>Created a DashboardService that runs the four queries concurrently and combines them with Mono.zip into a single DashboardDto.</w:t>
+        <w:t>Built a thin API layer that attaches Authorization: Bearer &lt;token&gt; to every request and, on a 401, clears the token and redirects to /login.</w:t>
       </w:r>
     </w:p>
     <w:p>
@@ -4134,15 +4669,7 @@
         <w:spacing w:after="60"/>
       </w:pPr>
       <w:r>
-        <w:t>Exposed GET /dashboard returning that Mono.</w:t>
-      </w:r>
-    </w:p>
-    <w:p>
-      <w:pPr>
-        <w:pStyle w:val="Heading3"/>
-      </w:pPr>
-      <w:r>
-        <w:t>Testing strategy</w:t>
+        <w:t>Built the Login/Register page wired to /auth/login and /auth/register.</w:t>
       </w:r>
     </w:p>
     <w:p>
@@ -4155,7 +4682,7 @@
         <w:spacing w:after="60"/>
       </w:pPr>
       <w:r>
-        <w:t>WebTestClient test seeding a known workspace (e.g. 2 collections, 3 prompts, 5 versions) and asserting each count in the response body.</w:t>
+        <w:t>Built the Collections sidebar (list + 'New Collection') and the Prompt Editor (title, content, save/delete), including the version-history panel with a restore action.</w:t>
       </w:r>
     </w:p>
     <w:p>
@@ -4168,7 +4695,7 @@
         <w:spacing w:after="60"/>
       </w:pPr>
       <w:r>
-        <w:t>StepVerifier test confirming the combined Mono emits exactly one aggregated value and completes.</w:t>
+        <w:t>Built the Dashboard page rendering the four aggregate metric cards from GET /dashboard.</w:t>
       </w:r>
     </w:p>
     <w:p>
@@ -4176,6 +4703,66 @@
         <w:pStyle w:val="Heading3"/>
       </w:pPr>
       <w:r>
+        <w:t>Testing strategy</w:t>
+      </w:r>
+    </w:p>
+    <w:p>
+      <w:pPr>
+        <w:pStyle w:val="ListParagraph"/>
+        <w:numPr>
+          <w:ilvl w:val="0"/>
+          <w:numId w:val="2"/>
+        </w:numPr>
+        <w:spacing w:after="60"/>
+      </w:pPr>
+      <w:r>
+        <w:t>Manual end-to-end verification of each user flow against the running backend: register → login → create collection → create prompt → edit → save version → restore → view dashboard.</w:t>
+      </w:r>
+    </w:p>
+    <w:p>
+      <w:pPr>
+        <w:pStyle w:val="ListParagraph"/>
+        <w:numPr>
+          <w:ilvl w:val="0"/>
+          <w:numId w:val="2"/>
+        </w:numPr>
+        <w:spacing w:after="60"/>
+      </w:pPr>
+      <w:r>
+        <w:t>Verified the 401 handling by letting a request go out without a valid token and confirming the redirect to /login.</w:t>
+      </w:r>
+    </w:p>
+    <w:p>
+      <w:pPr>
+        <w:pStyle w:val="ListParagraph"/>
+        <w:numPr>
+          <w:ilvl w:val="0"/>
+          <w:numId w:val="2"/>
+        </w:numPr>
+        <w:spacing w:after="60"/>
+      </w:pPr>
+      <w:r>
+        <w:t>Confirmed each page renders the data returned by its endpoint and that protected routes are unreachable when logged out.</w:t>
+      </w:r>
+    </w:p>
+    <w:p>
+      <w:pPr>
+        <w:pStyle w:val="ListParagraph"/>
+        <w:numPr>
+          <w:ilvl w:val="0"/>
+          <w:numId w:val="2"/>
+        </w:numPr>
+        <w:spacing w:after="60"/>
+      </w:pPr>
+      <w:r>
+        <w:t>Automated UI testing (e.g. React Testing Library / end-to-end tooling) was intentionally left out of scope for this exam build; validation here is manual.</w:t>
+      </w:r>
+    </w:p>
+    <w:p>
+      <w:pPr>
+        <w:pStyle w:val="Heading3"/>
+      </w:pPr>
+      <w:r>
         <w:t>AI tool choice</w:t>
       </w:r>
     </w:p>
@@ -4184,7 +4771,7 @@
         <w:spacing w:after="120"/>
       </w:pPr>
       <w:r>
-        <w:t>Tool used: Claude Code. The aggregation is small, so the tool's main contribution was suggesting Mono.zip as the idiomatic way to combine the independent queries concurrently rather than awaiting them one after another.</w:t>
+        <w:t>Tool used: Claude Code. Because the backend API was already finished, the frontend work was mostly about wiring pages to known endpoint shapes consistently. Claude Code's whole-project context meant the generated API calls matched the actual request/response formats from the backend modules, and the auth context and route guard stayed consistent across all four pages.</w:t>
       </w:r>
     </w:p>
     <w:p>
@@ -4247,415 +4834,6 @@
                 <w:sz w:val="18"/>
                 <w:szCs w:val="18"/>
               </w:rPr>
-              <w:t>Prompt 1 — concurrent aggregation</w:t>
-            </w:r>
-          </w:p>
-        </w:tc>
-      </w:tr>
-      <w:tr>
-        <w:tblPrEx>
-          <w:tblCellMar>
-            <w:top w:w="0" w:type="dxa"/>
-            <w:bottom w:w="0" w:type="dxa"/>
-          </w:tblCellMar>
-        </w:tblPrEx>
-        <w:tc>
-          <w:tcPr>
-            <w:tcW w:w="9360" w:type="dxa"/>
-            <w:tcBorders>
-              <w:top w:val="single" w:sz="1" w:space="0" w:color="CCCCCC"/>
-              <w:left w:val="single" w:sz="1" w:space="0" w:color="CCCCCC"/>
-              <w:bottom w:val="single" w:sz="1" w:space="0" w:color="CCCCCC"/>
-              <w:right w:val="single" w:sz="1" w:space="0" w:color="CCCCCC"/>
-            </w:tcBorders>
-            <w:tcMar>
-              <w:top w:w="80" w:type="dxa"/>
-              <w:left w:w="120" w:type="dxa"/>
-              <w:bottom w:w="80" w:type="dxa"/>
-              <w:right w:w="120" w:type="dxa"/>
-            </w:tcMar>
-          </w:tcPr>
-          <w:p>
-            <w:pPr>
-              <w:spacing w:after="40"/>
-            </w:pPr>
-            <w:r>
-              <w:rPr>
-                <w:rFonts w:ascii="Consolas" w:eastAsia="Consolas" w:hAnsi="Consolas" w:cs="Consolas"/>
-                <w:sz w:val="18"/>
-                <w:szCs w:val="18"/>
-              </w:rPr>
-              <w:t>[Paste your actual prompt here. Example:]</w:t>
-            </w:r>
-          </w:p>
-          <w:p>
-            <w:pPr>
-              <w:spacing w:after="40"/>
-            </w:pPr>
-            <w:r>
-              <w:rPr>
-                <w:rFonts w:ascii="Consolas" w:eastAsia="Consolas" w:hAnsi="Consolas" w:cs="Consolas"/>
-                <w:sz w:val="18"/>
-                <w:szCs w:val="18"/>
-              </w:rPr>
-              <w:t>"Create GET /dashboard returning total collections, prompts, versions and</w:t>
-            </w:r>
-          </w:p>
-          <w:p>
-            <w:pPr>
-              <w:spacing w:after="40"/>
-            </w:pPr>
-            <w:r>
-              <w:rPr>
-                <w:rFonts w:ascii="Consolas" w:eastAsia="Consolas" w:hAnsi="Consolas" w:cs="Consolas"/>
-                <w:sz w:val="18"/>
-                <w:szCs w:val="18"/>
-              </w:rPr>
-              <w:t xml:space="preserve"> the latest prompt for the current user. Run the count queries</w:t>
-            </w:r>
-          </w:p>
-          <w:p>
-            <w:pPr>
-              <w:spacing w:after="40"/>
-            </w:pPr>
-            <w:r>
-              <w:rPr>
-                <w:rFonts w:ascii="Consolas" w:eastAsia="Consolas" w:hAnsi="Consolas" w:cs="Consolas"/>
-                <w:sz w:val="18"/>
-                <w:szCs w:val="18"/>
-              </w:rPr>
-              <w:t xml:space="preserve"> concurrently with Mono.zip and return a single DTO. No SSE."</w:t>
-            </w:r>
-          </w:p>
-        </w:tc>
-      </w:tr>
-    </w:tbl>
-    <w:p>
-      <w:pPr>
-        <w:pStyle w:val="Heading2"/>
-        <w:pageBreakBefore/>
-      </w:pPr>
-      <w:bookmarkStart w:id="9" w:name="_Toc232434966"/>
-      <w:r>
-        <w:lastRenderedPageBreak/>
-        <w:t>Module 6 — Frontend (React + Tailwind)</w:t>
-      </w:r>
-      <w:bookmarkEnd w:id="9"/>
-    </w:p>
-    <w:p>
-      <w:pPr>
-        <w:pStyle w:val="Heading3"/>
-      </w:pPr>
-      <w:r>
-        <w:t>Approach &amp; reasoning</w:t>
-      </w:r>
-    </w:p>
-    <w:p>
-      <w:pPr>
-        <w:spacing w:after="120"/>
-      </w:pPr>
-      <w:r>
-        <w:t>The frontend was built as a separate phase after all five backend modules were complete and tested, so the UI could be developed against a finished, stable API. It is a single-page React application styled with Tailwind, covering four pages: Login, Dashboard, Collections, and the Prompt Editor (which also hosts the version-history panel). The central design decision was how to carry the JWT on the client: I kept the token in memory only (React state/context) rather than persisting it, which keeps the implementation simple and side-steps the security questions around localStorage. The accepted trade-off is that a page refresh or a new tab logs the user out and returns them to the login screen.</w:t>
-      </w:r>
-      <w:r>
-        <w:t xml:space="preserve"> </w:t>
-      </w:r>
-      <w:r>
-        <w:t>Rather than build a separate public landing page — which would add UI with no backend behind it — the Dashboard doubles as the home screen: after login the user lands directly on their workspace statistics, with the collections sidebar available from every protected page.</w:t>
-      </w:r>
-    </w:p>
-    <w:p>
-      <w:pPr>
-        <w:pStyle w:val="Heading3"/>
-      </w:pPr>
-      <w:r>
-        <w:t>Step-by-step workflow</w:t>
-      </w:r>
-    </w:p>
-    <w:p>
-      <w:pPr>
-        <w:pStyle w:val="ListParagraph"/>
-        <w:numPr>
-          <w:ilvl w:val="0"/>
-          <w:numId w:val="2"/>
-        </w:numPr>
-        <w:spacing w:after="60"/>
-      </w:pPr>
-      <w:r>
-        <w:t xml:space="preserve">Set up the React app with Tailwind and the routes: </w:t>
-      </w:r>
-      <w:r>
-        <w:rPr>
-          <w:rStyle w:val="HTMLCode"/>
-          <w:rFonts w:eastAsia="Arial"/>
-        </w:rPr>
-        <w:t>/</w:t>
-      </w:r>
-      <w:r>
-        <w:t xml:space="preserve"> (redirects to </w:t>
-      </w:r>
-      <w:r>
-        <w:rPr>
-          <w:rStyle w:val="HTMLCode"/>
-          <w:rFonts w:eastAsia="Arial"/>
-        </w:rPr>
-        <w:t>/dashboard</w:t>
-      </w:r>
-      <w:r>
-        <w:t xml:space="preserve"> when authenticated, else </w:t>
-      </w:r>
-      <w:r>
-        <w:rPr>
-          <w:rStyle w:val="HTMLCode"/>
-          <w:rFonts w:eastAsia="Arial"/>
-        </w:rPr>
-        <w:t>/login</w:t>
-      </w:r>
-      <w:r>
-        <w:t xml:space="preserve">), </w:t>
-      </w:r>
-      <w:r>
-        <w:rPr>
-          <w:rStyle w:val="HTMLCode"/>
-          <w:rFonts w:eastAsia="Arial"/>
-        </w:rPr>
-        <w:t>/login</w:t>
-      </w:r>
-      <w:r>
-        <w:t xml:space="preserve"> (public), </w:t>
-      </w:r>
-      <w:r>
-        <w:rPr>
-          <w:rStyle w:val="HTMLCode"/>
-          <w:rFonts w:eastAsia="Arial"/>
-        </w:rPr>
-        <w:t>/dashboard</w:t>
-      </w:r>
-      <w:r>
-        <w:t xml:space="preserve"> (the post-login home screen), </w:t>
-      </w:r>
-      <w:r>
-        <w:rPr>
-          <w:rStyle w:val="HTMLCode"/>
-          <w:rFonts w:eastAsia="Arial"/>
-        </w:rPr>
-        <w:t>/collections</w:t>
-      </w:r>
-      <w:r>
-        <w:t xml:space="preserve">, and </w:t>
-      </w:r>
-      <w:r>
-        <w:rPr>
-          <w:rStyle w:val="HTMLCode"/>
-          <w:rFonts w:eastAsia="Arial"/>
-        </w:rPr>
-        <w:t>/prompts/{id}</w:t>
-      </w:r>
-      <w:r>
-        <w:t xml:space="preserve"> — all except </w:t>
-      </w:r>
-      <w:r>
-        <w:rPr>
-          <w:rStyle w:val="HTMLCode"/>
-          <w:rFonts w:eastAsia="Arial"/>
-        </w:rPr>
-        <w:t>/login</w:t>
-      </w:r>
-      <w:r>
-        <w:t xml:space="preserve"> protected.</w:t>
-      </w:r>
-      <w:r>
-        <w:t>Implemented an auth context holding the in-memory token and a guard that redirects to /login when no valid token is present.</w:t>
-      </w:r>
-    </w:p>
-    <w:p>
-      <w:pPr>
-        <w:pStyle w:val="ListParagraph"/>
-        <w:numPr>
-          <w:ilvl w:val="0"/>
-          <w:numId w:val="2"/>
-        </w:numPr>
-        <w:spacing w:after="60"/>
-      </w:pPr>
-      <w:r>
-        <w:t>Built a thin API layer that attaches Authorization: Bearer &lt;token&gt; to every request and, on a 401, clears the token and redirects to /login.</w:t>
-      </w:r>
-    </w:p>
-    <w:p>
-      <w:pPr>
-        <w:pStyle w:val="ListParagraph"/>
-        <w:numPr>
-          <w:ilvl w:val="0"/>
-          <w:numId w:val="2"/>
-        </w:numPr>
-        <w:spacing w:after="60"/>
-      </w:pPr>
-      <w:r>
-        <w:t>Built the Login/Register page wired to /auth/login and /auth/register.</w:t>
-      </w:r>
-    </w:p>
-    <w:p>
-      <w:pPr>
-        <w:pStyle w:val="ListParagraph"/>
-        <w:numPr>
-          <w:ilvl w:val="0"/>
-          <w:numId w:val="2"/>
-        </w:numPr>
-        <w:spacing w:after="60"/>
-      </w:pPr>
-      <w:r>
-        <w:t>Built the Collections sidebar (list + 'New Collection') and the Prompt Editor (title, content, save/delete), including the version-history panel with a restore action.</w:t>
-      </w:r>
-    </w:p>
-    <w:p>
-      <w:pPr>
-        <w:pStyle w:val="ListParagraph"/>
-        <w:numPr>
-          <w:ilvl w:val="0"/>
-          <w:numId w:val="2"/>
-        </w:numPr>
-        <w:spacing w:after="60"/>
-      </w:pPr>
-      <w:r>
-        <w:t>Built the Dashboard page rendering the four aggregate metric cards from GET /dashboard.</w:t>
-      </w:r>
-    </w:p>
-    <w:p>
-      <w:pPr>
-        <w:pStyle w:val="Heading3"/>
-      </w:pPr>
-      <w:r>
-        <w:t>Testing strategy</w:t>
-      </w:r>
-    </w:p>
-    <w:p>
-      <w:pPr>
-        <w:pStyle w:val="ListParagraph"/>
-        <w:numPr>
-          <w:ilvl w:val="0"/>
-          <w:numId w:val="2"/>
-        </w:numPr>
-        <w:spacing w:after="60"/>
-      </w:pPr>
-      <w:r>
-        <w:t>Manual end-to-end verification of each user flow against the running backend: register → login → create collection → create prompt → edit → save version → restore → view dashboard.</w:t>
-      </w:r>
-    </w:p>
-    <w:p>
-      <w:pPr>
-        <w:pStyle w:val="ListParagraph"/>
-        <w:numPr>
-          <w:ilvl w:val="0"/>
-          <w:numId w:val="2"/>
-        </w:numPr>
-        <w:spacing w:after="60"/>
-      </w:pPr>
-      <w:r>
-        <w:t>Verified the 401 handling by letting a request go out without a valid token and confirming the redirect to /login.</w:t>
-      </w:r>
-    </w:p>
-    <w:p>
-      <w:pPr>
-        <w:pStyle w:val="ListParagraph"/>
-        <w:numPr>
-          <w:ilvl w:val="0"/>
-          <w:numId w:val="2"/>
-        </w:numPr>
-        <w:spacing w:after="60"/>
-      </w:pPr>
-      <w:r>
-        <w:t>Confirmed each page renders the data returned by its endpoint and that protected routes are unreachable when logged out.</w:t>
-      </w:r>
-    </w:p>
-    <w:p>
-      <w:pPr>
-        <w:pStyle w:val="ListParagraph"/>
-        <w:numPr>
-          <w:ilvl w:val="0"/>
-          <w:numId w:val="2"/>
-        </w:numPr>
-        <w:spacing w:after="60"/>
-      </w:pPr>
-      <w:r>
-        <w:t>Automated UI testing (e.g. React Testing Library / end-to-end tooling) was intentionally left out of scope for this exam build; validation here is manual.</w:t>
-      </w:r>
-    </w:p>
-    <w:p>
-      <w:pPr>
-        <w:pStyle w:val="Heading3"/>
-      </w:pPr>
-      <w:r>
-        <w:t>AI tool choice</w:t>
-      </w:r>
-    </w:p>
-    <w:p>
-      <w:pPr>
-        <w:spacing w:after="120"/>
-      </w:pPr>
-      <w:r>
-        <w:t>Tool used: Claude Code. Because the backend API was already finished, the frontend work was mostly about wiring pages to known endpoint shapes consistently. Claude Code's whole-project context meant the generated API calls matched the actual request/response formats from the backend modules, and the auth context and route guard stayed consistent across all four pages.</w:t>
-      </w:r>
-    </w:p>
-    <w:p>
-      <w:pPr>
-        <w:pStyle w:val="Heading3"/>
-      </w:pPr>
-      <w:r>
-        <w:t>Key prompts / interactions</w:t>
-      </w:r>
-    </w:p>
-    <w:tbl>
-      <w:tblPr>
-        <w:tblW w:w="9360" w:type="dxa"/>
-        <w:tblBorders>
-          <w:top w:val="single" w:sz="4" w:space="0" w:color="auto"/>
-          <w:left w:val="single" w:sz="4" w:space="0" w:color="auto"/>
-          <w:bottom w:val="single" w:sz="4" w:space="0" w:color="auto"/>
-          <w:right w:val="single" w:sz="4" w:space="0" w:color="auto"/>
-          <w:insideH w:val="single" w:sz="4" w:space="0" w:color="auto"/>
-          <w:insideV w:val="single" w:sz="4" w:space="0" w:color="auto"/>
-        </w:tblBorders>
-        <w:tblCellMar>
-          <w:left w:w="10" w:type="dxa"/>
-          <w:right w:w="10" w:type="dxa"/>
-        </w:tblCellMar>
-        <w:tblLook w:val="04A0" w:firstRow="1" w:lastRow="0" w:firstColumn="1" w:lastColumn="0" w:noHBand="0" w:noVBand="1"/>
-      </w:tblPr>
-      <w:tblGrid>
-        <w:gridCol w:w="9360"/>
-      </w:tblGrid>
-      <w:tr>
-        <w:tblPrEx>
-          <w:tblCellMar>
-            <w:top w:w="0" w:type="dxa"/>
-            <w:bottom w:w="0" w:type="dxa"/>
-          </w:tblCellMar>
-        </w:tblPrEx>
-        <w:tc>
-          <w:tcPr>
-            <w:tcW w:w="9360" w:type="dxa"/>
-            <w:tcBorders>
-              <w:top w:val="single" w:sz="1" w:space="0" w:color="CCCCCC"/>
-              <w:left w:val="single" w:sz="1" w:space="0" w:color="CCCCCC"/>
-              <w:bottom w:val="single" w:sz="1" w:space="0" w:color="CCCCCC"/>
-              <w:right w:val="single" w:sz="1" w:space="0" w:color="CCCCCC"/>
-            </w:tcBorders>
-            <w:shd w:val="clear" w:color="auto" w:fill="D7E0F2"/>
-            <w:tcMar>
-              <w:top w:w="80" w:type="dxa"/>
-              <w:left w:w="120" w:type="dxa"/>
-              <w:bottom w:w="80" w:type="dxa"/>
-              <w:right w:w="120" w:type="dxa"/>
-            </w:tcMar>
-          </w:tcPr>
-          <w:p>
-            <w:r>
-              <w:rPr>
-                <w:b/>
-                <w:bCs/>
-                <w:sz w:val="18"/>
-                <w:szCs w:val="18"/>
-              </w:rPr>
               <w:t>Prompt 1 — auth context and route guard</w:t>
             </w:r>
           </w:p>
@@ -5113,6 +5291,119 @@
     <w:p>
       <w:pPr>
         <w:spacing w:after="120"/>
+        <w:rPr>
+          <w:lang w:val="en-US"/>
+        </w:rPr>
+      </w:pPr>
+    </w:p>
+    <w:p>
+      <w:pPr>
+        <w:spacing w:after="120"/>
+        <w:rPr>
+          <w:lang w:val="en-US"/>
+        </w:rPr>
+      </w:pPr>
+      <w:r>
+        <w:rPr>
+          <w:lang w:val="en-US"/>
+        </w:rPr>
+        <w:lastRenderedPageBreak/>
+        <w:drawing>
+          <wp:inline distT="0" distB="0" distL="0" distR="0" wp14:anchorId="0079A0A0" wp14:editId="489267EC">
+            <wp:extent cx="5942114" cy="2408903"/>
+            <wp:effectExtent l="0" t="0" r="1905" b="4445"/>
+            <wp:docPr id="860884511" name="Picture 1"/>
+            <wp:cNvGraphicFramePr>
+              <a:graphicFrameLocks xmlns:a="http://schemas.openxmlformats.org/drawingml/2006/main" noChangeAspect="1"/>
+            </wp:cNvGraphicFramePr>
+            <a:graphic xmlns:a="http://schemas.openxmlformats.org/drawingml/2006/main">
+              <a:graphicData uri="http://schemas.openxmlformats.org/drawingml/2006/picture">
+                <pic:pic xmlns:pic="http://schemas.openxmlformats.org/drawingml/2006/picture">
+                  <pic:nvPicPr>
+                    <pic:cNvPr id="860884511" name=""/>
+                    <pic:cNvPicPr/>
+                  </pic:nvPicPr>
+                  <pic:blipFill>
+                    <a:blip r:embed="rId9"/>
+                    <a:stretch>
+                      <a:fillRect/>
+                    </a:stretch>
+                  </pic:blipFill>
+                  <pic:spPr>
+                    <a:xfrm>
+                      <a:off x="0" y="0"/>
+                      <a:ext cx="5965783" cy="2418498"/>
+                    </a:xfrm>
+                    <a:prstGeom prst="rect">
+                      <a:avLst/>
+                    </a:prstGeom>
+                  </pic:spPr>
+                </pic:pic>
+              </a:graphicData>
+            </a:graphic>
+          </wp:inline>
+        </w:drawing>
+      </w:r>
+    </w:p>
+    <w:p>
+      <w:pPr>
+        <w:spacing w:after="120"/>
+        <w:rPr>
+          <w:lang w:val="en-US"/>
+        </w:rPr>
+      </w:pPr>
+    </w:p>
+    <w:p>
+      <w:pPr>
+        <w:spacing w:after="120"/>
+        <w:rPr>
+          <w:lang w:val="en-US"/>
+        </w:rPr>
+      </w:pPr>
+      <w:r>
+        <w:rPr>
+          <w:lang w:val="en-US"/>
+        </w:rPr>
+        <w:drawing>
+          <wp:inline distT="0" distB="0" distL="0" distR="0" wp14:anchorId="77F15614" wp14:editId="1CB210C0">
+            <wp:extent cx="5943600" cy="2821859"/>
+            <wp:effectExtent l="0" t="0" r="0" b="0"/>
+            <wp:docPr id="2145181307" name="Picture 1"/>
+            <wp:cNvGraphicFramePr>
+              <a:graphicFrameLocks xmlns:a="http://schemas.openxmlformats.org/drawingml/2006/main" noChangeAspect="1"/>
+            </wp:cNvGraphicFramePr>
+            <a:graphic xmlns:a="http://schemas.openxmlformats.org/drawingml/2006/main">
+              <a:graphicData uri="http://schemas.openxmlformats.org/drawingml/2006/picture">
+                <pic:pic xmlns:pic="http://schemas.openxmlformats.org/drawingml/2006/picture">
+                  <pic:nvPicPr>
+                    <pic:cNvPr id="2145181307" name=""/>
+                    <pic:cNvPicPr/>
+                  </pic:nvPicPr>
+                  <pic:blipFill>
+                    <a:blip r:embed="rId10"/>
+                    <a:stretch>
+                      <a:fillRect/>
+                    </a:stretch>
+                  </pic:blipFill>
+                  <pic:spPr>
+                    <a:xfrm>
+                      <a:off x="0" y="0"/>
+                      <a:ext cx="5953329" cy="2826478"/>
+                    </a:xfrm>
+                    <a:prstGeom prst="rect">
+                      <a:avLst/>
+                    </a:prstGeom>
+                  </pic:spPr>
+                </pic:pic>
+              </a:graphicData>
+            </a:graphic>
+          </wp:inline>
+        </w:drawing>
+      </w:r>
+    </w:p>
+    <w:p>
+      <w:pPr>
+        <w:spacing w:after="120"/>
       </w:pPr>
       <w:r>
         <w:rPr>
@@ -5200,7 +5491,6 @@
           <w:iCs/>
           <w:color w:val="999999"/>
         </w:rPr>
-        <w:lastRenderedPageBreak/>
         <w:t>[ Paste screenshot here ]</w:t>
       </w:r>
     </w:p>
@@ -5232,6 +5522,7 @@
           <w:iCs/>
           <w:color w:val="999999"/>
         </w:rPr>
+        <w:lastRenderedPageBreak/>
         <w:t>[ Paste screenshot here ]</w:t>
       </w:r>
     </w:p>
@@ -5333,7 +5624,7 @@
       </w:r>
     </w:p>
     <w:sectPr>
-      <w:footerReference w:type="default" r:id="rId9"/>
+      <w:footerReference w:type="default" r:id="rId11"/>
       <w:pgSz w:w="12240" w:h="15840"/>
       <w:pgMar w:top="1440" w:right="1440" w:bottom="1440" w:left="1440" w:header="708" w:footer="708" w:gutter="0"/>
       <w:cols w:space="720"/>

</xml_diff>

<commit_message>
Add prompt versioning feature with CRUD operations and exception handling
</commit_message>
<xml_diff>
--- a/AI-Assisted-Development-Project.docx
+++ b/AI-Assisted-Development-Project.docx
@@ -1209,12 +1209,6 @@
         <w:gridCol w:w="3830"/>
       </w:tblGrid>
       <w:tr>
-        <w:tblPrEx>
-          <w:tblCellMar>
-            <w:top w:w="0" w:type="dxa"/>
-            <w:bottom w:w="0" w:type="dxa"/>
-          </w:tblCellMar>
-        </w:tblPrEx>
         <w:trPr>
           <w:tblHeader/>
         </w:trPr>
@@ -1304,12 +1298,6 @@
         </w:tc>
       </w:tr>
       <w:tr>
-        <w:tblPrEx>
-          <w:tblCellMar>
-            <w:top w:w="0" w:type="dxa"/>
-            <w:bottom w:w="0" w:type="dxa"/>
-          </w:tblCellMar>
-        </w:tblPrEx>
         <w:tc>
           <w:tcPr>
             <w:tcW w:w="1700" w:type="dxa"/>
@@ -1390,12 +1378,6 @@
         </w:tc>
       </w:tr>
       <w:tr>
-        <w:tblPrEx>
-          <w:tblCellMar>
-            <w:top w:w="0" w:type="dxa"/>
-            <w:bottom w:w="0" w:type="dxa"/>
-          </w:tblCellMar>
-        </w:tblPrEx>
         <w:tc>
           <w:tcPr>
             <w:tcW w:w="1700" w:type="dxa"/>
@@ -1476,12 +1458,6 @@
         </w:tc>
       </w:tr>
       <w:tr>
-        <w:tblPrEx>
-          <w:tblCellMar>
-            <w:top w:w="0" w:type="dxa"/>
-            <w:bottom w:w="0" w:type="dxa"/>
-          </w:tblCellMar>
-        </w:tblPrEx>
         <w:tc>
           <w:tcPr>
             <w:tcW w:w="1700" w:type="dxa"/>
@@ -1562,12 +1538,6 @@
         </w:tc>
       </w:tr>
       <w:tr>
-        <w:tblPrEx>
-          <w:tblCellMar>
-            <w:top w:w="0" w:type="dxa"/>
-            <w:bottom w:w="0" w:type="dxa"/>
-          </w:tblCellMar>
-        </w:tblPrEx>
         <w:tc>
           <w:tcPr>
             <w:tcW w:w="1700" w:type="dxa"/>
@@ -1648,12 +1618,6 @@
         </w:tc>
       </w:tr>
       <w:tr>
-        <w:tblPrEx>
-          <w:tblCellMar>
-            <w:top w:w="0" w:type="dxa"/>
-            <w:bottom w:w="0" w:type="dxa"/>
-          </w:tblCellMar>
-        </w:tblPrEx>
         <w:tc>
           <w:tcPr>
             <w:tcW w:w="1700" w:type="dxa"/>
@@ -1734,12 +1698,6 @@
         </w:tc>
       </w:tr>
       <w:tr>
-        <w:tblPrEx>
-          <w:tblCellMar>
-            <w:top w:w="0" w:type="dxa"/>
-            <w:bottom w:w="0" w:type="dxa"/>
-          </w:tblCellMar>
-        </w:tblPrEx>
         <w:tc>
           <w:tcPr>
             <w:tcW w:w="1700" w:type="dxa"/>
@@ -2019,10 +1977,7 @@
         <w:spacing w:after="60"/>
       </w:pPr>
       <w:r>
-        <w:t>In a new session I a</w:t>
-      </w:r>
-      <w:r>
-        <w:t xml:space="preserve">sked Claude Code </w:t>
+        <w:t xml:space="preserve">In a new session I asked Claude Code </w:t>
       </w:r>
       <w:r>
         <w:rPr>
@@ -2093,10 +2048,7 @@
         <w:t xml:space="preserve">work was </w:t>
       </w:r>
       <w:r>
-        <w:t>automatically</w:t>
-      </w:r>
-      <w:r>
-        <w:t xml:space="preserve"> </w:t>
+        <w:t xml:space="preserve">automatically </w:t>
       </w:r>
       <w:r>
         <w:t>delegeted to the created backend subagent.</w:t>
@@ -2339,12 +2291,6 @@
         <w:gridCol w:w="9360"/>
       </w:tblGrid>
       <w:tr>
-        <w:tblPrEx>
-          <w:tblCellMar>
-            <w:top w:w="0" w:type="dxa"/>
-            <w:bottom w:w="0" w:type="dxa"/>
-          </w:tblCellMar>
-        </w:tblPrEx>
         <w:tc>
           <w:tcPr>
             <w:tcW w:w="9360" w:type="dxa"/>
@@ -2385,12 +2331,6 @@
         </w:tc>
       </w:tr>
       <w:tr>
-        <w:tblPrEx>
-          <w:tblCellMar>
-            <w:top w:w="0" w:type="dxa"/>
-            <w:bottom w:w="0" w:type="dxa"/>
-          </w:tblCellMar>
-        </w:tblPrEx>
         <w:tc>
           <w:tcPr>
             <w:tcW w:w="9360" w:type="dxa"/>
@@ -2430,12 +2370,6 @@
         </w:tc>
       </w:tr>
       <w:tr>
-        <w:tblPrEx>
-          <w:tblCellMar>
-            <w:top w:w="0" w:type="dxa"/>
-            <w:bottom w:w="0" w:type="dxa"/>
-          </w:tblCellMar>
-        </w:tblPrEx>
         <w:tc>
           <w:tcPr>
             <w:tcW w:w="9360" w:type="dxa"/>
@@ -2494,12 +2428,6 @@
         </w:tc>
       </w:tr>
       <w:tr>
-        <w:tblPrEx>
-          <w:tblCellMar>
-            <w:top w:w="0" w:type="dxa"/>
-            <w:bottom w:w="0" w:type="dxa"/>
-          </w:tblCellMar>
-        </w:tblPrEx>
         <w:tc>
           <w:tcPr>
             <w:tcW w:w="9360" w:type="dxa"/>
@@ -2521,21 +2449,12 @@
               <w:spacing w:after="40"/>
             </w:pPr>
             <w:r>
-              <w:t>Start the implementation of the authentication module, use the created plan for that - [Pasted text #1 +133 lines] Make sure the mvn build and all the tests passed before considering the task done, fix any issues appear</w:t>
-            </w:r>
-            <w:r>
-              <w:t>.</w:t>
+              <w:t>Start the implementation of the authentication module, use the created plan for that - [Pasted text #1 +133 lines] Make sure the mvn build and all the tests passed before considering the task done, fix any issues appear.</w:t>
             </w:r>
           </w:p>
         </w:tc>
       </w:tr>
       <w:tr>
-        <w:tblPrEx>
-          <w:tblCellMar>
-            <w:top w:w="0" w:type="dxa"/>
-            <w:bottom w:w="0" w:type="dxa"/>
-          </w:tblCellMar>
-        </w:tblPrEx>
         <w:tc>
           <w:tcPr>
             <w:tcW w:w="9360" w:type="dxa"/>
@@ -2568,7 +2487,7 @@
                 <w:sz w:val="18"/>
                 <w:szCs w:val="18"/>
               </w:rPr>
-              <w:t xml:space="preserve">Prompt </w:t>
+              <w:t xml:space="preserve">Prompt 3 — </w:t>
             </w:r>
             <w:r>
               <w:rPr>
@@ -2578,7 +2497,7 @@
                 <w:sz w:val="18"/>
                 <w:szCs w:val="18"/>
               </w:rPr>
-              <w:t>3</w:t>
+              <w:t xml:space="preserve">Folder </w:t>
             </w:r>
             <w:r>
               <w:rPr>
@@ -2588,38 +2507,12 @@
                 <w:sz w:val="18"/>
                 <w:szCs w:val="18"/>
               </w:rPr>
-              <w:t xml:space="preserve"> — </w:t>
-            </w:r>
-            <w:r>
-              <w:rPr>
-                <w:b/>
-                <w:bCs/>
-                <w:color w:val="000000" w:themeColor="text1"/>
-                <w:sz w:val="18"/>
-                <w:szCs w:val="18"/>
-              </w:rPr>
-              <w:t xml:space="preserve">Folder </w:t>
-            </w:r>
-            <w:r>
-              <w:rPr>
-                <w:b/>
-                <w:bCs/>
-                <w:color w:val="000000" w:themeColor="text1"/>
-                <w:sz w:val="18"/>
-                <w:szCs w:val="18"/>
-              </w:rPr>
               <w:t>structure</w:t>
             </w:r>
           </w:p>
         </w:tc>
       </w:tr>
       <w:tr>
-        <w:tblPrEx>
-          <w:tblCellMar>
-            <w:top w:w="0" w:type="dxa"/>
-            <w:bottom w:w="0" w:type="dxa"/>
-          </w:tblCellMar>
-        </w:tblPrEx>
         <w:tc>
           <w:tcPr>
             <w:tcW w:w="9360" w:type="dxa"/>
@@ -2834,10 +2727,7 @@
         <w:t xml:space="preserve"> was involved in the implementaion</w:t>
       </w:r>
       <w:r>
-        <w:t xml:space="preserve">: </w:t>
-      </w:r>
-      <w:r>
-        <w:t>the first restructures packages and writes all tests (red phase), the second implements the production code</w:t>
+        <w:t>: the first restructures packages and writes all tests (red phase), the second implements the production code</w:t>
       </w:r>
     </w:p>
     <w:p>
@@ -3006,12 +2896,6 @@
         <w:gridCol w:w="9360"/>
       </w:tblGrid>
       <w:tr>
-        <w:tblPrEx>
-          <w:tblCellMar>
-            <w:top w:w="0" w:type="dxa"/>
-            <w:bottom w:w="0" w:type="dxa"/>
-          </w:tblCellMar>
-        </w:tblPrEx>
         <w:tc>
           <w:tcPr>
             <w:tcW w:w="9360" w:type="dxa"/>
@@ -3037,27 +2921,12 @@
                 <w:sz w:val="18"/>
                 <w:szCs w:val="18"/>
               </w:rPr>
-              <w:t xml:space="preserve">Prompt 1 — </w:t>
-            </w:r>
-            <w:r>
-              <w:rPr>
-                <w:b/>
-                <w:bCs/>
-                <w:sz w:val="18"/>
-                <w:szCs w:val="18"/>
-              </w:rPr>
-              <w:t>Plan</w:t>
+              <w:t>Prompt 1 — Plan</w:t>
             </w:r>
           </w:p>
         </w:tc>
       </w:tr>
       <w:tr>
-        <w:tblPrEx>
-          <w:tblCellMar>
-            <w:top w:w="0" w:type="dxa"/>
-            <w:bottom w:w="0" w:type="dxa"/>
-          </w:tblCellMar>
-        </w:tblPrEx>
         <w:tc>
           <w:tcPr>
             <w:tcW w:w="9360" w:type="dxa"/>
@@ -3162,12 +3031,6 @@
         <w:gridCol w:w="9483"/>
       </w:tblGrid>
       <w:tr>
-        <w:tblPrEx>
-          <w:tblCellMar>
-            <w:top w:w="0" w:type="dxa"/>
-            <w:bottom w:w="0" w:type="dxa"/>
-          </w:tblCellMar>
-        </w:tblPrEx>
         <w:trPr>
           <w:trHeight w:val="230"/>
         </w:trPr>
@@ -3229,12 +3092,6 @@
         </w:tc>
       </w:tr>
       <w:tr>
-        <w:tblPrEx>
-          <w:tblCellMar>
-            <w:top w:w="0" w:type="dxa"/>
-            <w:bottom w:w="0" w:type="dxa"/>
-          </w:tblCellMar>
-        </w:tblPrEx>
         <w:trPr>
           <w:trHeight w:val="1067"/>
         </w:trPr>
@@ -3438,13 +3295,7 @@
         <w:jc w:val="both"/>
       </w:pPr>
       <w:r>
-        <w:t xml:space="preserve">Starting implementation in another session using the weaker </w:t>
-      </w:r>
-      <w:r>
-        <w:t>Cursors’ Composer 2.5</w:t>
-      </w:r>
-      <w:r>
-        <w:t xml:space="preserve">. </w:t>
+        <w:t xml:space="preserve">Starting implementation in another session using the weaker Cursors’ Composer 2.5. </w:t>
       </w:r>
       <w:r>
         <w:t>The skill and backend expert agent were not invoked at all, so I used a new prompt in the same session for the diff to be reviewed by the backend expert agent</w:t>
@@ -3530,19 +3381,7 @@
         <w:jc w:val="both"/>
       </w:pPr>
       <w:r>
-        <w:t xml:space="preserve">Unit </w:t>
-      </w:r>
-      <w:r>
-        <w:t xml:space="preserve">tests - </w:t>
-      </w:r>
-      <w:r>
-        <w:t>service-laye</w:t>
-      </w:r>
-      <w:r>
-        <w:t>r-</w:t>
-      </w:r>
-      <w:r>
-        <w:t xml:space="preserve">— create stamps ownerId / rejects unowned collection, PATCH applies only non-null fields, missing-or-unowned id emits PromptNotFoundException, and findAll routes to the right repo method by collectionId.                                                                                                                                                                                                                                                                                                           </w:t>
+        <w:t xml:space="preserve">Unit tests - service-layer-— create stamps ownerId / rejects unowned collection, PATCH applies only non-null fields, missing-or-unowned id emits PromptNotFoundException, and findAll routes to the right repo method by collectionId.                                                                                                                                                                                                                                                                                                           </w:t>
       </w:r>
     </w:p>
     <w:p>
@@ -3576,25 +3415,13 @@
         <w:jc w:val="both"/>
       </w:pPr>
       <w:r>
-        <w:t>Manual (Swagger UI register → login →</w:t>
-      </w:r>
-      <w:r>
-        <w:t xml:space="preserve"> </w:t>
-      </w:r>
-      <w:r>
-        <w:t>create a collection → POST a prompt into it → GET list (with and without `?collectionId`) →GET /{id} → PATCH title only (confirm content unchanged) → DELETE → confirm 404. Tr</w:t>
+        <w:t>Manual (Swagger UI register → login → create a collection → POST a prompt into it → GET list (with and without `?collectionId`) →GET /{id} → PATCH title only (confirm content unchanged) → DELETE → confirm 404. Tr</w:t>
       </w:r>
       <w:r>
         <w:t>ied</w:t>
       </w:r>
       <w:r>
-        <w:t xml:space="preserve"> a second</w:t>
-      </w:r>
-      <w:r>
-        <w:t xml:space="preserve"> </w:t>
-      </w:r>
-      <w:r>
-        <w:t>user to confirm 404 isolation on the first user's prompt.</w:t>
+        <w:t xml:space="preserve"> a second user to confirm 404 isolation on the first user's prompt.</w:t>
       </w:r>
     </w:p>
     <w:p>
@@ -3610,10 +3437,7 @@
         <w:spacing w:after="120"/>
       </w:pPr>
       <w:r>
-        <w:t xml:space="preserve">Claude Code tool, used plan mode via Opus model with high effort, implementation is done </w:t>
-      </w:r>
-      <w:r>
-        <w:t>this time with Cursors’ Composer 2.5</w:t>
+        <w:t>Claude Code tool, used plan mode via Opus model with high effort, implementation is done this time with Cursors’ Composer 2.5</w:t>
       </w:r>
       <w:r>
         <w:t xml:space="preserve"> just to trying out its </w:t>
@@ -3654,12 +3478,6 @@
         <w:gridCol w:w="9298"/>
       </w:tblGrid>
       <w:tr>
-        <w:tblPrEx>
-          <w:tblCellMar>
-            <w:top w:w="0" w:type="dxa"/>
-            <w:bottom w:w="0" w:type="dxa"/>
-          </w:tblCellMar>
-        </w:tblPrEx>
         <w:trPr>
           <w:trHeight w:val="200"/>
         </w:trPr>
@@ -3712,12 +3530,6 @@
         </w:tc>
       </w:tr>
       <w:tr>
-        <w:tblPrEx>
-          <w:tblCellMar>
-            <w:top w:w="0" w:type="dxa"/>
-            <w:bottom w:w="0" w:type="dxa"/>
-          </w:tblCellMar>
-        </w:tblPrEx>
         <w:trPr>
           <w:trHeight w:val="1530"/>
         </w:trPr>
@@ -3750,7 +3562,21 @@
                 <w:sz w:val="20"/>
                 <w:szCs w:val="20"/>
               </w:rPr>
-              <w:t xml:space="preserve">Lets plan the implementation of the module 3 - prompt management. For that use as a reference @AI-Assisted-Development-Project.docx (module 3). The prompt entity should support full CRUD operations (this includes PATCH method for updating only title/content). Return 404 if the prompt doesn't exist or isn't owned by the current user. Create repository, service, and a reactive controller exposing  GET/POST/PATCH/DELETE. Enforce that a prompt can only be created in, and read from, </w:t>
+              <w:t>Let</w:t>
+            </w:r>
+            <w:r>
+              <w:rPr>
+                <w:sz w:val="20"/>
+                <w:szCs w:val="20"/>
+              </w:rPr>
+              <w:t>’</w:t>
+            </w:r>
+            <w:r>
+              <w:rPr>
+                <w:sz w:val="20"/>
+                <w:szCs w:val="20"/>
+              </w:rPr>
+              <w:t xml:space="preserve">s plan the implementation of the module 3 - prompt management. For that use as a reference @AI-Assisted-Development-Project.docx (module 3). The prompt entity should support full CRUD operations (this includes PATCH method for updating only title/content). Return 404 if the prompt doesn't exist or isn't owned by the current user. Create repository, service, and a reactive controller exposing  GET/POST/PATCH/DELETE. Enforce that a prompt can only be created in, and read from, </w:t>
             </w:r>
             <w:r>
               <w:rPr>
@@ -3764,12 +3590,6 @@
         </w:tc>
       </w:tr>
       <w:tr>
-        <w:tblPrEx>
-          <w:tblCellMar>
-            <w:top w:w="0" w:type="dxa"/>
-            <w:bottom w:w="0" w:type="dxa"/>
-          </w:tblCellMar>
-        </w:tblPrEx>
         <w:trPr>
           <w:trHeight w:val="200"/>
         </w:trPr>
@@ -3814,12 +3634,6 @@
         </w:tc>
       </w:tr>
       <w:tr>
-        <w:tblPrEx>
-          <w:tblCellMar>
-            <w:top w:w="0" w:type="dxa"/>
-            <w:bottom w:w="0" w:type="dxa"/>
-          </w:tblCellMar>
-        </w:tblPrEx>
         <w:trPr>
           <w:trHeight w:val="271"/>
         </w:trPr>
@@ -3881,9 +3695,28 @@
     <w:p>
       <w:pPr>
         <w:spacing w:after="120"/>
-      </w:pPr>
-      <w:r>
-        <w:t>This is the project's most interesting feature and the best one to discuss at the exam. The goal is to track how a prompt evolves over time. A PromptVersion (id, promptId, content, versionNumber, createdAt) is an immutable snapshot. Saving a version captures the current content and assigns the next sequential versionNumber; restoring a version copies an old snapshot's content back onto the live prompt. The hard part was assigning versionNumber correctly and atomically in a reactive, non-blocking flow without race conditions.</w:t>
+        <w:jc w:val="both"/>
+      </w:pPr>
+      <w:r>
+        <w:t>This is the project's most interesting feature.</w:t>
+      </w:r>
+      <w:r>
+        <w:t xml:space="preserve"> </w:t>
+      </w:r>
+      <w:r>
+        <w:t xml:space="preserve">The goal is to track how a prompt evolves over time. A PromptVersion (id, promptId, content, versionNumber, createdAt) is an immutable snapshot. Saving a version captures the current content and assigns the next sequential versionNumber; restoring a version copies an old snapshot's content back onto the live prompt. </w:t>
+      </w:r>
+      <w:r>
+        <w:t>Interesting</w:t>
+      </w:r>
+      <w:r>
+        <w:t xml:space="preserve"> part </w:t>
+      </w:r>
+      <w:r>
+        <w:t>is</w:t>
+      </w:r>
+      <w:r>
+        <w:t xml:space="preserve"> assigning versionNumber correctly and atomically in a reactive, non-blocking flow without race conditions.</w:t>
       </w:r>
     </w:p>
     <w:p>
@@ -3902,9 +3735,40 @@
           <w:numId w:val="2"/>
         </w:numPr>
         <w:spacing w:after="60"/>
-      </w:pPr>
-      <w:r>
-        <w:t>Generated the PromptVersion entity and repository, including a query for the highest existing versionNumber for a prompt.</w:t>
+        <w:jc w:val="both"/>
+      </w:pPr>
+      <w:r>
+        <w:t>In a new session pormpt was issued to plan the implementation with Opus 4.8, Claude Code</w:t>
+      </w:r>
+      <w:r>
+        <w:t xml:space="preserve">. </w:t>
+      </w:r>
+      <w:r>
+        <w:t xml:space="preserve">Prompt is attached below. </w:t>
+      </w:r>
+      <w:r>
+        <w:t xml:space="preserve">Decided during the plan session </w:t>
+      </w:r>
+      <w:r>
+        <w:t xml:space="preserve">that the sequential version number under concurency will be assign safely </w:t>
+      </w:r>
+      <w:r>
+        <w:rPr>
+          <w:lang w:val="en-US"/>
+        </w:rPr>
+        <w:t>when</w:t>
+      </w:r>
+      <w:r>
+        <w:t xml:space="preserve"> </w:t>
+      </w:r>
+      <w:r>
+        <w:t>the database enforces UNIQUE(prompt_id, version_number), so that when writing simultaneously only one succeeds, and the other gets a conflict and automatically retries (retryWhen) — reads the new</w:t>
+      </w:r>
+      <w:r>
+        <w:t xml:space="preserve"> </w:t>
+      </w:r>
+      <w:r>
+        <w:t>max and writes the next number, which guarantees unique consecutive versions without blocking code.</w:t>
       </w:r>
     </w:p>
     <w:p>
@@ -3915,9 +3779,37 @@
           <w:numId w:val="2"/>
         </w:numPr>
         <w:spacing w:after="60"/>
-      </w:pPr>
-      <w:r>
-        <w:t>Implemented POST /prompts/{id}/versions: read the prompt's current content, compute next version number, persist the snapshot.</w:t>
+        <w:jc w:val="both"/>
+      </w:pPr>
+      <w:r>
+        <w:t xml:space="preserve">Plan was </w:t>
+      </w:r>
+      <w:r>
+        <w:t>approved</w:t>
+      </w:r>
+      <w:r>
+        <w:t xml:space="preserve"> and in a new session the implementation was assigned to Sonnet 4.6 main agent, which </w:t>
+      </w:r>
+      <w:r>
+        <w:t>immediately</w:t>
+      </w:r>
+      <w:r>
+        <w:t xml:space="preserve"> </w:t>
+      </w:r>
+      <w:r>
+        <w:t>reassign</w:t>
+      </w:r>
+      <w:r>
+        <w:t>ed</w:t>
+      </w:r>
+      <w:r>
+        <w:t xml:space="preserve"> the task </w:t>
+      </w:r>
+      <w:r>
+        <w:t>to</w:t>
+      </w:r>
+      <w:r>
+        <w:t xml:space="preserve"> the backend subagent.</w:t>
       </w:r>
     </w:p>
     <w:p>
@@ -3928,9 +3820,24 @@
           <w:numId w:val="2"/>
         </w:numPr>
         <w:spacing w:after="60"/>
-      </w:pPr>
-      <w:r>
-        <w:t>Implemented GET /prompts/{id}/versions returning the ordered history as a Flux.</w:t>
+        <w:jc w:val="both"/>
+      </w:pPr>
+      <w:r>
+        <w:t>Small coding style fixes were applied, functionality was manually tested and commited afterwards.</w:t>
+      </w:r>
+    </w:p>
+    <w:p>
+      <w:pPr>
+        <w:spacing w:after="60"/>
+        <w:ind w:left="360"/>
+      </w:pPr>
+    </w:p>
+    <w:p>
+      <w:pPr>
+        <w:pStyle w:val="Heading3"/>
+      </w:pPr>
+      <w:r>
+        <w:t>Testing strategy</w:t>
       </w:r>
     </w:p>
     <w:p>
@@ -3941,17 +3848,13 @@
           <w:numId w:val="2"/>
         </w:numPr>
         <w:spacing w:after="60"/>
-      </w:pPr>
-      <w:r>
-        <w:t>Implemented restore: load a chosen version and write its content back to the live prompt (composed reactively with flatMap).</w:t>
-      </w:r>
-    </w:p>
-    <w:p>
-      <w:pPr>
-        <w:pStyle w:val="Heading3"/>
-      </w:pPr>
-      <w:r>
-        <w:t>Testing strategy</w:t>
+        <w:jc w:val="both"/>
+      </w:pPr>
+      <w:r>
+        <w:t>Usual unit and integrations tests</w:t>
+      </w:r>
+      <w:r>
+        <w:t>: create prompt, save two versions, edit the prompt, restore v1, and assert the live content matches v1.</w:t>
       </w:r>
     </w:p>
     <w:p>
@@ -3962,9 +3865,10 @@
           <w:numId w:val="2"/>
         </w:numPr>
         <w:spacing w:after="60"/>
-      </w:pPr>
-      <w:r>
-        <w:t>StepVerifier tests asserting that consecutive saves produce versionNumber 1, 2, 3 in order.</w:t>
+        <w:jc w:val="both"/>
+      </w:pPr>
+      <w:r>
+        <w:t>Fired 12 concurrent version POSTs at one prompt. Result: version numbers came out [1..8]</w:t>
       </w:r>
     </w:p>
     <w:p>
@@ -3975,22 +3879,43 @@
           <w:numId w:val="2"/>
         </w:numPr>
         <w:spacing w:after="60"/>
-      </w:pPr>
-      <w:r>
-        <w:t>WebTestClient test: create prompt, save two versions, edit the prompt, restore v1, and assert the live content matches v1.</w:t>
-      </w:r>
-    </w:p>
-    <w:p>
-      <w:pPr>
-        <w:pStyle w:val="ListParagraph"/>
-        <w:numPr>
-          <w:ilvl w:val="0"/>
-          <w:numId w:val="2"/>
-        </w:numPr>
+        <w:jc w:val="both"/>
+      </w:pPr>
+      <w:r>
+        <w:t>Manual via Swagger UI: register → login → create collection → create prompt → POST</w:t>
+      </w:r>
+    </w:p>
+    <w:p>
+      <w:pPr>
+        <w:pStyle w:val="ListParagraph"/>
         <w:spacing w:after="60"/>
-      </w:pPr>
-      <w:r>
-        <w:t>Checked ordering of the returned history and that restoring does not itself create gaps in the numbering unless intended.</w:t>
+        <w:ind w:left="720"/>
+        <w:jc w:val="both"/>
+      </w:pPr>
+      <w:r>
+        <w:t>`/prompts/{id}/versions` twice (see 1, 2) → PATCH the prompt → POST</w:t>
+      </w:r>
+    </w:p>
+    <w:p>
+      <w:pPr>
+        <w:pStyle w:val="ListParagraph"/>
+        <w:spacing w:after="60"/>
+        <w:ind w:left="720"/>
+        <w:jc w:val="both"/>
+      </w:pPr>
+      <w:r>
+        <w:t>`/prompts/{id}/versions/{n}/restore` → GET the prompt and confirm content reverted →</w:t>
+      </w:r>
+    </w:p>
+    <w:p>
+      <w:pPr>
+        <w:pStyle w:val="ListParagraph"/>
+        <w:spacing w:after="60"/>
+        <w:ind w:left="720"/>
+        <w:jc w:val="both"/>
+      </w:pPr>
+      <w:r>
+        <w:t>GET `/prompts/{id}/versions` shows the ordered history. Repeat as a second user to confirm 404 isolation.</w:t>
       </w:r>
     </w:p>
     <w:p>
@@ -4006,7 +3931,10 @@
         <w:spacing w:after="120"/>
       </w:pPr>
       <w:r>
-        <w:t>Tool used: Claude Code. The versioning logic is the place where reactive composition is genuinely tricky — chaining 'find latest version → increment → save' without blocking. Claude Code was useful for expressing this as a clean Mono/Flux pipeline and for talking through the concurrency caveat, which directly informs the 'what I'd improve' section.</w:t>
+        <w:t>Tool used: Claude Code</w:t>
+      </w:r>
+      <w:r>
+        <w:t xml:space="preserve"> Opus 4.8 for the planning phase and Sonnet 4.6 for the implementation.</w:t>
       </w:r>
     </w:p>
     <w:p>
@@ -4038,12 +3966,6 @@
         <w:gridCol w:w="9360"/>
       </w:tblGrid>
       <w:tr>
-        <w:tblPrEx>
-          <w:tblCellMar>
-            <w:top w:w="0" w:type="dxa"/>
-            <w:bottom w:w="0" w:type="dxa"/>
-          </w:tblCellMar>
-        </w:tblPrEx>
         <w:tc>
           <w:tcPr>
             <w:tcW w:w="9360" w:type="dxa"/>
@@ -4062,6 +3984,11 @@
             </w:tcMar>
           </w:tcPr>
           <w:p>
+            <w:pPr>
+              <w:rPr>
+                <w:lang w:val="en-US"/>
+              </w:rPr>
+            </w:pPr>
             <w:r>
               <w:rPr>
                 <w:b/>
@@ -4069,18 +3996,22 @@
                 <w:sz w:val="18"/>
                 <w:szCs w:val="18"/>
               </w:rPr>
-              <w:t>Prompt 1 — reactive next-version assignment</w:t>
+              <w:t xml:space="preserve">Prompt 1 — </w:t>
+            </w:r>
+            <w:r>
+              <w:rPr>
+                <w:b/>
+                <w:bCs/>
+                <w:sz w:val="18"/>
+                <w:szCs w:val="18"/>
+                <w:lang w:val="en-US"/>
+              </w:rPr>
+              <w:t>Plan</w:t>
             </w:r>
           </w:p>
         </w:tc>
       </w:tr>
       <w:tr>
-        <w:tblPrEx>
-          <w:tblCellMar>
-            <w:top w:w="0" w:type="dxa"/>
-            <w:bottom w:w="0" w:type="dxa"/>
-          </w:tblCellMar>
-        </w:tblPrEx>
         <w:tc>
           <w:tcPr>
             <w:tcW w:w="9360" w:type="dxa"/>
@@ -4100,77 +4031,56 @@
           <w:p>
             <w:pPr>
               <w:spacing w:after="40"/>
+              <w:jc w:val="both"/>
+              <w:rPr>
+                <w:sz w:val="20"/>
+                <w:szCs w:val="20"/>
+              </w:rPr>
             </w:pPr>
             <w:r>
               <w:rPr>
-                <w:rFonts w:ascii="Consolas" w:eastAsia="Consolas" w:hAnsi="Consolas" w:cs="Consolas"/>
-                <w:sz w:val="18"/>
-                <w:szCs w:val="18"/>
-              </w:rPr>
-              <w:t>[Paste your actual prompt here. Example:]</w:t>
+                <w:sz w:val="20"/>
+                <w:szCs w:val="20"/>
+              </w:rPr>
+              <w:t>Help me to plan the implementation of module 4 - prompt version history, use as a guideline the @AI-Assisted-Development-Project.docx file, my idea is to create PromptVersion entity as well as repository,implement POST endpoint /prompts/{id}/versions: which read the prompt's current content, compute next version number, persist the snapshot. Also my intention is to implement GET /prompts/{id}/versions</w:t>
+            </w:r>
+            <w:r>
+              <w:rPr>
+                <w:sz w:val="20"/>
+                <w:szCs w:val="20"/>
+              </w:rPr>
+              <w:t xml:space="preserve"> </w:t>
+            </w:r>
+            <w:r>
+              <w:rPr>
+                <w:sz w:val="20"/>
+                <w:szCs w:val="20"/>
+              </w:rPr>
+              <w:t>endpoint which return the ordered history as a Flux. Last, implement restore: load a chosen version and write its content back to the live prompt. Let's discuss the race conditions issue when assigning</w:t>
+            </w:r>
+            <w:r>
+              <w:rPr>
+                <w:sz w:val="20"/>
+                <w:szCs w:val="20"/>
+              </w:rPr>
+              <w:t xml:space="preserve"> </w:t>
+            </w:r>
+            <w:r>
+              <w:rPr>
+                <w:sz w:val="20"/>
+                <w:szCs w:val="20"/>
+              </w:rPr>
+              <w:t>versionNumber correctly and atomically. If you have another suggestions feel free to address them.</w:t>
             </w:r>
           </w:p>
           <w:p>
             <w:pPr>
               <w:spacing w:after="40"/>
             </w:pPr>
-            <w:r>
-              <w:rPr>
-                <w:rFonts w:ascii="Consolas" w:eastAsia="Consolas" w:hAnsi="Consolas" w:cs="Consolas"/>
-                <w:sz w:val="18"/>
-                <w:szCs w:val="18"/>
-              </w:rPr>
-              <w:t>"Implement 'save version': find the current max versionNumber for a</w:t>
-            </w:r>
-          </w:p>
-          <w:p>
-            <w:pPr>
-              <w:spacing w:after="40"/>
-            </w:pPr>
-            <w:r>
-              <w:rPr>
-                <w:rFonts w:ascii="Consolas" w:eastAsia="Consolas" w:hAnsi="Consolas" w:cs="Consolas"/>
-                <w:sz w:val="18"/>
-                <w:szCs w:val="18"/>
-              </w:rPr>
-              <w:t xml:space="preserve"> prompt, add one, and persist a PromptVersion snapshot of the current</w:t>
-            </w:r>
-          </w:p>
-          <w:p>
-            <w:pPr>
-              <w:spacing w:after="40"/>
-            </w:pPr>
-            <w:r>
-              <w:rPr>
-                <w:rFonts w:ascii="Consolas" w:eastAsia="Consolas" w:hAnsi="Consolas" w:cs="Consolas"/>
-                <w:sz w:val="18"/>
-                <w:szCs w:val="18"/>
-              </w:rPr>
-              <w:t xml:space="preserve"> content. Express it as a non-blocking Mono pipeline and tell me where</w:t>
-            </w:r>
-          </w:p>
-          <w:p>
-            <w:pPr>
-              <w:spacing w:after="40"/>
-            </w:pPr>
-            <w:r>
-              <w:rPr>
-                <w:rFonts w:ascii="Consolas" w:eastAsia="Consolas" w:hAnsi="Consolas" w:cs="Consolas"/>
-                <w:sz w:val="18"/>
-                <w:szCs w:val="18"/>
-              </w:rPr>
-              <w:t xml:space="preserve"> a race condition could occur."</w:t>
-            </w:r>
           </w:p>
         </w:tc>
       </w:tr>
       <w:tr>
-        <w:tblPrEx>
-          <w:tblCellMar>
-            <w:top w:w="0" w:type="dxa"/>
-            <w:bottom w:w="0" w:type="dxa"/>
-          </w:tblCellMar>
-        </w:tblPrEx>
         <w:tc>
           <w:tcPr>
             <w:tcW w:w="9360" w:type="dxa"/>
@@ -4196,18 +4106,22 @@
                 <w:sz w:val="18"/>
                 <w:szCs w:val="18"/>
               </w:rPr>
-              <w:t>Prompt 2 — restore logic</w:t>
+              <w:lastRenderedPageBreak/>
+              <w:t xml:space="preserve">Prompt 2 — </w:t>
+            </w:r>
+            <w:r>
+              <w:rPr>
+                <w:b/>
+                <w:bCs/>
+                <w:sz w:val="18"/>
+                <w:szCs w:val="18"/>
+              </w:rPr>
+              <w:t>Implementation</w:t>
             </w:r>
           </w:p>
         </w:tc>
       </w:tr>
       <w:tr>
-        <w:tblPrEx>
-          <w:tblCellMar>
-            <w:top w:w="0" w:type="dxa"/>
-            <w:bottom w:w="0" w:type="dxa"/>
-          </w:tblCellMar>
-        </w:tblPrEx>
         <w:tc>
           <w:tcPr>
             <w:tcW w:w="9360" w:type="dxa"/>
@@ -4227,14 +4141,29 @@
           <w:p>
             <w:pPr>
               <w:spacing w:after="40"/>
+              <w:rPr>
+                <w:sz w:val="20"/>
+                <w:szCs w:val="20"/>
+              </w:rPr>
             </w:pPr>
             <w:r>
               <w:rPr>
-                <w:rFonts w:ascii="Consolas" w:eastAsia="Consolas" w:hAnsi="Consolas" w:cs="Consolas"/>
-                <w:sz w:val="18"/>
-                <w:szCs w:val="18"/>
-              </w:rPr>
-              <w:t>[Paste your actual prompt here.]</w:t>
+                <w:sz w:val="20"/>
+                <w:szCs w:val="20"/>
+              </w:rPr>
+              <w:t xml:space="preserve">Implement the module 4 using the following plan - [Pasted text #1 +111 lines], create database indexes where appropriate, also be complaint  with the existing coding folder and code structure. Make sure   </w:t>
+            </w:r>
+          </w:p>
+          <w:p>
+            <w:pPr>
+              <w:spacing w:after="40"/>
+            </w:pPr>
+            <w:r>
+              <w:rPr>
+                <w:sz w:val="20"/>
+                <w:szCs w:val="20"/>
+              </w:rPr>
+              <w:t>to test accordingly the race conditions case. Additionaly, test manually with the SWAGGER UI the whole functionality. Happy coding :)</w:t>
             </w:r>
           </w:p>
         </w:tc>
@@ -4394,12 +4323,6 @@
         <w:gridCol w:w="9360"/>
       </w:tblGrid>
       <w:tr>
-        <w:tblPrEx>
-          <w:tblCellMar>
-            <w:top w:w="0" w:type="dxa"/>
-            <w:bottom w:w="0" w:type="dxa"/>
-          </w:tblCellMar>
-        </w:tblPrEx>
         <w:tc>
           <w:tcPr>
             <w:tcW w:w="9360" w:type="dxa"/>
@@ -4431,12 +4354,6 @@
         </w:tc>
       </w:tr>
       <w:tr>
-        <w:tblPrEx>
-          <w:tblCellMar>
-            <w:top w:w="0" w:type="dxa"/>
-            <w:bottom w:w="0" w:type="dxa"/>
-          </w:tblCellMar>
-        </w:tblPrEx>
         <w:tc>
           <w:tcPr>
             <w:tcW w:w="9360" w:type="dxa"/>
@@ -4536,10 +4453,7 @@
         <w:t>The frontend was built as a separate phase after all five backend modules were complete and tested, so the UI could be developed against a finished, stable API. It is a single-page React application styled with Tailwind, covering four pages: Login, Dashboard, Collections, and the Prompt Editor (which also hosts the version-history panel). The central design decision was how to carry the JWT on the client: I kept the token in memory only (React state/context) rather than persisting it, which keeps the implementation simple and side-steps the security questions around localStorage. The accepted trade-off is that a page refresh or a new tab logs the user out and returns them to the login screen.</w:t>
       </w:r>
       <w:r>
-        <w:t xml:space="preserve"> </w:t>
-      </w:r>
-      <w:r>
-        <w:t>Rather than build a separate public landing page — which would add UI with no backend behind it — the Dashboard doubles as the home screen: after login the user lands directly on their workspace statistics, with the collections sidebar available from every protected page.</w:t>
+        <w:t xml:space="preserve"> Rather than build a separate public landing page — which would add UI with no backend behind it — the Dashboard doubles as the home screen: after login the user lands directly on their workspace statistics, with the collections sidebar available from every protected page.</w:t>
       </w:r>
     </w:p>
     <w:p>
@@ -4640,10 +4554,7 @@
         <w:t>/login</w:t>
       </w:r>
       <w:r>
-        <w:t xml:space="preserve"> protected.</w:t>
-      </w:r>
-      <w:r>
-        <w:t>Implemented an auth context holding the in-memory token and a guard that redirects to /login when no valid token is present.</w:t>
+        <w:t xml:space="preserve"> protected.Implemented an auth context holding the in-memory token and a guard that redirects to /login when no valid token is present.</w:t>
       </w:r>
     </w:p>
     <w:p>
@@ -4803,12 +4714,6 @@
         <w:gridCol w:w="9360"/>
       </w:tblGrid>
       <w:tr>
-        <w:tblPrEx>
-          <w:tblCellMar>
-            <w:top w:w="0" w:type="dxa"/>
-            <w:bottom w:w="0" w:type="dxa"/>
-          </w:tblCellMar>
-        </w:tblPrEx>
         <w:tc>
           <w:tcPr>
             <w:tcW w:w="9360" w:type="dxa"/>
@@ -4840,12 +4745,6 @@
         </w:tc>
       </w:tr>
       <w:tr>
-        <w:tblPrEx>
-          <w:tblCellMar>
-            <w:top w:w="0" w:type="dxa"/>
-            <w:bottom w:w="0" w:type="dxa"/>
-          </w:tblCellMar>
-        </w:tblPrEx>
         <w:tc>
           <w:tcPr>
             <w:tcW w:w="9360" w:type="dxa"/>
@@ -4918,12 +4817,6 @@
         </w:tc>
       </w:tr>
       <w:tr>
-        <w:tblPrEx>
-          <w:tblCellMar>
-            <w:top w:w="0" w:type="dxa"/>
-            <w:bottom w:w="0" w:type="dxa"/>
-          </w:tblCellMar>
-        </w:tblPrEx>
         <w:tc>
           <w:tcPr>
             <w:tcW w:w="9360" w:type="dxa"/>
@@ -4955,12 +4848,6 @@
         </w:tc>
       </w:tr>
       <w:tr>
-        <w:tblPrEx>
-          <w:tblCellMar>
-            <w:top w:w="0" w:type="dxa"/>
-            <w:bottom w:w="0" w:type="dxa"/>
-          </w:tblCellMar>
-        </w:tblPrEx>
         <w:tc>
           <w:tcPr>
             <w:tcW w:w="9360" w:type="dxa"/>
@@ -5193,6 +5080,7 @@
       </w:pPr>
       <w:r>
         <w:rPr>
+          <w:noProof/>
           <w:lang w:val="bg-BG"/>
         </w:rPr>
         <w:drawing>
@@ -5249,6 +5137,7 @@
       </w:pPr>
       <w:r>
         <w:rPr>
+          <w:noProof/>
           <w:lang w:val="en-US"/>
         </w:rPr>
         <w:drawing>
@@ -5305,6 +5194,7 @@
       </w:pPr>
       <w:r>
         <w:rPr>
+          <w:noProof/>
           <w:lang w:val="en-US"/>
         </w:rPr>
         <w:lastRenderedPageBreak/>
@@ -5362,6 +5252,7 @@
       </w:pPr>
       <w:r>
         <w:rPr>
+          <w:noProof/>
           <w:lang w:val="en-US"/>
         </w:rPr>
         <w:drawing>
@@ -5404,6 +5295,118 @@
     <w:p>
       <w:pPr>
         <w:spacing w:after="120"/>
+        <w:rPr>
+          <w:lang w:val="en-US"/>
+        </w:rPr>
+      </w:pPr>
+    </w:p>
+    <w:p>
+      <w:pPr>
+        <w:spacing w:after="120"/>
+        <w:rPr>
+          <w:lang w:val="en-US"/>
+        </w:rPr>
+      </w:pPr>
+      <w:r>
+        <w:rPr>
+          <w:lang w:val="en-US"/>
+        </w:rPr>
+        <w:drawing>
+          <wp:inline distT="0" distB="0" distL="0" distR="0" wp14:anchorId="63C3FABC" wp14:editId="00DFCA40">
+            <wp:extent cx="5943600" cy="2310580"/>
+            <wp:effectExtent l="0" t="0" r="0" b="1270"/>
+            <wp:docPr id="240131792" name="Picture 1"/>
+            <wp:cNvGraphicFramePr>
+              <a:graphicFrameLocks xmlns:a="http://schemas.openxmlformats.org/drawingml/2006/main" noChangeAspect="1"/>
+            </wp:cNvGraphicFramePr>
+            <a:graphic xmlns:a="http://schemas.openxmlformats.org/drawingml/2006/main">
+              <a:graphicData uri="http://schemas.openxmlformats.org/drawingml/2006/picture">
+                <pic:pic xmlns:pic="http://schemas.openxmlformats.org/drawingml/2006/picture">
+                  <pic:nvPicPr>
+                    <pic:cNvPr id="240131792" name=""/>
+                    <pic:cNvPicPr/>
+                  </pic:nvPicPr>
+                  <pic:blipFill>
+                    <a:blip r:embed="rId11"/>
+                    <a:stretch>
+                      <a:fillRect/>
+                    </a:stretch>
+                  </pic:blipFill>
+                  <pic:spPr>
+                    <a:xfrm>
+                      <a:off x="0" y="0"/>
+                      <a:ext cx="5949569" cy="2312900"/>
+                    </a:xfrm>
+                    <a:prstGeom prst="rect">
+                      <a:avLst/>
+                    </a:prstGeom>
+                  </pic:spPr>
+                </pic:pic>
+              </a:graphicData>
+            </a:graphic>
+          </wp:inline>
+        </w:drawing>
+      </w:r>
+    </w:p>
+    <w:p>
+      <w:pPr>
+        <w:spacing w:after="120"/>
+        <w:rPr>
+          <w:lang w:val="en-US"/>
+        </w:rPr>
+      </w:pPr>
+    </w:p>
+    <w:p>
+      <w:pPr>
+        <w:spacing w:after="120"/>
+        <w:rPr>
+          <w:lang w:val="en-US"/>
+        </w:rPr>
+      </w:pPr>
+      <w:r>
+        <w:rPr>
+          <w:lang w:val="en-US"/>
+        </w:rPr>
+        <w:drawing>
+          <wp:inline distT="0" distB="0" distL="0" distR="0" wp14:anchorId="61B7AF07" wp14:editId="7328DAED">
+            <wp:extent cx="5943600" cy="2456180"/>
+            <wp:effectExtent l="0" t="0" r="0" b="0"/>
+            <wp:docPr id="1393115485" name="Picture 1"/>
+            <wp:cNvGraphicFramePr>
+              <a:graphicFrameLocks xmlns:a="http://schemas.openxmlformats.org/drawingml/2006/main" noChangeAspect="1"/>
+            </wp:cNvGraphicFramePr>
+            <a:graphic xmlns:a="http://schemas.openxmlformats.org/drawingml/2006/main">
+              <a:graphicData uri="http://schemas.openxmlformats.org/drawingml/2006/picture">
+                <pic:pic xmlns:pic="http://schemas.openxmlformats.org/drawingml/2006/picture">
+                  <pic:nvPicPr>
+                    <pic:cNvPr id="1393115485" name=""/>
+                    <pic:cNvPicPr/>
+                  </pic:nvPicPr>
+                  <pic:blipFill>
+                    <a:blip r:embed="rId12"/>
+                    <a:stretch>
+                      <a:fillRect/>
+                    </a:stretch>
+                  </pic:blipFill>
+                  <pic:spPr>
+                    <a:xfrm>
+                      <a:off x="0" y="0"/>
+                      <a:ext cx="5943600" cy="2456180"/>
+                    </a:xfrm>
+                    <a:prstGeom prst="rect">
+                      <a:avLst/>
+                    </a:prstGeom>
+                  </pic:spPr>
+                </pic:pic>
+              </a:graphicData>
+            </a:graphic>
+          </wp:inline>
+        </w:drawing>
+      </w:r>
+    </w:p>
+    <w:p>
+      <w:pPr>
+        <w:spacing w:after="120"/>
       </w:pPr>
       <w:r>
         <w:rPr>
@@ -5522,7 +5525,6 @@
           <w:iCs/>
           <w:color w:val="999999"/>
         </w:rPr>
-        <w:lastRenderedPageBreak/>
         <w:t>[ Paste screenshot here ]</w:t>
       </w:r>
     </w:p>
@@ -5623,8 +5625,138 @@
         <w:t>https://github.com/mrrusev/PromptVault</w:t>
       </w:r>
     </w:p>
+    <w:p>
+      <w:pPr>
+        <w:pStyle w:val="Heading1"/>
+      </w:pPr>
+    </w:p>
+    <w:p>
+      <w:pPr>
+        <w:pStyle w:val="Heading1"/>
+      </w:pPr>
+      <w:r>
+        <w:t xml:space="preserve">7. </w:t>
+      </w:r>
+      <w:r>
+        <w:t>Additional</w:t>
+      </w:r>
+    </w:p>
+    <w:p/>
+    <w:p>
+      <w:pPr>
+        <w:pStyle w:val="ListParagraph"/>
+        <w:numPr>
+          <w:ilvl w:val="0"/>
+          <w:numId w:val="4"/>
+        </w:numPr>
+        <w:jc w:val="both"/>
+      </w:pPr>
+      <w:r>
+        <w:t>Based on the project description a project-level CLAUDE.md file was created at the repository root before any code was written. It captures the full domain context — tech stack, non-negotiable rules, module order, endpoint contracts, testing strategy, and out-of-scope features — so every AI session starts with the same shared understanding without requiring repetition in individual prompts.</w:t>
+      </w:r>
+    </w:p>
+    <w:p>
+      <w:pPr>
+        <w:pStyle w:val="ListParagraph"/>
+        <w:ind w:left="720"/>
+        <w:jc w:val="both"/>
+      </w:pPr>
+    </w:p>
+    <w:p>
+      <w:pPr>
+        <w:pStyle w:val="ListParagraph"/>
+        <w:numPr>
+          <w:ilvl w:val="0"/>
+          <w:numId w:val="4"/>
+        </w:numPr>
+        <w:jc w:val="both"/>
+      </w:pPr>
+      <w:r>
+        <w:t xml:space="preserve">A global CLAUDE.md file is maintained in </w:t>
+      </w:r>
+      <w:r>
+        <w:t>my</w:t>
+      </w:r>
+      <w:r>
+        <w:t xml:space="preserve"> user home directory (~/.claude/CLAUDE.md) and contains cross-project instructions that apply to every project: decision priority order, architecture principles, working scope, testing strategy, security constraints, code style, git conventions, and logging guidelines. This ensures consistent AI behaviour across all codebases without repeating the rules in every project.</w:t>
+      </w:r>
+    </w:p>
+    <w:p>
+      <w:pPr>
+        <w:jc w:val="both"/>
+      </w:pPr>
+    </w:p>
+    <w:p>
+      <w:pPr>
+        <w:pStyle w:val="ListParagraph"/>
+        <w:numPr>
+          <w:ilvl w:val="0"/>
+          <w:numId w:val="4"/>
+        </w:numPr>
+        <w:jc w:val="both"/>
+      </w:pPr>
+      <w:r>
+        <w:t>git init was performed before writing any code, establishing version control from the very first commit. Each module was committed as a self-contained unit with a conventional commit message.</w:t>
+      </w:r>
+    </w:p>
+    <w:p>
+      <w:pPr>
+        <w:jc w:val="both"/>
+      </w:pPr>
+    </w:p>
+    <w:p>
+      <w:pPr>
+        <w:pStyle w:val="ListParagraph"/>
+        <w:numPr>
+          <w:ilvl w:val="0"/>
+          <w:numId w:val="4"/>
+        </w:numPr>
+        <w:jc w:val="both"/>
+      </w:pPr>
+      <w:r>
+        <w:t>Created a delegation skill (delegate-implementation) that decomposes an implementation request into focused sub-problems and routes each one to the appropriate subagent, keeping the orchestrator context clean.</w:t>
+      </w:r>
+    </w:p>
+    <w:p>
+      <w:pPr>
+        <w:jc w:val="both"/>
+      </w:pPr>
+    </w:p>
+    <w:p>
+      <w:pPr>
+        <w:pStyle w:val="ListParagraph"/>
+        <w:numPr>
+          <w:ilvl w:val="0"/>
+          <w:numId w:val="4"/>
+        </w:numPr>
+        <w:jc w:val="both"/>
+      </w:pPr>
+      <w:r>
+        <w:t>Created two specialized subagents — backend-expert (Java 21 / Spring WebFlux / R2DBC) and frontend-expert (React + Tailwind CSS) — so each agent operates with the right domain knowledge and tool access for its layer.</w:t>
+      </w:r>
+    </w:p>
+    <w:p>
+      <w:pPr>
+        <w:jc w:val="both"/>
+        <w:rPr>
+          <w:lang w:val="bg-BG"/>
+        </w:rPr>
+      </w:pPr>
+    </w:p>
+    <w:p>
+      <w:pPr>
+        <w:pStyle w:val="ListParagraph"/>
+        <w:numPr>
+          <w:ilvl w:val="0"/>
+          <w:numId w:val="4"/>
+        </w:numPr>
+      </w:pPr>
+      <w:r>
+        <w:t>A session-tracker hook is configured in the project-level .claude/settings.json. Two PostToolUse hooks log each Skill and Agent invocation (tagged with the session ID) to .claude/session-usage.log inside the repository. A Stop hook reads that file at the end of each session, displays a summary of which custom skills and agents were used (with invocation counts) filtered to the current session, and leaves the log intact so the full history across sessions is preserved.</w:t>
+      </w:r>
+    </w:p>
     <w:sectPr>
-      <w:footerReference w:type="default" r:id="rId11"/>
+      <w:footerReference w:type="default" r:id="rId13"/>
       <w:pgSz w:w="12240" w:h="15840"/>
       <w:pgMar w:top="1440" w:right="1440" w:bottom="1440" w:left="1440" w:header="708" w:footer="708" w:gutter="0"/>
       <w:cols w:space="720"/>
@@ -5792,6 +5924,67 @@
     </w:lvl>
   </w:abstractNum>
   <w:abstractNum w:abstractNumId="1" w15:restartNumberingAfterBreak="0">
+    <w:nsid w:val="2E2D30B7"/>
+    <w:multiLevelType w:val="hybridMultilevel"/>
+    <w:tmpl w:val="3440D08E"/>
+    <w:lvl w:ilvl="0" w:tplc="08090001">
+      <w:start w:val="1"/>
+      <w:numFmt w:val="bullet"/>
+      <w:lvlText w:val=""/>
+      <w:lvlJc w:val="left"/>
+      <w:pPr>
+        <w:ind w:left="720" w:hanging="360"/>
+      </w:pPr>
+      <w:rPr>
+        <w:rFonts w:ascii="Symbol" w:hAnsi="Symbol" w:hint="default"/>
+      </w:rPr>
+    </w:lvl>
+    <w:lvl w:ilvl="1" w:tplc="FFFFFFFF">
+      <w:start w:val="1"/>
+      <w:numFmt w:val="bullet"/>
+      <w:lvlText w:val="◦"/>
+      <w:lvlJc w:val="left"/>
+      <w:pPr>
+        <w:ind w:left="1440" w:hanging="360"/>
+      </w:pPr>
+    </w:lvl>
+    <w:lvl w:ilvl="2" w:tplc="FFFFFFFF">
+      <w:numFmt w:val="decimal"/>
+      <w:lvlText w:val=""/>
+      <w:lvlJc w:val="left"/>
+    </w:lvl>
+    <w:lvl w:ilvl="3" w:tplc="FFFFFFFF">
+      <w:numFmt w:val="decimal"/>
+      <w:lvlText w:val=""/>
+      <w:lvlJc w:val="left"/>
+    </w:lvl>
+    <w:lvl w:ilvl="4" w:tplc="FFFFFFFF">
+      <w:numFmt w:val="decimal"/>
+      <w:lvlText w:val=""/>
+      <w:lvlJc w:val="left"/>
+    </w:lvl>
+    <w:lvl w:ilvl="5" w:tplc="FFFFFFFF">
+      <w:numFmt w:val="decimal"/>
+      <w:lvlText w:val=""/>
+      <w:lvlJc w:val="left"/>
+    </w:lvl>
+    <w:lvl w:ilvl="6" w:tplc="FFFFFFFF">
+      <w:numFmt w:val="decimal"/>
+      <w:lvlText w:val=""/>
+      <w:lvlJc w:val="left"/>
+    </w:lvl>
+    <w:lvl w:ilvl="7" w:tplc="FFFFFFFF">
+      <w:numFmt w:val="decimal"/>
+      <w:lvlText w:val=""/>
+      <w:lvlJc w:val="left"/>
+    </w:lvl>
+    <w:lvl w:ilvl="8" w:tplc="FFFFFFFF">
+      <w:numFmt w:val="decimal"/>
+      <w:lvlText w:val=""/>
+      <w:lvlJc w:val="left"/>
+    </w:lvl>
+  </w:abstractNum>
+  <w:abstractNum w:abstractNumId="2" w15:restartNumberingAfterBreak="0">
     <w:nsid w:val="43502959"/>
     <w:multiLevelType w:val="hybridMultilevel"/>
     <w:tmpl w:val="E6329368"/>
@@ -5878,7 +6071,7 @@
     </w:lvl>
   </w:abstractNum>
   <w:num w:numId="1" w16cid:durableId="844369213">
-    <w:abstractNumId w:val="1"/>
+    <w:abstractNumId w:val="2"/>
     <w:lvlOverride w:ilvl="0">
       <w:startOverride w:val="1"/>
     </w:lvlOverride>
@@ -5888,6 +6081,12 @@
     <w:lvlOverride w:ilvl="0">
       <w:startOverride w:val="1"/>
     </w:lvlOverride>
+  </w:num>
+  <w:num w:numId="3" w16cid:durableId="536891499">
+    <w:abstractNumId w:val="0"/>
+  </w:num>
+  <w:num w:numId="4" w16cid:durableId="171258733">
+    <w:abstractNumId w:val="1"/>
   </w:num>
 </w:numbering>
 </file>

</xml_diff>

<commit_message>
Add dashboard feature with aggregate statistics and related services (module 5 implementation)
</commit_message>
<xml_diff>
--- a/AI-Assisted-Development-Project.docx
+++ b/AI-Assisted-Development-Project.docx
@@ -4194,7 +4194,13 @@
         <w:spacing w:after="120"/>
       </w:pPr>
       <w:r>
-        <w:t>The dashboard exposes a single reactive endpoint, GET /dashboard, that returns aggregate counts for the current user: total collections, total prompts, total versions, and the latest prompt. I deliberately did NOT implement SSE or any real-time streaming — the requirement is just aggregation. The interesting reactive aspect is composing four independent count queries into one response without blocking, which I did with Mono.zip.</w:t>
+        <w:t xml:space="preserve">The dashboard exposes a single reactive endpoint, GET /dashboard, that returns aggregate counts for the current user: total collections, total prompts, total versions, and the latest prompt. The interesting reactive aspect is composing four independent count queries into one response without blocking, which </w:t>
+      </w:r>
+      <w:r>
+        <w:t>was done</w:t>
+      </w:r>
+      <w:r>
+        <w:t xml:space="preserve"> with Mono.zip.</w:t>
       </w:r>
     </w:p>
     <w:p>
@@ -4213,9 +4219,139 @@
           <w:numId w:val="2"/>
         </w:numPr>
         <w:spacing w:after="60"/>
-      </w:pPr>
-      <w:r>
-        <w:t>Added count queries (scoped by owner) to the existing repositories.</w:t>
+        <w:rPr>
+          <w:lang w:val="bg-BG"/>
+        </w:rPr>
+      </w:pPr>
+      <w:r>
+        <w:rPr>
+          <w:lang w:val="en-US"/>
+        </w:rPr>
+        <w:t xml:space="preserve">Planned the implementation in a new session, prompt for that is attached. </w:t>
+      </w:r>
+      <w:r>
+        <w:rPr>
+          <w:lang w:val="en-US"/>
+        </w:rPr>
+        <w:t xml:space="preserve">Aligned with the model that the </w:t>
+      </w:r>
+      <w:r>
+        <w:rPr>
+          <w:lang w:val="en-US"/>
+        </w:rPr>
+        <w:t>dashboard's "latest prompt" field</w:t>
+      </w:r>
+      <w:r>
+        <w:rPr>
+          <w:lang w:val="en-US"/>
+        </w:rPr>
+        <w:t xml:space="preserve"> will</w:t>
+      </w:r>
+      <w:r>
+        <w:rPr>
+          <w:lang w:val="en-US"/>
+        </w:rPr>
+        <w:t xml:space="preserve"> </w:t>
+      </w:r>
+      <w:r>
+        <w:rPr>
+          <w:lang w:val="en-US"/>
+        </w:rPr>
+        <w:t>f</w:t>
+      </w:r>
+      <w:r>
+        <w:rPr>
+          <w:lang w:val="en-US"/>
+        </w:rPr>
+        <w:t xml:space="preserve">ull </w:t>
+      </w:r>
+      <w:r>
+        <w:rPr>
+          <w:lang w:val="en-US"/>
+        </w:rPr>
+        <w:t>prompt response</w:t>
+      </w:r>
+      <w:r>
+        <w:rPr>
+          <w:lang w:val="en-US"/>
+        </w:rPr>
+        <w:t>.</w:t>
+      </w:r>
+      <w:r>
+        <w:rPr>
+          <w:lang w:val="en-US"/>
+        </w:rPr>
+        <w:t xml:space="preserve"> </w:t>
+      </w:r>
+      <w:r>
+        <w:rPr>
+          <w:lang w:val="en-US"/>
+        </w:rPr>
+        <w:t xml:space="preserve">The plan was corrected </w:t>
+      </w:r>
+      <w:r>
+        <w:rPr>
+          <w:lang w:val="en-US"/>
+        </w:rPr>
+        <w:t xml:space="preserve">afterwards </w:t>
+      </w:r>
+      <w:r>
+        <w:rPr>
+          <w:lang w:val="en-US"/>
+        </w:rPr>
+        <w:t>to use derived queries instead of @Query</w:t>
+      </w:r>
+      <w:r>
+        <w:rPr>
+          <w:lang w:val="en-US"/>
+        </w:rPr>
+        <w:t xml:space="preserve"> </w:t>
+      </w:r>
+      <w:r>
+        <w:rPr>
+          <w:lang w:val="en-US"/>
+        </w:rPr>
+        <w:t>and</w:t>
+      </w:r>
+      <w:r>
+        <w:rPr>
+          <w:lang w:val="en-US"/>
+        </w:rPr>
+        <w:t xml:space="preserve"> to use </w:t>
+      </w:r>
+      <w:proofErr w:type="spellStart"/>
+      <w:r>
+        <w:rPr>
+          <w:lang w:val="en-US"/>
+        </w:rPr>
+        <w:t>defaultIfEmpty</w:t>
+      </w:r>
+      <w:proofErr w:type="spellEnd"/>
+      <w:r>
+        <w:rPr>
+          <w:lang w:val="en-US"/>
+        </w:rPr>
+        <w:t>(</w:t>
+      </w:r>
+      <w:proofErr w:type="spellStart"/>
+      <w:r>
+        <w:rPr>
+          <w:lang w:val="en-US"/>
+        </w:rPr>
+        <w:t>Optional.empty</w:t>
+      </w:r>
+      <w:proofErr w:type="spellEnd"/>
+      <w:r>
+        <w:rPr>
+          <w:lang w:val="en-US"/>
+        </w:rPr>
+        <w:t>())</w:t>
+      </w:r>
+      <w:r>
+        <w:rPr>
+          <w:lang w:val="en-US"/>
+        </w:rPr>
+        <w:t xml:space="preserve"> – to not discard the whole tuple if source return empty</w:t>
       </w:r>
     </w:p>
     <w:p>
@@ -4226,9 +4362,75 @@
           <w:numId w:val="2"/>
         </w:numPr>
         <w:spacing w:after="60"/>
-      </w:pPr>
-      <w:r>
-        <w:t>Created a DashboardService that runs the four queries concurrently and combines them with Mono.zip into a single DashboardDto.</w:t>
+        <w:rPr>
+          <w:lang w:val="en-US"/>
+        </w:rPr>
+      </w:pPr>
+      <w:r>
+        <w:rPr>
+          <w:lang w:val="en-US"/>
+        </w:rPr>
+        <w:t>Started the implementation again in another session, prompt attached below.</w:t>
+      </w:r>
+      <w:r>
+        <w:rPr>
+          <w:lang w:val="en-US"/>
+        </w:rPr>
+        <w:t xml:space="preserve"> I asked that third party skill should be loaded to enhance main model</w:t>
+      </w:r>
+      <w:r>
+        <w:rPr>
+          <w:lang w:val="en-US"/>
+        </w:rPr>
+        <w:t xml:space="preserve"> (experimenting)</w:t>
+      </w:r>
+      <w:r>
+        <w:rPr>
+          <w:lang w:val="en-US"/>
+        </w:rPr>
+        <w:t xml:space="preserve">, but the model answered that </w:t>
+      </w:r>
+      <w:r>
+        <w:rPr>
+          <w:lang w:val="en-US"/>
+        </w:rPr>
+        <w:t>it</w:t>
+      </w:r>
+      <w:r>
+        <w:rPr>
+          <w:lang w:val="en-US"/>
+        </w:rPr>
+        <w:t xml:space="preserve"> can't</w:t>
+      </w:r>
+      <w:r>
+        <w:rPr>
+          <w:lang w:val="en-US"/>
+        </w:rPr>
+        <w:t xml:space="preserve"> </w:t>
+      </w:r>
+      <w:r>
+        <w:rPr>
+          <w:lang w:val="en-US"/>
+        </w:rPr>
+        <w:t>pull in an arbitrary third-party skill mid-run</w:t>
+      </w:r>
+      <w:r>
+        <w:rPr>
+          <w:lang w:val="en-US"/>
+        </w:rPr>
+        <w:t xml:space="preserve"> </w:t>
+      </w:r>
+      <w:r>
+        <w:rPr>
+          <w:lang w:val="en-US"/>
+        </w:rPr>
+        <w:sym w:font="Wingdings" w:char="F04A"/>
+      </w:r>
+      <w:r>
+        <w:rPr>
+          <w:lang w:val="en-US"/>
+        </w:rPr>
+        <w:t xml:space="preserve"> </w:t>
       </w:r>
     </w:p>
     <w:p>
@@ -4239,9 +4441,21 @@
           <w:numId w:val="2"/>
         </w:numPr>
         <w:spacing w:after="60"/>
-      </w:pPr>
-      <w:r>
-        <w:t>Exposed GET /dashboard returning that Mono.</w:t>
+        <w:rPr>
+          <w:lang w:val="en-US"/>
+        </w:rPr>
+      </w:pPr>
+      <w:r>
+        <w:rPr>
+          <w:lang w:val="en-US"/>
+        </w:rPr>
+        <w:t xml:space="preserve">Overall fine implementation, committing after </w:t>
+      </w:r>
+      <w:r>
+        <w:rPr>
+          <w:lang w:val="en-US"/>
+        </w:rPr>
+        <w:t>applied testing strategy below</w:t>
       </w:r>
     </w:p>
     <w:p>
@@ -4260,9 +4474,19 @@
           <w:numId w:val="2"/>
         </w:numPr>
         <w:spacing w:after="60"/>
-      </w:pPr>
-      <w:r>
-        <w:t>WebTestClient test seeding a known workspace (e.g. 2 collections, 3 prompts, 5 versions) and asserting each count in the response body.</w:t>
+        <w:jc w:val="both"/>
+      </w:pPr>
+      <w:r>
+        <w:t xml:space="preserve"> </w:t>
+      </w:r>
+      <w:r>
+        <w:t>A StepVerifier service unit test</w:t>
+      </w:r>
+      <w:r>
+        <w:t>s</w:t>
+      </w:r>
+      <w:r>
+        <w:t xml:space="preserve"> covers the happy path (counts 2/3/5 + a mapped latest prompt) and the zero-prompts regression guard (the Mono.zip empty-trap →  latestPrompt: null). </w:t>
       </w:r>
     </w:p>
     <w:p>
@@ -4273,9 +4497,77 @@
           <w:numId w:val="2"/>
         </w:numPr>
         <w:spacing w:after="60"/>
-      </w:pPr>
-      <w:r>
-        <w:t>StepVerifier test confirming the combined Mono emits exactly one aggregated value and completes.</w:t>
+        <w:jc w:val="both"/>
+      </w:pPr>
+      <w:r>
+        <w:t>A WebTestClient integration test</w:t>
+      </w:r>
+      <w:r>
+        <w:t>s</w:t>
+      </w:r>
+      <w:r>
+        <w:t xml:space="preserve"> covers a seeded workspace, the empty-data user, the missing-token 401, and cross-user ownership isolation</w:t>
+      </w:r>
+    </w:p>
+    <w:p>
+      <w:pPr>
+        <w:pStyle w:val="ListParagraph"/>
+        <w:numPr>
+          <w:ilvl w:val="0"/>
+          <w:numId w:val="2"/>
+        </w:numPr>
+        <w:spacing w:after="60"/>
+        <w:jc w:val="both"/>
+      </w:pPr>
+      <w:r>
+        <w:t xml:space="preserve">Manual via Swagger UI: register → login → create 2 collections → create 3 prompts → POST /prompts/{id}/versions to snapshot prompts (5 total) → GET /dashboard and confirm totalCollections: 2, totalPrompts: 3, totalVersions: 5, and latestPrompt is the most recently created prompt → GET /dashboard as a brand-new second user confirms 0/0/0 and latestPrompt: null, </w:t>
+      </w:r>
+      <w:r>
+        <w:t>AI tool choice</w:t>
+      </w:r>
+    </w:p>
+    <w:p>
+      <w:pPr>
+        <w:spacing w:after="120"/>
+      </w:pPr>
+      <w:r>
+        <w:t xml:space="preserve">Claude Code as usage limits hitted on Cursor and Github Copilot </w:t>
+      </w:r>
+      <w:r>
+        <w:sym w:font="Wingdings" w:char="F04A"/>
+      </w:r>
+      <w:r>
+        <w:t xml:space="preserve"> </w:t>
+      </w:r>
+      <w:r>
+        <w:t>Opus 4.8 was used for the planning and Haiku 4.5 for</w:t>
+      </w:r>
+      <w:r>
+        <w:t xml:space="preserve"> the implementation </w:t>
+      </w:r>
+      <w:r>
+        <w:t>(</w:t>
+      </w:r>
+      <w:r>
+        <w:t xml:space="preserve">this </w:t>
+      </w:r>
+      <w:r>
+        <w:t xml:space="preserve">is </w:t>
+      </w:r>
+      <w:r>
+        <w:t xml:space="preserve">kind of </w:t>
+      </w:r>
+      <w:r>
+        <w:t>not that complex</w:t>
+      </w:r>
+      <w:r>
+        <w:t xml:space="preserve"> task</w:t>
+      </w:r>
+      <w:r>
+        <w:t>, so I tried it)</w:t>
+      </w:r>
+      <w:r>
+        <w:t>.</w:t>
       </w:r>
     </w:p>
     <w:p>
@@ -4283,6 +4575,535 @@
         <w:pStyle w:val="Heading3"/>
       </w:pPr>
       <w:r>
+        <w:t>Key prompts / interactions</w:t>
+      </w:r>
+    </w:p>
+    <w:tbl>
+      <w:tblPr>
+        <w:tblW w:w="9421" w:type="dxa"/>
+        <w:tblBorders>
+          <w:top w:val="single" w:sz="4" w:space="0" w:color="auto"/>
+          <w:left w:val="single" w:sz="4" w:space="0" w:color="auto"/>
+          <w:bottom w:val="single" w:sz="4" w:space="0" w:color="auto"/>
+          <w:right w:val="single" w:sz="4" w:space="0" w:color="auto"/>
+          <w:insideH w:val="single" w:sz="4" w:space="0" w:color="auto"/>
+          <w:insideV w:val="single" w:sz="4" w:space="0" w:color="auto"/>
+        </w:tblBorders>
+        <w:tblCellMar>
+          <w:left w:w="10" w:type="dxa"/>
+          <w:right w:w="10" w:type="dxa"/>
+        </w:tblCellMar>
+        <w:tblLook w:val="04A0" w:firstRow="1" w:lastRow="0" w:firstColumn="1" w:lastColumn="0" w:noHBand="0" w:noVBand="1"/>
+      </w:tblPr>
+      <w:tblGrid>
+        <w:gridCol w:w="9421"/>
+      </w:tblGrid>
+      <w:tr>
+        <w:trPr>
+          <w:trHeight w:val="203"/>
+        </w:trPr>
+        <w:tc>
+          <w:tcPr>
+            <w:tcW w:w="9421" w:type="dxa"/>
+            <w:tcBorders>
+              <w:top w:val="single" w:sz="1" w:space="0" w:color="CCCCCC"/>
+              <w:left w:val="single" w:sz="1" w:space="0" w:color="CCCCCC"/>
+              <w:bottom w:val="single" w:sz="1" w:space="0" w:color="CCCCCC"/>
+              <w:right w:val="single" w:sz="1" w:space="0" w:color="CCCCCC"/>
+            </w:tcBorders>
+            <w:shd w:val="clear" w:color="auto" w:fill="D7E0F2"/>
+            <w:tcMar>
+              <w:top w:w="80" w:type="dxa"/>
+              <w:left w:w="120" w:type="dxa"/>
+              <w:bottom w:w="80" w:type="dxa"/>
+              <w:right w:w="120" w:type="dxa"/>
+            </w:tcMar>
+          </w:tcPr>
+          <w:p>
+            <w:r>
+              <w:rPr>
+                <w:b/>
+                <w:bCs/>
+                <w:sz w:val="18"/>
+                <w:szCs w:val="18"/>
+              </w:rPr>
+              <w:t xml:space="preserve">Prompt 1 — </w:t>
+            </w:r>
+            <w:r>
+              <w:rPr>
+                <w:b/>
+                <w:bCs/>
+                <w:sz w:val="18"/>
+                <w:szCs w:val="18"/>
+              </w:rPr>
+              <w:t>Plan</w:t>
+            </w:r>
+          </w:p>
+        </w:tc>
+      </w:tr>
+      <w:tr>
+        <w:trPr>
+          <w:trHeight w:val="1638"/>
+        </w:trPr>
+        <w:tc>
+          <w:tcPr>
+            <w:tcW w:w="9421" w:type="dxa"/>
+            <w:tcBorders>
+              <w:top w:val="single" w:sz="1" w:space="0" w:color="CCCCCC"/>
+              <w:left w:val="single" w:sz="1" w:space="0" w:color="CCCCCC"/>
+              <w:bottom w:val="single" w:sz="1" w:space="0" w:color="CCCCCC"/>
+              <w:right w:val="single" w:sz="1" w:space="0" w:color="CCCCCC"/>
+            </w:tcBorders>
+            <w:tcMar>
+              <w:top w:w="80" w:type="dxa"/>
+              <w:left w:w="120" w:type="dxa"/>
+              <w:bottom w:w="80" w:type="dxa"/>
+              <w:right w:w="120" w:type="dxa"/>
+            </w:tcMar>
+          </w:tcPr>
+          <w:p>
+            <w:pPr>
+              <w:spacing w:after="40"/>
+              <w:jc w:val="both"/>
+              <w:rPr>
+                <w:sz w:val="20"/>
+                <w:szCs w:val="20"/>
+              </w:rPr>
+            </w:pPr>
+            <w:r>
+              <w:rPr>
+                <w:sz w:val="20"/>
+                <w:szCs w:val="20"/>
+              </w:rPr>
+              <w:t xml:space="preserve">I want to plan the implementation for the module 5 - dashboard, for this refer to the @AI-Assisted-Development-Project.docx file, my intention is to have dashboard tht exposes a single reactive endpoint, GET /dashboard, that returns aggregate counts for the current user: total collections, total prompts, total versions, and the latest prompt. Add the needed queries for that, I want the dashboard service to run concurenlty the queries using Mono.zip, return Mono at the end. </w:t>
+            </w:r>
+          </w:p>
+          <w:p>
+            <w:pPr>
+              <w:spacing w:after="40"/>
+              <w:jc w:val="both"/>
+              <w:rPr>
+                <w:sz w:val="20"/>
+                <w:szCs w:val="20"/>
+              </w:rPr>
+            </w:pPr>
+            <w:r>
+              <w:rPr>
+                <w:sz w:val="20"/>
+                <w:szCs w:val="20"/>
+              </w:rPr>
+              <w:t>If something unclear, ping me to discuss it.</w:t>
+            </w:r>
+          </w:p>
+          <w:p>
+            <w:pPr>
+              <w:spacing w:after="40"/>
+            </w:pPr>
+          </w:p>
+        </w:tc>
+      </w:tr>
+      <w:tr>
+        <w:trPr>
+          <w:trHeight w:val="1362"/>
+        </w:trPr>
+        <w:tc>
+          <w:tcPr>
+            <w:tcW w:w="9421" w:type="dxa"/>
+            <w:tcBorders>
+              <w:top w:val="single" w:sz="1" w:space="0" w:color="CCCCCC"/>
+              <w:left w:val="single" w:sz="1" w:space="0" w:color="CCCCCC"/>
+              <w:bottom w:val="single" w:sz="1" w:space="0" w:color="CCCCCC"/>
+              <w:right w:val="single" w:sz="1" w:space="0" w:color="CCCCCC"/>
+            </w:tcBorders>
+            <w:tcMar>
+              <w:top w:w="80" w:type="dxa"/>
+              <w:left w:w="120" w:type="dxa"/>
+              <w:bottom w:w="80" w:type="dxa"/>
+              <w:right w:w="120" w:type="dxa"/>
+            </w:tcMar>
+          </w:tcPr>
+          <w:p>
+            <w:pPr>
+              <w:spacing w:after="40"/>
+              <w:jc w:val="both"/>
+              <w:rPr>
+                <w:b/>
+                <w:bCs/>
+                <w:sz w:val="18"/>
+                <w:szCs w:val="18"/>
+              </w:rPr>
+            </w:pPr>
+            <w:r>
+              <w:rPr>
+                <w:b/>
+                <w:bCs/>
+                <w:sz w:val="18"/>
+                <w:szCs w:val="18"/>
+              </w:rPr>
+              <w:t>Prompt 2 – Implementation:</w:t>
+            </w:r>
+          </w:p>
+          <w:p>
+            <w:pPr>
+              <w:spacing w:after="40"/>
+              <w:jc w:val="both"/>
+              <w:rPr>
+                <w:sz w:val="18"/>
+                <w:szCs w:val="18"/>
+              </w:rPr>
+            </w:pPr>
+            <w:r>
+              <w:rPr>
+                <w:sz w:val="18"/>
+                <w:szCs w:val="18"/>
+              </w:rPr>
+              <w:t>Let' implement module 5, use as a guide this plan</w:t>
+            </w:r>
+            <w:r>
+              <w:rPr>
+                <w:sz w:val="18"/>
+                <w:szCs w:val="18"/>
+              </w:rPr>
+              <w:t xml:space="preserve"> - </w:t>
+            </w:r>
+            <w:r>
+              <w:rPr>
+                <w:sz w:val="20"/>
+                <w:szCs w:val="20"/>
+              </w:rPr>
+              <w:t>[Pasted text #1 +1</w:t>
+            </w:r>
+            <w:r>
+              <w:rPr>
+                <w:sz w:val="20"/>
+                <w:szCs w:val="20"/>
+              </w:rPr>
+              <w:t>06</w:t>
+            </w:r>
+            <w:r>
+              <w:rPr>
+                <w:sz w:val="20"/>
+                <w:szCs w:val="20"/>
+              </w:rPr>
+              <w:t xml:space="preserve"> lines]</w:t>
+            </w:r>
+            <w:r>
+              <w:rPr>
+                <w:sz w:val="18"/>
+                <w:szCs w:val="18"/>
+              </w:rPr>
+              <w:t xml:space="preserve"> </w:t>
+            </w:r>
+            <w:r>
+              <w:rPr>
+                <w:sz w:val="18"/>
+                <w:szCs w:val="18"/>
+              </w:rPr>
+              <w:t xml:space="preserve">I </w:t>
+            </w:r>
+            <w:r>
+              <w:rPr>
+                <w:sz w:val="18"/>
+                <w:szCs w:val="18"/>
+              </w:rPr>
+              <w:t>want full unit and integration test covarage of the functionality, use this skill for enchancing your capabilites - https://github.com/jeffallan/claude-skills --skill spring-boot-engineer. Consider</w:t>
+            </w:r>
+            <w:r>
+              <w:rPr>
+                <w:sz w:val="18"/>
+                <w:szCs w:val="18"/>
+              </w:rPr>
+              <w:t xml:space="preserve"> </w:t>
+            </w:r>
+            <w:r>
+              <w:rPr>
+                <w:sz w:val="18"/>
+                <w:szCs w:val="18"/>
+              </w:rPr>
+              <w:t>task is done after verifying the build and tests passed and corectness is achieved.</w:t>
+            </w:r>
+          </w:p>
+          <w:p>
+            <w:pPr>
+              <w:spacing w:after="40"/>
+              <w:jc w:val="both"/>
+              <w:rPr>
+                <w:b/>
+                <w:bCs/>
+              </w:rPr>
+            </w:pPr>
+          </w:p>
+        </w:tc>
+      </w:tr>
+    </w:tbl>
+    <w:p>
+      <w:pPr>
+        <w:pStyle w:val="Heading2"/>
+        <w:pageBreakBefore/>
+      </w:pPr>
+      <w:bookmarkStart w:id="9" w:name="_Toc232434966"/>
+      <w:r>
+        <w:lastRenderedPageBreak/>
+        <w:t>Module 6 — Frontend (React + Tailwind)</w:t>
+      </w:r>
+      <w:bookmarkEnd w:id="9"/>
+    </w:p>
+    <w:p>
+      <w:pPr>
+        <w:pStyle w:val="Heading3"/>
+      </w:pPr>
+      <w:r>
+        <w:t>Approach &amp; reasoning</w:t>
+      </w:r>
+    </w:p>
+    <w:p>
+      <w:pPr>
+        <w:spacing w:after="120"/>
+        <w:jc w:val="both"/>
+      </w:pPr>
+      <w:r>
+        <w:t>The frontend was built as a separate phase after all five backend modules were complete and tested, so the UI could be developed against a finished, stable API. It is a single-page React application styled with Tailwind, covering four pages: Login, Dashboard, Collections, and the Prompt Editor</w:t>
+      </w:r>
+      <w:r>
+        <w:rPr>
+          <w:lang w:val="bg-BG"/>
+        </w:rPr>
+        <w:t xml:space="preserve">. </w:t>
+      </w:r>
+      <w:r>
+        <w:t>The central design decision was how to carry the JWT on the client: I kept the token in memory only (React state/context) rather than persisting it, which keeps the implementation simple and side-steps the security questions around localStorage. The accepted trade-off is that a page refresh or a new tab logs the user out and returns them to the login screen.</w:t>
+      </w:r>
+      <w:r>
+        <w:t xml:space="preserve"> Rather than build a separate public landing page</w:t>
+      </w:r>
+      <w:r>
+        <w:rPr>
+          <w:lang w:val="bg-BG"/>
+        </w:rPr>
+        <w:t xml:space="preserve"> - </w:t>
+      </w:r>
+      <w:r>
+        <w:t xml:space="preserve"> the Dashboard doubles as the home screen: after login the user lands directly on their workspace statistics, with the collections sidebar available from every protected page.</w:t>
+      </w:r>
+    </w:p>
+    <w:p>
+      <w:pPr>
+        <w:pStyle w:val="Heading3"/>
+      </w:pPr>
+      <w:r>
+        <w:t>Step-by-step workflow</w:t>
+      </w:r>
+    </w:p>
+    <w:p>
+      <w:pPr>
+        <w:pStyle w:val="ListParagraph"/>
+        <w:numPr>
+          <w:ilvl w:val="0"/>
+          <w:numId w:val="2"/>
+        </w:numPr>
+        <w:spacing w:after="60"/>
+      </w:pPr>
+      <w:r>
+        <w:t xml:space="preserve">Set up the React app with Tailwind and the routes: </w:t>
+      </w:r>
+      <w:r>
+        <w:rPr>
+          <w:rStyle w:val="HTMLCode"/>
+          <w:rFonts w:eastAsia="Arial"/>
+        </w:rPr>
+        <w:t>/</w:t>
+      </w:r>
+      <w:r>
+        <w:t xml:space="preserve"> (redirects to </w:t>
+      </w:r>
+      <w:r>
+        <w:rPr>
+          <w:rStyle w:val="HTMLCode"/>
+          <w:rFonts w:eastAsia="Arial"/>
+        </w:rPr>
+        <w:t>/dashboard</w:t>
+      </w:r>
+      <w:r>
+        <w:t xml:space="preserve"> when authenticated, else </w:t>
+      </w:r>
+      <w:r>
+        <w:rPr>
+          <w:rStyle w:val="HTMLCode"/>
+          <w:rFonts w:eastAsia="Arial"/>
+        </w:rPr>
+        <w:t>/login</w:t>
+      </w:r>
+      <w:r>
+        <w:t xml:space="preserve">), </w:t>
+      </w:r>
+      <w:r>
+        <w:rPr>
+          <w:rStyle w:val="HTMLCode"/>
+          <w:rFonts w:eastAsia="Arial"/>
+        </w:rPr>
+        <w:t>/login</w:t>
+      </w:r>
+      <w:r>
+        <w:t xml:space="preserve"> (public), </w:t>
+      </w:r>
+      <w:r>
+        <w:rPr>
+          <w:rStyle w:val="HTMLCode"/>
+          <w:rFonts w:eastAsia="Arial"/>
+        </w:rPr>
+        <w:t>/dashboard</w:t>
+      </w:r>
+      <w:r>
+        <w:t xml:space="preserve"> (the post-login home screen), </w:t>
+      </w:r>
+      <w:r>
+        <w:rPr>
+          <w:rStyle w:val="HTMLCode"/>
+          <w:rFonts w:eastAsia="Arial"/>
+        </w:rPr>
+        <w:t>/collections</w:t>
+      </w:r>
+      <w:r>
+        <w:t xml:space="preserve">, and </w:t>
+      </w:r>
+      <w:r>
+        <w:rPr>
+          <w:rStyle w:val="HTMLCode"/>
+          <w:rFonts w:eastAsia="Arial"/>
+        </w:rPr>
+        <w:t>/prompts/{id}</w:t>
+      </w:r>
+      <w:r>
+        <w:t xml:space="preserve"> — all except </w:t>
+      </w:r>
+      <w:r>
+        <w:rPr>
+          <w:rStyle w:val="HTMLCode"/>
+          <w:rFonts w:eastAsia="Arial"/>
+        </w:rPr>
+        <w:t>/login</w:t>
+      </w:r>
+      <w:r>
+        <w:t xml:space="preserve"> protected.Implemented an auth context holding the in-memory token and a guard that redirects to /login when no valid token is present.</w:t>
+      </w:r>
+    </w:p>
+    <w:p>
+      <w:pPr>
+        <w:pStyle w:val="ListParagraph"/>
+        <w:numPr>
+          <w:ilvl w:val="0"/>
+          <w:numId w:val="2"/>
+        </w:numPr>
+        <w:spacing w:after="60"/>
+      </w:pPr>
+      <w:r>
+        <w:t>Built a thin API layer that attaches Authorization: Bearer &lt;token&gt; to every request and, on a 401, clears the token and redirects to /login.</w:t>
+      </w:r>
+    </w:p>
+    <w:p>
+      <w:pPr>
+        <w:pStyle w:val="ListParagraph"/>
+        <w:numPr>
+          <w:ilvl w:val="0"/>
+          <w:numId w:val="2"/>
+        </w:numPr>
+        <w:spacing w:after="60"/>
+      </w:pPr>
+      <w:r>
+        <w:t>Built the Login/Register page wired to /auth/login and /auth/register.</w:t>
+      </w:r>
+    </w:p>
+    <w:p>
+      <w:pPr>
+        <w:pStyle w:val="ListParagraph"/>
+        <w:numPr>
+          <w:ilvl w:val="0"/>
+          <w:numId w:val="2"/>
+        </w:numPr>
+        <w:spacing w:after="60"/>
+      </w:pPr>
+      <w:r>
+        <w:t>Built the Collections sidebar (list + 'New Collection') and the Prompt Editor (title, content, save/delete), including the version-history panel with a restore action.</w:t>
+      </w:r>
+    </w:p>
+    <w:p>
+      <w:pPr>
+        <w:pStyle w:val="ListParagraph"/>
+        <w:numPr>
+          <w:ilvl w:val="0"/>
+          <w:numId w:val="2"/>
+        </w:numPr>
+        <w:spacing w:after="60"/>
+      </w:pPr>
+      <w:r>
+        <w:t>Built the Dashboard page rendering the four aggregate metric cards from GET /dashboard.</w:t>
+      </w:r>
+    </w:p>
+    <w:p>
+      <w:pPr>
+        <w:pStyle w:val="Heading3"/>
+      </w:pPr>
+      <w:r>
+        <w:t>Testing strategy</w:t>
+      </w:r>
+    </w:p>
+    <w:p>
+      <w:pPr>
+        <w:pStyle w:val="ListParagraph"/>
+        <w:numPr>
+          <w:ilvl w:val="0"/>
+          <w:numId w:val="2"/>
+        </w:numPr>
+        <w:spacing w:after="60"/>
+      </w:pPr>
+      <w:r>
+        <w:t>Manual end-to-end verification of each user flow against the running backend: register → login → create collection → create prompt → edit → save version → restore → view dashboard.</w:t>
+      </w:r>
+    </w:p>
+    <w:p>
+      <w:pPr>
+        <w:pStyle w:val="ListParagraph"/>
+        <w:numPr>
+          <w:ilvl w:val="0"/>
+          <w:numId w:val="2"/>
+        </w:numPr>
+        <w:spacing w:after="60"/>
+      </w:pPr>
+      <w:r>
+        <w:t>Verified the 401 handling by letting a request go out without a valid token and confirming the redirect to /login.</w:t>
+      </w:r>
+    </w:p>
+    <w:p>
+      <w:pPr>
+        <w:pStyle w:val="ListParagraph"/>
+        <w:numPr>
+          <w:ilvl w:val="0"/>
+          <w:numId w:val="2"/>
+        </w:numPr>
+        <w:spacing w:after="60"/>
+      </w:pPr>
+      <w:r>
+        <w:t>Confirmed each page renders the data returned by its endpoint and that protected routes are unreachable when logged out.</w:t>
+      </w:r>
+    </w:p>
+    <w:p>
+      <w:pPr>
+        <w:pStyle w:val="ListParagraph"/>
+        <w:numPr>
+          <w:ilvl w:val="0"/>
+          <w:numId w:val="2"/>
+        </w:numPr>
+        <w:spacing w:after="60"/>
+      </w:pPr>
+      <w:r>
+        <w:t>Automated UI testing (e.g. React Testing Library / end-to-end tooling) was intentionally left out of scope for this exam build; validation here is manual.</w:t>
+      </w:r>
+    </w:p>
+    <w:p>
+      <w:pPr>
+        <w:pStyle w:val="Heading3"/>
+      </w:pPr>
+      <w:r>
         <w:t>AI tool choice</w:t>
       </w:r>
     </w:p>
@@ -4291,7 +5112,7 @@
         <w:spacing w:after="120"/>
       </w:pPr>
       <w:r>
-        <w:t>Tool used: Claude Code. The aggregation is small, so the tool's main contribution was suggesting Mono.zip as the idiomatic way to combine the independent queries concurrently rather than awaiting them one after another.</w:t>
+        <w:t>Tool used: Claude Code. Because the backend API was already finished, the frontend work was mostly about wiring pages to known endpoint shapes consistently. Claude Code's whole-project context meant the generated API calls matched the actual request/response formats from the backend modules, and the auth context and route guard stayed consistent across all four pages.</w:t>
       </w:r>
     </w:p>
     <w:p>
@@ -4348,397 +5169,6 @@
                 <w:sz w:val="18"/>
                 <w:szCs w:val="18"/>
               </w:rPr>
-              <w:t>Prompt 1 — concurrent aggregation</w:t>
-            </w:r>
-          </w:p>
-        </w:tc>
-      </w:tr>
-      <w:tr>
-        <w:tc>
-          <w:tcPr>
-            <w:tcW w:w="9360" w:type="dxa"/>
-            <w:tcBorders>
-              <w:top w:val="single" w:sz="1" w:space="0" w:color="CCCCCC"/>
-              <w:left w:val="single" w:sz="1" w:space="0" w:color="CCCCCC"/>
-              <w:bottom w:val="single" w:sz="1" w:space="0" w:color="CCCCCC"/>
-              <w:right w:val="single" w:sz="1" w:space="0" w:color="CCCCCC"/>
-            </w:tcBorders>
-            <w:tcMar>
-              <w:top w:w="80" w:type="dxa"/>
-              <w:left w:w="120" w:type="dxa"/>
-              <w:bottom w:w="80" w:type="dxa"/>
-              <w:right w:w="120" w:type="dxa"/>
-            </w:tcMar>
-          </w:tcPr>
-          <w:p>
-            <w:pPr>
-              <w:spacing w:after="40"/>
-            </w:pPr>
-            <w:r>
-              <w:rPr>
-                <w:rFonts w:ascii="Consolas" w:eastAsia="Consolas" w:hAnsi="Consolas" w:cs="Consolas"/>
-                <w:sz w:val="18"/>
-                <w:szCs w:val="18"/>
-              </w:rPr>
-              <w:t>[Paste your actual prompt here. Example:]</w:t>
-            </w:r>
-          </w:p>
-          <w:p>
-            <w:pPr>
-              <w:spacing w:after="40"/>
-            </w:pPr>
-            <w:r>
-              <w:rPr>
-                <w:rFonts w:ascii="Consolas" w:eastAsia="Consolas" w:hAnsi="Consolas" w:cs="Consolas"/>
-                <w:sz w:val="18"/>
-                <w:szCs w:val="18"/>
-              </w:rPr>
-              <w:t>"Create GET /dashboard returning total collections, prompts, versions and</w:t>
-            </w:r>
-          </w:p>
-          <w:p>
-            <w:pPr>
-              <w:spacing w:after="40"/>
-            </w:pPr>
-            <w:r>
-              <w:rPr>
-                <w:rFonts w:ascii="Consolas" w:eastAsia="Consolas" w:hAnsi="Consolas" w:cs="Consolas"/>
-                <w:sz w:val="18"/>
-                <w:szCs w:val="18"/>
-              </w:rPr>
-              <w:t xml:space="preserve"> the latest prompt for the current user. Run the count queries</w:t>
-            </w:r>
-          </w:p>
-          <w:p>
-            <w:pPr>
-              <w:spacing w:after="40"/>
-            </w:pPr>
-            <w:r>
-              <w:rPr>
-                <w:rFonts w:ascii="Consolas" w:eastAsia="Consolas" w:hAnsi="Consolas" w:cs="Consolas"/>
-                <w:sz w:val="18"/>
-                <w:szCs w:val="18"/>
-              </w:rPr>
-              <w:t xml:space="preserve"> concurrently with Mono.zip and return a single DTO. No SSE."</w:t>
-            </w:r>
-          </w:p>
-        </w:tc>
-      </w:tr>
-    </w:tbl>
-    <w:p>
-      <w:pPr>
-        <w:pStyle w:val="Heading2"/>
-        <w:pageBreakBefore/>
-      </w:pPr>
-      <w:bookmarkStart w:id="9" w:name="_Toc232434966"/>
-      <w:r>
-        <w:lastRenderedPageBreak/>
-        <w:t>Module 6 — Frontend (React + Tailwind)</w:t>
-      </w:r>
-      <w:bookmarkEnd w:id="9"/>
-    </w:p>
-    <w:p>
-      <w:pPr>
-        <w:pStyle w:val="Heading3"/>
-      </w:pPr>
-      <w:r>
-        <w:t>Approach &amp; reasoning</w:t>
-      </w:r>
-    </w:p>
-    <w:p>
-      <w:pPr>
-        <w:spacing w:after="120"/>
-      </w:pPr>
-      <w:r>
-        <w:t>The frontend was built as a separate phase after all five backend modules were complete and tested, so the UI could be developed against a finished, stable API. It is a single-page React application styled with Tailwind, covering four pages: Login, Dashboard, Collections, and the Prompt Editor (which also hosts the version-history panel). The central design decision was how to carry the JWT on the client: I kept the token in memory only (React state/context) rather than persisting it, which keeps the implementation simple and side-steps the security questions around localStorage. The accepted trade-off is that a page refresh or a new tab logs the user out and returns them to the login screen.</w:t>
-      </w:r>
-      <w:r>
-        <w:t xml:space="preserve"> Rather than build a separate public landing page — which would add UI with no backend behind it — the Dashboard doubles as the home screen: after login the user lands directly on their workspace statistics, with the collections sidebar available from every protected page.</w:t>
-      </w:r>
-    </w:p>
-    <w:p>
-      <w:pPr>
-        <w:pStyle w:val="Heading3"/>
-      </w:pPr>
-      <w:r>
-        <w:t>Step-by-step workflow</w:t>
-      </w:r>
-    </w:p>
-    <w:p>
-      <w:pPr>
-        <w:pStyle w:val="ListParagraph"/>
-        <w:numPr>
-          <w:ilvl w:val="0"/>
-          <w:numId w:val="2"/>
-        </w:numPr>
-        <w:spacing w:after="60"/>
-      </w:pPr>
-      <w:r>
-        <w:t xml:space="preserve">Set up the React app with Tailwind and the routes: </w:t>
-      </w:r>
-      <w:r>
-        <w:rPr>
-          <w:rStyle w:val="HTMLCode"/>
-          <w:rFonts w:eastAsia="Arial"/>
-        </w:rPr>
-        <w:t>/</w:t>
-      </w:r>
-      <w:r>
-        <w:t xml:space="preserve"> (redirects to </w:t>
-      </w:r>
-      <w:r>
-        <w:rPr>
-          <w:rStyle w:val="HTMLCode"/>
-          <w:rFonts w:eastAsia="Arial"/>
-        </w:rPr>
-        <w:t>/dashboard</w:t>
-      </w:r>
-      <w:r>
-        <w:t xml:space="preserve"> when authenticated, else </w:t>
-      </w:r>
-      <w:r>
-        <w:rPr>
-          <w:rStyle w:val="HTMLCode"/>
-          <w:rFonts w:eastAsia="Arial"/>
-        </w:rPr>
-        <w:t>/login</w:t>
-      </w:r>
-      <w:r>
-        <w:t xml:space="preserve">), </w:t>
-      </w:r>
-      <w:r>
-        <w:rPr>
-          <w:rStyle w:val="HTMLCode"/>
-          <w:rFonts w:eastAsia="Arial"/>
-        </w:rPr>
-        <w:t>/login</w:t>
-      </w:r>
-      <w:r>
-        <w:t xml:space="preserve"> (public), </w:t>
-      </w:r>
-      <w:r>
-        <w:rPr>
-          <w:rStyle w:val="HTMLCode"/>
-          <w:rFonts w:eastAsia="Arial"/>
-        </w:rPr>
-        <w:t>/dashboard</w:t>
-      </w:r>
-      <w:r>
-        <w:t xml:space="preserve"> (the post-login home screen), </w:t>
-      </w:r>
-      <w:r>
-        <w:rPr>
-          <w:rStyle w:val="HTMLCode"/>
-          <w:rFonts w:eastAsia="Arial"/>
-        </w:rPr>
-        <w:t>/collections</w:t>
-      </w:r>
-      <w:r>
-        <w:t xml:space="preserve">, and </w:t>
-      </w:r>
-      <w:r>
-        <w:rPr>
-          <w:rStyle w:val="HTMLCode"/>
-          <w:rFonts w:eastAsia="Arial"/>
-        </w:rPr>
-        <w:t>/prompts/{id}</w:t>
-      </w:r>
-      <w:r>
-        <w:t xml:space="preserve"> — all except </w:t>
-      </w:r>
-      <w:r>
-        <w:rPr>
-          <w:rStyle w:val="HTMLCode"/>
-          <w:rFonts w:eastAsia="Arial"/>
-        </w:rPr>
-        <w:t>/login</w:t>
-      </w:r>
-      <w:r>
-        <w:t xml:space="preserve"> protected.Implemented an auth context holding the in-memory token and a guard that redirects to /login when no valid token is present.</w:t>
-      </w:r>
-    </w:p>
-    <w:p>
-      <w:pPr>
-        <w:pStyle w:val="ListParagraph"/>
-        <w:numPr>
-          <w:ilvl w:val="0"/>
-          <w:numId w:val="2"/>
-        </w:numPr>
-        <w:spacing w:after="60"/>
-      </w:pPr>
-      <w:r>
-        <w:t>Built a thin API layer that attaches Authorization: Bearer &lt;token&gt; to every request and, on a 401, clears the token and redirects to /login.</w:t>
-      </w:r>
-    </w:p>
-    <w:p>
-      <w:pPr>
-        <w:pStyle w:val="ListParagraph"/>
-        <w:numPr>
-          <w:ilvl w:val="0"/>
-          <w:numId w:val="2"/>
-        </w:numPr>
-        <w:spacing w:after="60"/>
-      </w:pPr>
-      <w:r>
-        <w:t>Built the Login/Register page wired to /auth/login and /auth/register.</w:t>
-      </w:r>
-    </w:p>
-    <w:p>
-      <w:pPr>
-        <w:pStyle w:val="ListParagraph"/>
-        <w:numPr>
-          <w:ilvl w:val="0"/>
-          <w:numId w:val="2"/>
-        </w:numPr>
-        <w:spacing w:after="60"/>
-      </w:pPr>
-      <w:r>
-        <w:t>Built the Collections sidebar (list + 'New Collection') and the Prompt Editor (title, content, save/delete), including the version-history panel with a restore action.</w:t>
-      </w:r>
-    </w:p>
-    <w:p>
-      <w:pPr>
-        <w:pStyle w:val="ListParagraph"/>
-        <w:numPr>
-          <w:ilvl w:val="0"/>
-          <w:numId w:val="2"/>
-        </w:numPr>
-        <w:spacing w:after="60"/>
-      </w:pPr>
-      <w:r>
-        <w:t>Built the Dashboard page rendering the four aggregate metric cards from GET /dashboard.</w:t>
-      </w:r>
-    </w:p>
-    <w:p>
-      <w:pPr>
-        <w:pStyle w:val="Heading3"/>
-      </w:pPr>
-      <w:r>
-        <w:t>Testing strategy</w:t>
-      </w:r>
-    </w:p>
-    <w:p>
-      <w:pPr>
-        <w:pStyle w:val="ListParagraph"/>
-        <w:numPr>
-          <w:ilvl w:val="0"/>
-          <w:numId w:val="2"/>
-        </w:numPr>
-        <w:spacing w:after="60"/>
-      </w:pPr>
-      <w:r>
-        <w:t>Manual end-to-end verification of each user flow against the running backend: register → login → create collection → create prompt → edit → save version → restore → view dashboard.</w:t>
-      </w:r>
-    </w:p>
-    <w:p>
-      <w:pPr>
-        <w:pStyle w:val="ListParagraph"/>
-        <w:numPr>
-          <w:ilvl w:val="0"/>
-          <w:numId w:val="2"/>
-        </w:numPr>
-        <w:spacing w:after="60"/>
-      </w:pPr>
-      <w:r>
-        <w:t>Verified the 401 handling by letting a request go out without a valid token and confirming the redirect to /login.</w:t>
-      </w:r>
-    </w:p>
-    <w:p>
-      <w:pPr>
-        <w:pStyle w:val="ListParagraph"/>
-        <w:numPr>
-          <w:ilvl w:val="0"/>
-          <w:numId w:val="2"/>
-        </w:numPr>
-        <w:spacing w:after="60"/>
-      </w:pPr>
-      <w:r>
-        <w:t>Confirmed each page renders the data returned by its endpoint and that protected routes are unreachable when logged out.</w:t>
-      </w:r>
-    </w:p>
-    <w:p>
-      <w:pPr>
-        <w:pStyle w:val="ListParagraph"/>
-        <w:numPr>
-          <w:ilvl w:val="0"/>
-          <w:numId w:val="2"/>
-        </w:numPr>
-        <w:spacing w:after="60"/>
-      </w:pPr>
-      <w:r>
-        <w:t>Automated UI testing (e.g. React Testing Library / end-to-end tooling) was intentionally left out of scope for this exam build; validation here is manual.</w:t>
-      </w:r>
-    </w:p>
-    <w:p>
-      <w:pPr>
-        <w:pStyle w:val="Heading3"/>
-      </w:pPr>
-      <w:r>
-        <w:t>AI tool choice</w:t>
-      </w:r>
-    </w:p>
-    <w:p>
-      <w:pPr>
-        <w:spacing w:after="120"/>
-      </w:pPr>
-      <w:r>
-        <w:t>Tool used: Claude Code. Because the backend API was already finished, the frontend work was mostly about wiring pages to known endpoint shapes consistently. Claude Code's whole-project context meant the generated API calls matched the actual request/response formats from the backend modules, and the auth context and route guard stayed consistent across all four pages.</w:t>
-      </w:r>
-    </w:p>
-    <w:p>
-      <w:pPr>
-        <w:pStyle w:val="Heading3"/>
-      </w:pPr>
-      <w:r>
-        <w:t>Key prompts / interactions</w:t>
-      </w:r>
-    </w:p>
-    <w:tbl>
-      <w:tblPr>
-        <w:tblW w:w="9360" w:type="dxa"/>
-        <w:tblBorders>
-          <w:top w:val="single" w:sz="4" w:space="0" w:color="auto"/>
-          <w:left w:val="single" w:sz="4" w:space="0" w:color="auto"/>
-          <w:bottom w:val="single" w:sz="4" w:space="0" w:color="auto"/>
-          <w:right w:val="single" w:sz="4" w:space="0" w:color="auto"/>
-          <w:insideH w:val="single" w:sz="4" w:space="0" w:color="auto"/>
-          <w:insideV w:val="single" w:sz="4" w:space="0" w:color="auto"/>
-        </w:tblBorders>
-        <w:tblCellMar>
-          <w:left w:w="10" w:type="dxa"/>
-          <w:right w:w="10" w:type="dxa"/>
-        </w:tblCellMar>
-        <w:tblLook w:val="04A0" w:firstRow="1" w:lastRow="0" w:firstColumn="1" w:lastColumn="0" w:noHBand="0" w:noVBand="1"/>
-      </w:tblPr>
-      <w:tblGrid>
-        <w:gridCol w:w="9360"/>
-      </w:tblGrid>
-      <w:tr>
-        <w:tc>
-          <w:tcPr>
-            <w:tcW w:w="9360" w:type="dxa"/>
-            <w:tcBorders>
-              <w:top w:val="single" w:sz="1" w:space="0" w:color="CCCCCC"/>
-              <w:left w:val="single" w:sz="1" w:space="0" w:color="CCCCCC"/>
-              <w:bottom w:val="single" w:sz="1" w:space="0" w:color="CCCCCC"/>
-              <w:right w:val="single" w:sz="1" w:space="0" w:color="CCCCCC"/>
-            </w:tcBorders>
-            <w:shd w:val="clear" w:color="auto" w:fill="D7E0F2"/>
-            <w:tcMar>
-              <w:top w:w="80" w:type="dxa"/>
-              <w:left w:w="120" w:type="dxa"/>
-              <w:bottom w:w="80" w:type="dxa"/>
-              <w:right w:w="120" w:type="dxa"/>
-            </w:tcMar>
-          </w:tcPr>
-          <w:p>
-            <w:r>
-              <w:rPr>
-                <w:b/>
-                <w:bCs/>
-                <w:sz w:val="18"/>
-                <w:szCs w:val="18"/>
-              </w:rPr>
               <w:t>Prompt 1 — auth context and route guard</w:t>
             </w:r>
           </w:p>
@@ -5407,6 +5837,62 @@
     <w:p>
       <w:pPr>
         <w:spacing w:after="120"/>
+        <w:rPr>
+          <w:lang w:val="en-US"/>
+        </w:rPr>
+      </w:pPr>
+    </w:p>
+    <w:p>
+      <w:pPr>
+        <w:spacing w:after="120"/>
+        <w:rPr>
+          <w:lang w:val="en-US"/>
+        </w:rPr>
+      </w:pPr>
+      <w:r>
+        <w:rPr>
+          <w:lang w:val="en-US"/>
+        </w:rPr>
+        <w:drawing>
+          <wp:inline distT="0" distB="0" distL="0" distR="0" wp14:anchorId="3AB21DAA" wp14:editId="59C6BF0D">
+            <wp:extent cx="5943600" cy="2458064"/>
+            <wp:effectExtent l="0" t="0" r="0" b="6350"/>
+            <wp:docPr id="976994002" name="Picture 1"/>
+            <wp:cNvGraphicFramePr>
+              <a:graphicFrameLocks xmlns:a="http://schemas.openxmlformats.org/drawingml/2006/main" noChangeAspect="1"/>
+            </wp:cNvGraphicFramePr>
+            <a:graphic xmlns:a="http://schemas.openxmlformats.org/drawingml/2006/main">
+              <a:graphicData uri="http://schemas.openxmlformats.org/drawingml/2006/picture">
+                <pic:pic xmlns:pic="http://schemas.openxmlformats.org/drawingml/2006/picture">
+                  <pic:nvPicPr>
+                    <pic:cNvPr id="976994002" name=""/>
+                    <pic:cNvPicPr/>
+                  </pic:nvPicPr>
+                  <pic:blipFill>
+                    <a:blip r:embed="rId13"/>
+                    <a:stretch>
+                      <a:fillRect/>
+                    </a:stretch>
+                  </pic:blipFill>
+                  <pic:spPr>
+                    <a:xfrm>
+                      <a:off x="0" y="0"/>
+                      <a:ext cx="5947687" cy="2459754"/>
+                    </a:xfrm>
+                    <a:prstGeom prst="rect">
+                      <a:avLst/>
+                    </a:prstGeom>
+                  </pic:spPr>
+                </pic:pic>
+              </a:graphicData>
+            </a:graphic>
+          </wp:inline>
+        </w:drawing>
+      </w:r>
+    </w:p>
+    <w:p>
+      <w:pPr>
+        <w:spacing w:after="120"/>
       </w:pPr>
       <w:r>
         <w:rPr>
@@ -5525,6 +6011,7 @@
           <w:iCs/>
           <w:color w:val="999999"/>
         </w:rPr>
+        <w:lastRenderedPageBreak/>
         <w:t>[ Paste screenshot here ]</w:t>
       </w:r>
     </w:p>
@@ -5756,7 +6243,7 @@
       </w:r>
     </w:p>
     <w:sectPr>
-      <w:footerReference w:type="default" r:id="rId13"/>
+      <w:footerReference w:type="default" r:id="rId14"/>
       <w:pgSz w:w="12240" w:h="15840"/>
       <w:pgMar w:top="1440" w:right="1440" w:bottom="1440" w:left="1440" w:header="708" w:footer="708" w:gutter="0"/>
       <w:cols w:space="720"/>

</xml_diff>